<commit_message>
Updated Project File to 1.1
</commit_message>
<xml_diff>
--- a/Nammathao_CIS4374_Project.docx
+++ b/Nammathao_CIS4374_Project.docx
@@ -6338,6 +6338,27 @@
         </w:rPr>
         <w:t xml:space="preserve"> for review</w:t>
       </w:r>
+    </w:p>
+    <w:p>
+      <w:pPr>
+        <w:rPr>
+          <w:rFonts w:ascii="Times New Roman" w:hAnsi="Times New Roman" w:cs="Times New Roman"/>
+        </w:rPr>
+      </w:pPr>
+      <w:r>
+        <w:rPr>
+          <w:rFonts w:ascii="Times New Roman" w:hAnsi="Times New Roman" w:cs="Times New Roman"/>
+        </w:rPr>
+        <w:br w:type="page"/>
+      </w:r>
+    </w:p>
+    <w:p>
+      <w:pPr>
+        <w:spacing w:line="240" w:lineRule="auto"/>
+        <w:rPr>
+          <w:rFonts w:ascii="Times New Roman" w:hAnsi="Times New Roman" w:cs="Times New Roman"/>
+        </w:rPr>
+      </w:pPr>
     </w:p>
     <w:sectPr>
       <w:footerReference w:type="default" r:id="rId7"/>

</xml_diff>

<commit_message>
Change version to 1.1
</commit_message>
<xml_diff>
--- a/Nammathao_CIS4374_Project.docx
+++ b/Nammathao_CIS4374_Project.docx
@@ -6357,11 +6357,373 @@
         <w:spacing w:line="240" w:lineRule="auto"/>
         <w:rPr>
           <w:rFonts w:ascii="Times New Roman" w:hAnsi="Times New Roman" w:cs="Times New Roman"/>
-        </w:rPr>
-      </w:pPr>
+          <w:b/>
+          <w:bCs/>
+          <w:sz w:val="32"/>
+          <w:szCs w:val="32"/>
+        </w:rPr>
+      </w:pPr>
+      <w:r>
+        <w:rPr>
+          <w:rFonts w:ascii="Times New Roman" w:hAnsi="Times New Roman" w:cs="Times New Roman"/>
+          <w:b/>
+          <w:bCs/>
+          <w:sz w:val="32"/>
+          <w:szCs w:val="32"/>
+        </w:rPr>
+        <w:lastRenderedPageBreak/>
+        <w:t>6.Work Breakdown Structure</w:t>
+      </w:r>
+    </w:p>
+    <w:p>
+      <w:pPr>
+        <w:spacing w:line="240" w:lineRule="auto"/>
+        <w:jc w:val="center"/>
+        <w:rPr>
+          <w:rFonts w:ascii="Times New Roman" w:hAnsi="Times New Roman" w:cs="Times New Roman"/>
+        </w:rPr>
+      </w:pPr>
+      <w:r>
+        <w:rPr>
+          <w:rFonts w:ascii="Times New Roman" w:hAnsi="Times New Roman" w:cs="Times New Roman"/>
+          <w:noProof/>
+        </w:rPr>
+        <w:drawing>
+          <wp:inline distT="0" distB="0" distL="0" distR="0" wp14:anchorId="0CAEC915" wp14:editId="5C3519FB">
+            <wp:extent cx="4373880" cy="7625167"/>
+            <wp:effectExtent l="0" t="0" r="7620" b="0"/>
+            <wp:docPr id="1549901487" name="Picture 1"/>
+            <wp:cNvGraphicFramePr>
+              <a:graphicFrameLocks xmlns:a="http://schemas.openxmlformats.org/drawingml/2006/main" noChangeAspect="1"/>
+            </wp:cNvGraphicFramePr>
+            <a:graphic xmlns:a="http://schemas.openxmlformats.org/drawingml/2006/main">
+              <a:graphicData uri="http://schemas.openxmlformats.org/drawingml/2006/picture">
+                <pic:pic xmlns:pic="http://schemas.openxmlformats.org/drawingml/2006/picture">
+                  <pic:nvPicPr>
+                    <pic:cNvPr id="0" name="Picture 1"/>
+                    <pic:cNvPicPr>
+                      <a:picLocks noChangeAspect="1" noChangeArrowheads="1"/>
+                    </pic:cNvPicPr>
+                  </pic:nvPicPr>
+                  <pic:blipFill>
+                    <a:blip r:embed="rId7">
+                      <a:extLst>
+                        <a:ext uri="{28A0092B-C50C-407E-A947-70E740481C1C}">
+                          <a14:useLocalDpi xmlns:a14="http://schemas.microsoft.com/office/drawing/2010/main" val="0"/>
+                        </a:ext>
+                      </a:extLst>
+                    </a:blip>
+                    <a:srcRect/>
+                    <a:stretch>
+                      <a:fillRect/>
+                    </a:stretch>
+                  </pic:blipFill>
+                  <pic:spPr bwMode="auto">
+                    <a:xfrm>
+                      <a:off x="0" y="0"/>
+                      <a:ext cx="4378666" cy="7633510"/>
+                    </a:xfrm>
+                    <a:prstGeom prst="rect">
+                      <a:avLst/>
+                    </a:prstGeom>
+                    <a:noFill/>
+                    <a:ln>
+                      <a:noFill/>
+                    </a:ln>
+                  </pic:spPr>
+                </pic:pic>
+              </a:graphicData>
+            </a:graphic>
+          </wp:inline>
+        </w:drawing>
+      </w:r>
+    </w:p>
+    <w:p>
+      <w:pPr>
+        <w:jc w:val="center"/>
+        <w:rPr>
+          <w:rFonts w:ascii="Times New Roman" w:hAnsi="Times New Roman" w:cs="Times New Roman"/>
+        </w:rPr>
+      </w:pPr>
+      <w:r>
+        <w:rPr>
+          <w:rFonts w:ascii="Times New Roman" w:hAnsi="Times New Roman" w:cs="Times New Roman"/>
+          <w:noProof/>
+        </w:rPr>
+        <w:lastRenderedPageBreak/>
+        <w:drawing>
+          <wp:inline distT="0" distB="0" distL="0" distR="0" wp14:anchorId="54635F6E" wp14:editId="45786286">
+            <wp:extent cx="4705512" cy="7703820"/>
+            <wp:effectExtent l="0" t="0" r="0" b="0"/>
+            <wp:docPr id="1790439294" name="Picture 2"/>
+            <wp:cNvGraphicFramePr>
+              <a:graphicFrameLocks xmlns:a="http://schemas.openxmlformats.org/drawingml/2006/main" noChangeAspect="1"/>
+            </wp:cNvGraphicFramePr>
+            <a:graphic xmlns:a="http://schemas.openxmlformats.org/drawingml/2006/main">
+              <a:graphicData uri="http://schemas.openxmlformats.org/drawingml/2006/picture">
+                <pic:pic xmlns:pic="http://schemas.openxmlformats.org/drawingml/2006/picture">
+                  <pic:nvPicPr>
+                    <pic:cNvPr id="0" name="Picture 2"/>
+                    <pic:cNvPicPr>
+                      <a:picLocks noChangeAspect="1" noChangeArrowheads="1"/>
+                    </pic:cNvPicPr>
+                  </pic:nvPicPr>
+                  <pic:blipFill>
+                    <a:blip r:embed="rId8">
+                      <a:extLst>
+                        <a:ext uri="{28A0092B-C50C-407E-A947-70E740481C1C}">
+                          <a14:useLocalDpi xmlns:a14="http://schemas.microsoft.com/office/drawing/2010/main" val="0"/>
+                        </a:ext>
+                      </a:extLst>
+                    </a:blip>
+                    <a:srcRect/>
+                    <a:stretch>
+                      <a:fillRect/>
+                    </a:stretch>
+                  </pic:blipFill>
+                  <pic:spPr bwMode="auto">
+                    <a:xfrm>
+                      <a:off x="0" y="0"/>
+                      <a:ext cx="4713119" cy="7716275"/>
+                    </a:xfrm>
+                    <a:prstGeom prst="rect">
+                      <a:avLst/>
+                    </a:prstGeom>
+                    <a:noFill/>
+                    <a:ln>
+                      <a:noFill/>
+                    </a:ln>
+                  </pic:spPr>
+                </pic:pic>
+              </a:graphicData>
+            </a:graphic>
+          </wp:inline>
+        </w:drawing>
+      </w:r>
+    </w:p>
+    <w:p>
+      <w:pPr>
+        <w:jc w:val="center"/>
+        <w:rPr>
+          <w:rFonts w:ascii="Times New Roman" w:hAnsi="Times New Roman" w:cs="Times New Roman"/>
+        </w:rPr>
+      </w:pPr>
+      <w:r>
+        <w:rPr>
+          <w:rFonts w:ascii="Times New Roman" w:hAnsi="Times New Roman" w:cs="Times New Roman"/>
+          <w:noProof/>
+        </w:rPr>
+        <w:lastRenderedPageBreak/>
+        <w:drawing>
+          <wp:inline distT="0" distB="0" distL="0" distR="0" wp14:anchorId="72F46077" wp14:editId="4A9B5E04">
+            <wp:extent cx="4724400" cy="8090410"/>
+            <wp:effectExtent l="0" t="0" r="0" b="6350"/>
+            <wp:docPr id="422584103" name="Picture 3"/>
+            <wp:cNvGraphicFramePr>
+              <a:graphicFrameLocks xmlns:a="http://schemas.openxmlformats.org/drawingml/2006/main" noChangeAspect="1"/>
+            </wp:cNvGraphicFramePr>
+            <a:graphic xmlns:a="http://schemas.openxmlformats.org/drawingml/2006/main">
+              <a:graphicData uri="http://schemas.openxmlformats.org/drawingml/2006/picture">
+                <pic:pic xmlns:pic="http://schemas.openxmlformats.org/drawingml/2006/picture">
+                  <pic:nvPicPr>
+                    <pic:cNvPr id="0" name="Picture 3"/>
+                    <pic:cNvPicPr>
+                      <a:picLocks noChangeAspect="1" noChangeArrowheads="1"/>
+                    </pic:cNvPicPr>
+                  </pic:nvPicPr>
+                  <pic:blipFill>
+                    <a:blip r:embed="rId9">
+                      <a:extLst>
+                        <a:ext uri="{28A0092B-C50C-407E-A947-70E740481C1C}">
+                          <a14:useLocalDpi xmlns:a14="http://schemas.microsoft.com/office/drawing/2010/main" val="0"/>
+                        </a:ext>
+                      </a:extLst>
+                    </a:blip>
+                    <a:srcRect/>
+                    <a:stretch>
+                      <a:fillRect/>
+                    </a:stretch>
+                  </pic:blipFill>
+                  <pic:spPr bwMode="auto">
+                    <a:xfrm>
+                      <a:off x="0" y="0"/>
+                      <a:ext cx="4732791" cy="8104780"/>
+                    </a:xfrm>
+                    <a:prstGeom prst="rect">
+                      <a:avLst/>
+                    </a:prstGeom>
+                    <a:noFill/>
+                    <a:ln>
+                      <a:noFill/>
+                    </a:ln>
+                  </pic:spPr>
+                </pic:pic>
+              </a:graphicData>
+            </a:graphic>
+          </wp:inline>
+        </w:drawing>
+      </w:r>
+    </w:p>
+    <w:p>
+      <w:pPr>
+        <w:jc w:val="center"/>
+        <w:rPr>
+          <w:rFonts w:ascii="Times New Roman" w:hAnsi="Times New Roman" w:cs="Times New Roman"/>
+        </w:rPr>
+      </w:pPr>
+      <w:r>
+        <w:rPr>
+          <w:rFonts w:ascii="Times New Roman" w:hAnsi="Times New Roman" w:cs="Times New Roman"/>
+          <w:noProof/>
+        </w:rPr>
+        <w:lastRenderedPageBreak/>
+        <w:drawing>
+          <wp:inline distT="0" distB="0" distL="0" distR="0" wp14:anchorId="0D821C52" wp14:editId="06C6E210">
+            <wp:extent cx="4986020" cy="8229600"/>
+            <wp:effectExtent l="0" t="0" r="5080" b="0"/>
+            <wp:docPr id="1853352563" name="Picture 4"/>
+            <wp:cNvGraphicFramePr>
+              <a:graphicFrameLocks xmlns:a="http://schemas.openxmlformats.org/drawingml/2006/main" noChangeAspect="1"/>
+            </wp:cNvGraphicFramePr>
+            <a:graphic xmlns:a="http://schemas.openxmlformats.org/drawingml/2006/main">
+              <a:graphicData uri="http://schemas.openxmlformats.org/drawingml/2006/picture">
+                <pic:pic xmlns:pic="http://schemas.openxmlformats.org/drawingml/2006/picture">
+                  <pic:nvPicPr>
+                    <pic:cNvPr id="0" name="Picture 4"/>
+                    <pic:cNvPicPr>
+                      <a:picLocks noChangeAspect="1" noChangeArrowheads="1"/>
+                    </pic:cNvPicPr>
+                  </pic:nvPicPr>
+                  <pic:blipFill>
+                    <a:blip r:embed="rId10">
+                      <a:extLst>
+                        <a:ext uri="{28A0092B-C50C-407E-A947-70E740481C1C}">
+                          <a14:useLocalDpi xmlns:a14="http://schemas.microsoft.com/office/drawing/2010/main" val="0"/>
+                        </a:ext>
+                      </a:extLst>
+                    </a:blip>
+                    <a:srcRect/>
+                    <a:stretch>
+                      <a:fillRect/>
+                    </a:stretch>
+                  </pic:blipFill>
+                  <pic:spPr bwMode="auto">
+                    <a:xfrm>
+                      <a:off x="0" y="0"/>
+                      <a:ext cx="4986020" cy="8229600"/>
+                    </a:xfrm>
+                    <a:prstGeom prst="rect">
+                      <a:avLst/>
+                    </a:prstGeom>
+                    <a:noFill/>
+                    <a:ln>
+                      <a:noFill/>
+                    </a:ln>
+                  </pic:spPr>
+                </pic:pic>
+              </a:graphicData>
+            </a:graphic>
+          </wp:inline>
+        </w:drawing>
+      </w:r>
+    </w:p>
+    <w:p>
+      <w:pPr>
+        <w:rPr>
+          <w:rFonts w:ascii="Times New Roman" w:hAnsi="Times New Roman" w:cs="Times New Roman"/>
+          <w:b/>
+          <w:bCs/>
+          <w:sz w:val="32"/>
+          <w:szCs w:val="32"/>
+        </w:rPr>
+      </w:pPr>
+      <w:r>
+        <w:rPr>
+          <w:rFonts w:ascii="Times New Roman" w:hAnsi="Times New Roman" w:cs="Times New Roman"/>
+          <w:b/>
+          <w:bCs/>
+          <w:sz w:val="32"/>
+          <w:szCs w:val="32"/>
+        </w:rPr>
+        <w:lastRenderedPageBreak/>
+        <w:t>7.</w:t>
+      </w:r>
+      <w:r>
+        <w:rPr>
+          <w:rFonts w:ascii="Times New Roman" w:hAnsi="Times New Roman" w:cs="Times New Roman"/>
+          <w:b/>
+          <w:bCs/>
+          <w:sz w:val="32"/>
+          <w:szCs w:val="32"/>
+        </w:rPr>
+        <w:t>Gantt Chart</w:t>
+      </w:r>
+    </w:p>
+    <w:p>
+      <w:pPr>
+        <w:spacing w:line="240" w:lineRule="auto"/>
+        <w:jc w:val="center"/>
+        <w:rPr>
+          <w:rFonts w:ascii="Times New Roman" w:hAnsi="Times New Roman" w:cs="Times New Roman"/>
+        </w:rPr>
+      </w:pPr>
+      <w:r>
+        <w:rPr>
+          <w:rFonts w:ascii="Times New Roman" w:hAnsi="Times New Roman" w:cs="Times New Roman"/>
+          <w:noProof/>
+        </w:rPr>
+        <w:drawing>
+          <wp:inline distT="0" distB="0" distL="0" distR="0" wp14:anchorId="080E3BED" wp14:editId="534A7097">
+            <wp:extent cx="5943600" cy="6968490"/>
+            <wp:effectExtent l="0" t="0" r="0" b="3810"/>
+            <wp:docPr id="630756616" name="Picture 6"/>
+            <wp:cNvGraphicFramePr>
+              <a:graphicFrameLocks xmlns:a="http://schemas.openxmlformats.org/drawingml/2006/main" noChangeAspect="1"/>
+            </wp:cNvGraphicFramePr>
+            <a:graphic xmlns:a="http://schemas.openxmlformats.org/drawingml/2006/main">
+              <a:graphicData uri="http://schemas.openxmlformats.org/drawingml/2006/picture">
+                <pic:pic xmlns:pic="http://schemas.openxmlformats.org/drawingml/2006/picture">
+                  <pic:nvPicPr>
+                    <pic:cNvPr id="0" name="Picture 6"/>
+                    <pic:cNvPicPr>
+                      <a:picLocks noChangeAspect="1" noChangeArrowheads="1"/>
+                    </pic:cNvPicPr>
+                  </pic:nvPicPr>
+                  <pic:blipFill>
+                    <a:blip r:embed="rId11">
+                      <a:extLst>
+                        <a:ext uri="{28A0092B-C50C-407E-A947-70E740481C1C}">
+                          <a14:useLocalDpi xmlns:a14="http://schemas.microsoft.com/office/drawing/2010/main" val="0"/>
+                        </a:ext>
+                      </a:extLst>
+                    </a:blip>
+                    <a:srcRect/>
+                    <a:stretch>
+                      <a:fillRect/>
+                    </a:stretch>
+                  </pic:blipFill>
+                  <pic:spPr bwMode="auto">
+                    <a:xfrm>
+                      <a:off x="0" y="0"/>
+                      <a:ext cx="5943600" cy="6968490"/>
+                    </a:xfrm>
+                    <a:prstGeom prst="rect">
+                      <a:avLst/>
+                    </a:prstGeom>
+                    <a:noFill/>
+                    <a:ln>
+                      <a:noFill/>
+                    </a:ln>
+                  </pic:spPr>
+                </pic:pic>
+              </a:graphicData>
+            </a:graphic>
+          </wp:inline>
+        </w:drawing>
+      </w:r>
     </w:p>
     <w:sectPr>
-      <w:footerReference w:type="default" r:id="rId7"/>
+      <w:footerReference w:type="default" r:id="rId12"/>
       <w:pgSz w:w="12240" w:h="15840"/>
       <w:pgMar w:top="1440" w:right="1440" w:bottom="1440" w:left="1440" w:header="720" w:footer="720" w:gutter="0"/>
       <w:cols w:space="720"/>

</xml_diff>

<commit_message>
Updated to version 1.1
</commit_message>
<xml_diff>
--- a/Nammathao_CIS4374_Project.docx
+++ b/Nammathao_CIS4374_Project.docx
@@ -940,11 +940,19 @@
         </w:rPr>
         <w:t xml:space="preserve">is used in comparison to </w:t>
       </w:r>
-      <w:r>
-        <w:rPr>
-          <w:rFonts w:ascii="Times New Roman" w:hAnsi="Times New Roman" w:cs="Times New Roman"/>
-        </w:rPr>
-        <w:t>using the city to find parking</w:t>
+      <w:proofErr w:type="gramStart"/>
+      <w:r>
+        <w:rPr>
+          <w:rFonts w:ascii="Times New Roman" w:hAnsi="Times New Roman" w:cs="Times New Roman"/>
+        </w:rPr>
+        <w:t>using</w:t>
+      </w:r>
+      <w:proofErr w:type="gramEnd"/>
+      <w:r>
+        <w:rPr>
+          <w:rFonts w:ascii="Times New Roman" w:hAnsi="Times New Roman" w:cs="Times New Roman"/>
+        </w:rPr>
+        <w:t xml:space="preserve"> the city to find parking</w:t>
       </w:r>
     </w:p>
     <w:p>
@@ -1269,7 +1277,13 @@
         <w:rPr>
           <w:rFonts w:ascii="Times New Roman" w:hAnsi="Times New Roman" w:cs="Times New Roman"/>
         </w:rPr>
-        <w:t>Version: 1.0</w:t>
+        <w:t>Version: 1.</w:t>
+      </w:r>
+      <w:r>
+        <w:rPr>
+          <w:rFonts w:ascii="Times New Roman" w:hAnsi="Times New Roman" w:cs="Times New Roman"/>
+        </w:rPr>
+        <w:t>1</w:t>
       </w:r>
     </w:p>
     <w:p>
@@ -1290,7 +1304,19 @@
         <w:rPr>
           <w:rFonts w:ascii="Times New Roman" w:hAnsi="Times New Roman" w:cs="Times New Roman"/>
         </w:rPr>
-        <w:t>09.10.2026</w:t>
+        <w:t>09.1</w:t>
+      </w:r>
+      <w:r>
+        <w:rPr>
+          <w:rFonts w:ascii="Times New Roman" w:hAnsi="Times New Roman" w:cs="Times New Roman"/>
+        </w:rPr>
+        <w:t>7</w:t>
+      </w:r>
+      <w:r>
+        <w:rPr>
+          <w:rFonts w:ascii="Times New Roman" w:hAnsi="Times New Roman" w:cs="Times New Roman"/>
+        </w:rPr>
+        <w:t>.2026</w:t>
       </w:r>
     </w:p>
     <w:p>
@@ -3726,24 +3752,42 @@
         </w:rPr>
         <w:t xml:space="preserve">Website generates </w:t>
       </w:r>
+      <w:proofErr w:type="gramStart"/>
       <w:r>
         <w:rPr>
           <w:rFonts w:ascii="Times New Roman" w:hAnsi="Times New Roman" w:cs="Times New Roman"/>
         </w:rPr>
         <w:t>report</w:t>
       </w:r>
+      <w:proofErr w:type="gramEnd"/>
       <w:r>
         <w:rPr>
           <w:rFonts w:ascii="Times New Roman" w:hAnsi="Times New Roman" w:cs="Times New Roman"/>
         </w:rPr>
         <w:t xml:space="preserve"> and </w:t>
       </w:r>
-      <w:r>
-        <w:rPr>
-          <w:rFonts w:ascii="Times New Roman" w:hAnsi="Times New Roman" w:cs="Times New Roman"/>
-        </w:rPr>
-        <w:t>report is sent to user email</w:t>
-      </w:r>
+      <w:proofErr w:type="gramStart"/>
+      <w:r>
+        <w:rPr>
+          <w:rFonts w:ascii="Times New Roman" w:hAnsi="Times New Roman" w:cs="Times New Roman"/>
+        </w:rPr>
+        <w:t>report is</w:t>
+      </w:r>
+      <w:proofErr w:type="gramEnd"/>
+      <w:r>
+        <w:rPr>
+          <w:rFonts w:ascii="Times New Roman" w:hAnsi="Times New Roman" w:cs="Times New Roman"/>
+        </w:rPr>
+        <w:t xml:space="preserve"> sent to user </w:t>
+      </w:r>
+      <w:proofErr w:type="gramStart"/>
+      <w:r>
+        <w:rPr>
+          <w:rFonts w:ascii="Times New Roman" w:hAnsi="Times New Roman" w:cs="Times New Roman"/>
+        </w:rPr>
+        <w:t>email</w:t>
+      </w:r>
+      <w:proofErr w:type="gramEnd"/>
     </w:p>
     <w:p>
       <w:pPr>
@@ -3910,7 +3954,21 @@
         <w:rPr>
           <w:rFonts w:ascii="Times New Roman" w:hAnsi="Times New Roman" w:cs="Times New Roman"/>
         </w:rPr>
-        <w:t>is provided in the confirmation screen and also sent with the email</w:t>
+        <w:t xml:space="preserve">is provided in the confirmation screen </w:t>
+      </w:r>
+      <w:proofErr w:type="gramStart"/>
+      <w:r>
+        <w:rPr>
+          <w:rFonts w:ascii="Times New Roman" w:hAnsi="Times New Roman" w:cs="Times New Roman"/>
+        </w:rPr>
+        <w:t>and also</w:t>
+      </w:r>
+      <w:proofErr w:type="gramEnd"/>
+      <w:r>
+        <w:rPr>
+          <w:rFonts w:ascii="Times New Roman" w:hAnsi="Times New Roman" w:cs="Times New Roman"/>
+        </w:rPr>
+        <w:t xml:space="preserve"> sent with the email</w:t>
       </w:r>
       <w:r>
         <w:rPr>
@@ -4912,7 +4970,21 @@
         <w:rPr>
           <w:rFonts w:ascii="Times New Roman" w:hAnsi="Times New Roman" w:cs="Times New Roman"/>
         </w:rPr>
-        <w:t>Extends a Parking Reservation by a Selected Amount Verified by the Parking Garage</w:t>
+        <w:t xml:space="preserve">Extends a Parking Reservation </w:t>
+      </w:r>
+      <w:proofErr w:type="gramStart"/>
+      <w:r>
+        <w:rPr>
+          <w:rFonts w:ascii="Times New Roman" w:hAnsi="Times New Roman" w:cs="Times New Roman"/>
+        </w:rPr>
+        <w:t>by</w:t>
+      </w:r>
+      <w:proofErr w:type="gramEnd"/>
+      <w:r>
+        <w:rPr>
+          <w:rFonts w:ascii="Times New Roman" w:hAnsi="Times New Roman" w:cs="Times New Roman"/>
+        </w:rPr>
+        <w:t xml:space="preserve"> a Selected Amount Verified by the Parking Garage</w:t>
       </w:r>
     </w:p>
     <w:p>
@@ -5108,11 +5180,19 @@
         </w:rPr>
         <w:t xml:space="preserve">From </w:t>
       </w:r>
-      <w:r>
-        <w:rPr>
-          <w:rFonts w:ascii="Times New Roman" w:hAnsi="Times New Roman" w:cs="Times New Roman"/>
-        </w:rPr>
-        <w:t>extend reservation page, user selects how much time they want to extend the reservation (minimum amount is 30 minutes)</w:t>
+      <w:proofErr w:type="gramStart"/>
+      <w:r>
+        <w:rPr>
+          <w:rFonts w:ascii="Times New Roman" w:hAnsi="Times New Roman" w:cs="Times New Roman"/>
+        </w:rPr>
+        <w:t>extend</w:t>
+      </w:r>
+      <w:proofErr w:type="gramEnd"/>
+      <w:r>
+        <w:rPr>
+          <w:rFonts w:ascii="Times New Roman" w:hAnsi="Times New Roman" w:cs="Times New Roman"/>
+        </w:rPr>
+        <w:t xml:space="preserve"> reservation page, user selects how much time they want to extend the reservation (minimum amount is 30 minutes)</w:t>
       </w:r>
     </w:p>
     <w:p>
@@ -5131,7 +5211,21 @@
         <w:rPr>
           <w:rFonts w:ascii="Times New Roman" w:hAnsi="Times New Roman" w:cs="Times New Roman"/>
         </w:rPr>
-        <w:t xml:space="preserve">After selecting extension time, user is prompted to enter payment information </w:t>
+        <w:t xml:space="preserve">After selecting extension time, </w:t>
+      </w:r>
+      <w:proofErr w:type="gramStart"/>
+      <w:r>
+        <w:rPr>
+          <w:rFonts w:ascii="Times New Roman" w:hAnsi="Times New Roman" w:cs="Times New Roman"/>
+        </w:rPr>
+        <w:t>user is</w:t>
+      </w:r>
+      <w:proofErr w:type="gramEnd"/>
+      <w:r>
+        <w:rPr>
+          <w:rFonts w:ascii="Times New Roman" w:hAnsi="Times New Roman" w:cs="Times New Roman"/>
+        </w:rPr>
+        <w:t xml:space="preserve"> prompted to enter payment information </w:t>
       </w:r>
       <w:r>
         <w:rPr>
@@ -5889,7 +5983,21 @@
         <w:rPr>
           <w:rFonts w:ascii="Times New Roman" w:hAnsi="Times New Roman" w:cs="Times New Roman"/>
         </w:rPr>
-        <w:t xml:space="preserve"> Administrator account and is at the Administrator Dashboard</w:t>
+        <w:t xml:space="preserve"> Administrator account and is </w:t>
+      </w:r>
+      <w:proofErr w:type="gramStart"/>
+      <w:r>
+        <w:rPr>
+          <w:rFonts w:ascii="Times New Roman" w:hAnsi="Times New Roman" w:cs="Times New Roman"/>
+        </w:rPr>
+        <w:t>at</w:t>
+      </w:r>
+      <w:proofErr w:type="gramEnd"/>
+      <w:r>
+        <w:rPr>
+          <w:rFonts w:ascii="Times New Roman" w:hAnsi="Times New Roman" w:cs="Times New Roman"/>
+        </w:rPr>
+        <w:t xml:space="preserve"> the Administrator Dashboard</w:t>
       </w:r>
       <w:r>
         <w:rPr>
@@ -5952,7 +6060,21 @@
         <w:rPr>
           <w:rFonts w:ascii="Times New Roman" w:hAnsi="Times New Roman" w:cs="Times New Roman"/>
         </w:rPr>
-        <w:t>In accounts subsection, user can search for the required user</w:t>
+        <w:t xml:space="preserve">In accounts subsection, </w:t>
+      </w:r>
+      <w:proofErr w:type="gramStart"/>
+      <w:r>
+        <w:rPr>
+          <w:rFonts w:ascii="Times New Roman" w:hAnsi="Times New Roman" w:cs="Times New Roman"/>
+        </w:rPr>
+        <w:t>user</w:t>
+      </w:r>
+      <w:proofErr w:type="gramEnd"/>
+      <w:r>
+        <w:rPr>
+          <w:rFonts w:ascii="Times New Roman" w:hAnsi="Times New Roman" w:cs="Times New Roman"/>
+        </w:rPr>
+        <w:t xml:space="preserve"> can search for the required user</w:t>
       </w:r>
       <w:r>
         <w:rPr>
@@ -6110,7 +6232,21 @@
         <w:rPr>
           <w:rFonts w:ascii="Times New Roman" w:hAnsi="Times New Roman" w:cs="Times New Roman"/>
         </w:rPr>
-        <w:t>confirmation screen is shown to the user and an email is sent to the user that the account was removed</w:t>
+        <w:t xml:space="preserve">confirmation screen is shown to the </w:t>
+      </w:r>
+      <w:proofErr w:type="gramStart"/>
+      <w:r>
+        <w:rPr>
+          <w:rFonts w:ascii="Times New Roman" w:hAnsi="Times New Roman" w:cs="Times New Roman"/>
+        </w:rPr>
+        <w:t>user</w:t>
+      </w:r>
+      <w:proofErr w:type="gramEnd"/>
+      <w:r>
+        <w:rPr>
+          <w:rFonts w:ascii="Times New Roman" w:hAnsi="Times New Roman" w:cs="Times New Roman"/>
+        </w:rPr>
+        <w:t xml:space="preserve"> and an email is sent to the user that the account was removed</w:t>
       </w:r>
     </w:p>
     <w:p>
@@ -6299,7 +6435,21 @@
         <w:rPr>
           <w:rFonts w:ascii="Times New Roman" w:hAnsi="Times New Roman" w:cs="Times New Roman"/>
         </w:rPr>
-        <w:t xml:space="preserve">The button redirects the user to a page similar to a physical copy of the </w:t>
+        <w:t xml:space="preserve">The button redirects the user to a page </w:t>
+      </w:r>
+      <w:proofErr w:type="gramStart"/>
+      <w:r>
+        <w:rPr>
+          <w:rFonts w:ascii="Times New Roman" w:hAnsi="Times New Roman" w:cs="Times New Roman"/>
+        </w:rPr>
+        <w:t>similar to</w:t>
+      </w:r>
+      <w:proofErr w:type="gramEnd"/>
+      <w:r>
+        <w:rPr>
+          <w:rFonts w:ascii="Times New Roman" w:hAnsi="Times New Roman" w:cs="Times New Roman"/>
+        </w:rPr>
+        <w:t xml:space="preserve"> a physical copy of the </w:t>
       </w:r>
       <w:r>
         <w:rPr>

</xml_diff>

<commit_message>
Updated documentation to version 1.2
</commit_message>
<xml_diff>
--- a/Nammathao_CIS4374_Project.docx
+++ b/Nammathao_CIS4374_Project.docx
@@ -1283,7 +1283,7 @@
         <w:rPr>
           <w:rFonts w:ascii="Times New Roman" w:hAnsi="Times New Roman" w:cs="Times New Roman"/>
         </w:rPr>
-        <w:t>1</w:t>
+        <w:t>2</w:t>
       </w:r>
     </w:p>
     <w:p>
@@ -1304,13 +1304,13 @@
         <w:rPr>
           <w:rFonts w:ascii="Times New Roman" w:hAnsi="Times New Roman" w:cs="Times New Roman"/>
         </w:rPr>
-        <w:t>09.1</w:t>
-      </w:r>
-      <w:r>
-        <w:rPr>
-          <w:rFonts w:ascii="Times New Roman" w:hAnsi="Times New Roman" w:cs="Times New Roman"/>
-        </w:rPr>
-        <w:t>7</w:t>
+        <w:t>09.</w:t>
+      </w:r>
+      <w:r>
+        <w:rPr>
+          <w:rFonts w:ascii="Times New Roman" w:hAnsi="Times New Roman" w:cs="Times New Roman"/>
+        </w:rPr>
+        <w:t>24</w:t>
       </w:r>
       <w:r>
         <w:rPr>
@@ -6491,6 +6491,487 @@
     </w:p>
     <w:p>
       <w:pPr>
+        <w:pStyle w:val="ListParagraph"/>
+        <w:numPr>
+          <w:ilvl w:val="0"/>
+          <w:numId w:val="12"/>
+        </w:numPr>
+        <w:spacing w:line="240" w:lineRule="auto"/>
+        <w:rPr>
+          <w:rFonts w:ascii="Times New Roman" w:hAnsi="Times New Roman" w:cs="Times New Roman"/>
+        </w:rPr>
+      </w:pPr>
+      <w:r>
+        <w:rPr>
+          <w:rFonts w:ascii="Times New Roman" w:hAnsi="Times New Roman" w:cs="Times New Roman"/>
+        </w:rPr>
+        <w:t>5.16: Adding Payment Method</w:t>
+      </w:r>
+    </w:p>
+    <w:p>
+      <w:pPr>
+        <w:pStyle w:val="ListParagraph"/>
+        <w:numPr>
+          <w:ilvl w:val="1"/>
+          <w:numId w:val="12"/>
+        </w:numPr>
+        <w:spacing w:line="240" w:lineRule="auto"/>
+        <w:rPr>
+          <w:rFonts w:ascii="Times New Roman" w:hAnsi="Times New Roman" w:cs="Times New Roman"/>
+        </w:rPr>
+      </w:pPr>
+      <w:r>
+        <w:rPr>
+          <w:rFonts w:ascii="Times New Roman" w:hAnsi="Times New Roman" w:cs="Times New Roman"/>
+        </w:rPr>
+        <w:t>Actor: Driver</w:t>
+      </w:r>
+    </w:p>
+    <w:p>
+      <w:pPr>
+        <w:pStyle w:val="ListParagraph"/>
+        <w:numPr>
+          <w:ilvl w:val="1"/>
+          <w:numId w:val="12"/>
+        </w:numPr>
+        <w:spacing w:line="240" w:lineRule="auto"/>
+        <w:rPr>
+          <w:rFonts w:ascii="Times New Roman" w:hAnsi="Times New Roman" w:cs="Times New Roman"/>
+        </w:rPr>
+      </w:pPr>
+      <w:r>
+        <w:rPr>
+          <w:rFonts w:ascii="Times New Roman" w:hAnsi="Times New Roman" w:cs="Times New Roman"/>
+        </w:rPr>
+        <w:t>Goal: Add a Method of Payment</w:t>
+      </w:r>
+      <w:r>
+        <w:rPr>
+          <w:rFonts w:ascii="Times New Roman" w:hAnsi="Times New Roman" w:cs="Times New Roman"/>
+        </w:rPr>
+        <w:t xml:space="preserve"> to Pay for Reservations</w:t>
+      </w:r>
+    </w:p>
+    <w:p>
+      <w:pPr>
+        <w:pStyle w:val="ListParagraph"/>
+        <w:numPr>
+          <w:ilvl w:val="1"/>
+          <w:numId w:val="12"/>
+        </w:numPr>
+        <w:spacing w:line="240" w:lineRule="auto"/>
+        <w:rPr>
+          <w:rFonts w:ascii="Times New Roman" w:hAnsi="Times New Roman" w:cs="Times New Roman"/>
+        </w:rPr>
+      </w:pPr>
+      <w:r>
+        <w:rPr>
+          <w:rFonts w:ascii="Times New Roman" w:hAnsi="Times New Roman" w:cs="Times New Roman"/>
+        </w:rPr>
+        <w:t>Steps:</w:t>
+      </w:r>
+    </w:p>
+    <w:p>
+      <w:pPr>
+        <w:pStyle w:val="ListParagraph"/>
+        <w:numPr>
+          <w:ilvl w:val="2"/>
+          <w:numId w:val="12"/>
+        </w:numPr>
+        <w:spacing w:line="240" w:lineRule="auto"/>
+        <w:rPr>
+          <w:rFonts w:ascii="Times New Roman" w:hAnsi="Times New Roman" w:cs="Times New Roman"/>
+        </w:rPr>
+      </w:pPr>
+      <w:r>
+        <w:rPr>
+          <w:rFonts w:ascii="Times New Roman" w:hAnsi="Times New Roman" w:cs="Times New Roman"/>
+        </w:rPr>
+        <w:t>Driver logs in to User account</w:t>
+      </w:r>
+    </w:p>
+    <w:p>
+      <w:pPr>
+        <w:pStyle w:val="ListParagraph"/>
+        <w:numPr>
+          <w:ilvl w:val="2"/>
+          <w:numId w:val="12"/>
+        </w:numPr>
+        <w:spacing w:line="240" w:lineRule="auto"/>
+        <w:rPr>
+          <w:rFonts w:ascii="Times New Roman" w:hAnsi="Times New Roman" w:cs="Times New Roman"/>
+        </w:rPr>
+      </w:pPr>
+      <w:r>
+        <w:rPr>
+          <w:rFonts w:ascii="Times New Roman" w:hAnsi="Times New Roman" w:cs="Times New Roman"/>
+        </w:rPr>
+        <w:t>Driver selects</w:t>
+      </w:r>
+      <w:r>
+        <w:rPr>
+          <w:rFonts w:ascii="Times New Roman" w:hAnsi="Times New Roman" w:cs="Times New Roman"/>
+        </w:rPr>
+        <w:t xml:space="preserve"> Dashboard section on home page</w:t>
+      </w:r>
+    </w:p>
+    <w:p>
+      <w:pPr>
+        <w:pStyle w:val="ListParagraph"/>
+        <w:numPr>
+          <w:ilvl w:val="2"/>
+          <w:numId w:val="12"/>
+        </w:numPr>
+        <w:spacing w:line="240" w:lineRule="auto"/>
+        <w:rPr>
+          <w:rFonts w:ascii="Times New Roman" w:hAnsi="Times New Roman" w:cs="Times New Roman"/>
+        </w:rPr>
+      </w:pPr>
+      <w:r>
+        <w:rPr>
+          <w:rFonts w:ascii="Times New Roman" w:hAnsi="Times New Roman" w:cs="Times New Roman"/>
+        </w:rPr>
+        <w:t>In the dashboard, user selects “Payment Method”</w:t>
+      </w:r>
+      <w:r>
+        <w:rPr>
+          <w:rFonts w:ascii="Times New Roman" w:hAnsi="Times New Roman" w:cs="Times New Roman"/>
+        </w:rPr>
+        <w:t xml:space="preserve"> subsection</w:t>
+      </w:r>
+    </w:p>
+    <w:p>
+      <w:pPr>
+        <w:pStyle w:val="ListParagraph"/>
+        <w:numPr>
+          <w:ilvl w:val="2"/>
+          <w:numId w:val="12"/>
+        </w:numPr>
+        <w:spacing w:line="240" w:lineRule="auto"/>
+        <w:rPr>
+          <w:rFonts w:ascii="Times New Roman" w:hAnsi="Times New Roman" w:cs="Times New Roman"/>
+        </w:rPr>
+      </w:pPr>
+      <w:r>
+        <w:rPr>
+          <w:rFonts w:ascii="Times New Roman" w:hAnsi="Times New Roman" w:cs="Times New Roman"/>
+        </w:rPr>
+        <w:t xml:space="preserve">Driver is taken to </w:t>
+      </w:r>
+      <w:r>
+        <w:rPr>
+          <w:rFonts w:ascii="Times New Roman" w:hAnsi="Times New Roman" w:cs="Times New Roman"/>
+        </w:rPr>
+        <w:t>page with all available payment methods that were added; the default payment method is at the top of the list</w:t>
+      </w:r>
+    </w:p>
+    <w:p>
+      <w:pPr>
+        <w:pStyle w:val="ListParagraph"/>
+        <w:numPr>
+          <w:ilvl w:val="2"/>
+          <w:numId w:val="12"/>
+        </w:numPr>
+        <w:spacing w:line="240" w:lineRule="auto"/>
+        <w:rPr>
+          <w:rFonts w:ascii="Times New Roman" w:hAnsi="Times New Roman" w:cs="Times New Roman"/>
+        </w:rPr>
+      </w:pPr>
+      <w:r>
+        <w:rPr>
+          <w:rFonts w:ascii="Times New Roman" w:hAnsi="Times New Roman" w:cs="Times New Roman"/>
+        </w:rPr>
+        <w:t xml:space="preserve">To add new payment method, </w:t>
+      </w:r>
+      <w:r>
+        <w:rPr>
+          <w:rFonts w:ascii="Times New Roman" w:hAnsi="Times New Roman" w:cs="Times New Roman"/>
+        </w:rPr>
+        <w:t>driver clicks on “Add Payment Method” button</w:t>
+      </w:r>
+    </w:p>
+    <w:p>
+      <w:pPr>
+        <w:pStyle w:val="ListParagraph"/>
+        <w:numPr>
+          <w:ilvl w:val="2"/>
+          <w:numId w:val="12"/>
+        </w:numPr>
+        <w:spacing w:line="240" w:lineRule="auto"/>
+        <w:rPr>
+          <w:rFonts w:ascii="Times New Roman" w:hAnsi="Times New Roman" w:cs="Times New Roman"/>
+        </w:rPr>
+      </w:pPr>
+      <w:r>
+        <w:rPr>
+          <w:rFonts w:ascii="Times New Roman" w:hAnsi="Times New Roman" w:cs="Times New Roman"/>
+        </w:rPr>
+        <w:t>Driver fills out required payment method information and</w:t>
+      </w:r>
+      <w:r>
+        <w:rPr>
+          <w:rFonts w:ascii="Times New Roman" w:hAnsi="Times New Roman" w:cs="Times New Roman"/>
+        </w:rPr>
+        <w:t xml:space="preserve"> can</w:t>
+      </w:r>
+      <w:r>
+        <w:rPr>
+          <w:rFonts w:ascii="Times New Roman" w:hAnsi="Times New Roman" w:cs="Times New Roman"/>
+        </w:rPr>
+        <w:t xml:space="preserve"> </w:t>
+      </w:r>
+      <w:r>
+        <w:rPr>
+          <w:rFonts w:ascii="Times New Roman" w:hAnsi="Times New Roman" w:cs="Times New Roman"/>
+        </w:rPr>
+        <w:t>choose</w:t>
+      </w:r>
+      <w:r>
+        <w:rPr>
+          <w:rFonts w:ascii="Times New Roman" w:hAnsi="Times New Roman" w:cs="Times New Roman"/>
+        </w:rPr>
+        <w:t xml:space="preserve"> to make the payment method the default payment method.</w:t>
+      </w:r>
+    </w:p>
+    <w:p>
+      <w:pPr>
+        <w:pStyle w:val="ListParagraph"/>
+        <w:numPr>
+          <w:ilvl w:val="2"/>
+          <w:numId w:val="12"/>
+        </w:numPr>
+        <w:spacing w:line="240" w:lineRule="auto"/>
+        <w:rPr>
+          <w:rFonts w:ascii="Times New Roman" w:hAnsi="Times New Roman" w:cs="Times New Roman"/>
+        </w:rPr>
+      </w:pPr>
+      <w:r>
+        <w:rPr>
+          <w:rFonts w:ascii="Times New Roman" w:hAnsi="Times New Roman" w:cs="Times New Roman"/>
+        </w:rPr>
+        <w:t xml:space="preserve">Driver submits </w:t>
+      </w:r>
+      <w:r>
+        <w:rPr>
+          <w:rFonts w:ascii="Times New Roman" w:hAnsi="Times New Roman" w:cs="Times New Roman"/>
+        </w:rPr>
+        <w:t xml:space="preserve">payment method form and </w:t>
+      </w:r>
+      <w:r>
+        <w:rPr>
+          <w:rFonts w:ascii="Times New Roman" w:hAnsi="Times New Roman" w:cs="Times New Roman"/>
+        </w:rPr>
+        <w:t>takes it</w:t>
+      </w:r>
+      <w:r>
+        <w:rPr>
+          <w:rFonts w:ascii="Times New Roman" w:hAnsi="Times New Roman" w:cs="Times New Roman"/>
+        </w:rPr>
+        <w:t xml:space="preserve"> back to Payment Method webpage with confirmation banner</w:t>
+      </w:r>
+    </w:p>
+    <w:p>
+      <w:pPr>
+        <w:pStyle w:val="ListParagraph"/>
+        <w:numPr>
+          <w:ilvl w:val="2"/>
+          <w:numId w:val="12"/>
+        </w:numPr>
+        <w:spacing w:line="240" w:lineRule="auto"/>
+        <w:rPr>
+          <w:rFonts w:ascii="Times New Roman" w:hAnsi="Times New Roman" w:cs="Times New Roman"/>
+        </w:rPr>
+      </w:pPr>
+      <w:r>
+        <w:rPr>
+          <w:rFonts w:ascii="Times New Roman" w:hAnsi="Times New Roman" w:cs="Times New Roman"/>
+        </w:rPr>
+        <w:t>Email is sent to driver email confirming added payment method</w:t>
+      </w:r>
+    </w:p>
+    <w:p>
+      <w:pPr>
+        <w:pStyle w:val="ListParagraph"/>
+        <w:numPr>
+          <w:ilvl w:val="0"/>
+          <w:numId w:val="12"/>
+        </w:numPr>
+        <w:spacing w:line="240" w:lineRule="auto"/>
+        <w:rPr>
+          <w:rFonts w:ascii="Times New Roman" w:hAnsi="Times New Roman" w:cs="Times New Roman"/>
+        </w:rPr>
+      </w:pPr>
+      <w:r>
+        <w:rPr>
+          <w:rFonts w:ascii="Times New Roman" w:hAnsi="Times New Roman" w:cs="Times New Roman"/>
+        </w:rPr>
+        <w:t>5.17: Getting</w:t>
+      </w:r>
+      <w:r>
+        <w:rPr>
+          <w:rFonts w:ascii="Times New Roman" w:hAnsi="Times New Roman" w:cs="Times New Roman"/>
+        </w:rPr>
+        <w:t xml:space="preserve"> Customer</w:t>
+      </w:r>
+      <w:r>
+        <w:rPr>
+          <w:rFonts w:ascii="Times New Roman" w:hAnsi="Times New Roman" w:cs="Times New Roman"/>
+        </w:rPr>
+        <w:t xml:space="preserve"> Support</w:t>
+      </w:r>
+    </w:p>
+    <w:p>
+      <w:pPr>
+        <w:pStyle w:val="ListParagraph"/>
+        <w:numPr>
+          <w:ilvl w:val="1"/>
+          <w:numId w:val="12"/>
+        </w:numPr>
+        <w:spacing w:line="240" w:lineRule="auto"/>
+        <w:rPr>
+          <w:rFonts w:ascii="Times New Roman" w:hAnsi="Times New Roman" w:cs="Times New Roman"/>
+        </w:rPr>
+      </w:pPr>
+      <w:r>
+        <w:rPr>
+          <w:rFonts w:ascii="Times New Roman" w:hAnsi="Times New Roman" w:cs="Times New Roman"/>
+        </w:rPr>
+        <w:t xml:space="preserve">Actor: </w:t>
+      </w:r>
+      <w:r>
+        <w:rPr>
+          <w:rFonts w:ascii="Times New Roman" w:hAnsi="Times New Roman" w:cs="Times New Roman"/>
+        </w:rPr>
+        <w:t>Driver</w:t>
+      </w:r>
+    </w:p>
+    <w:p>
+      <w:pPr>
+        <w:pStyle w:val="ListParagraph"/>
+        <w:numPr>
+          <w:ilvl w:val="1"/>
+          <w:numId w:val="12"/>
+        </w:numPr>
+        <w:spacing w:line="240" w:lineRule="auto"/>
+        <w:rPr>
+          <w:rFonts w:ascii="Times New Roman" w:hAnsi="Times New Roman" w:cs="Times New Roman"/>
+        </w:rPr>
+      </w:pPr>
+      <w:r>
+        <w:rPr>
+          <w:rFonts w:ascii="Times New Roman" w:hAnsi="Times New Roman" w:cs="Times New Roman"/>
+        </w:rPr>
+        <w:t xml:space="preserve">Goal: If the driver has questions about the reservation application, </w:t>
+      </w:r>
+      <w:r>
+        <w:rPr>
+          <w:rFonts w:ascii="Times New Roman" w:hAnsi="Times New Roman" w:cs="Times New Roman"/>
+        </w:rPr>
+        <w:t>the driver can interact with a chatbot</w:t>
+      </w:r>
+      <w:r>
+        <w:rPr>
+          <w:rFonts w:ascii="Times New Roman" w:hAnsi="Times New Roman" w:cs="Times New Roman"/>
+        </w:rPr>
+        <w:t xml:space="preserve"> to answer questions</w:t>
+      </w:r>
+    </w:p>
+    <w:p>
+      <w:pPr>
+        <w:pStyle w:val="ListParagraph"/>
+        <w:numPr>
+          <w:ilvl w:val="1"/>
+          <w:numId w:val="12"/>
+        </w:numPr>
+        <w:spacing w:line="240" w:lineRule="auto"/>
+        <w:rPr>
+          <w:rFonts w:ascii="Times New Roman" w:hAnsi="Times New Roman" w:cs="Times New Roman"/>
+        </w:rPr>
+      </w:pPr>
+      <w:r>
+        <w:rPr>
+          <w:rFonts w:ascii="Times New Roman" w:hAnsi="Times New Roman" w:cs="Times New Roman"/>
+        </w:rPr>
+        <w:lastRenderedPageBreak/>
+        <w:t>Steps:</w:t>
+      </w:r>
+    </w:p>
+    <w:p>
+      <w:pPr>
+        <w:pStyle w:val="ListParagraph"/>
+        <w:numPr>
+          <w:ilvl w:val="2"/>
+          <w:numId w:val="12"/>
+        </w:numPr>
+        <w:spacing w:line="240" w:lineRule="auto"/>
+        <w:rPr>
+          <w:rFonts w:ascii="Times New Roman" w:hAnsi="Times New Roman" w:cs="Times New Roman"/>
+        </w:rPr>
+      </w:pPr>
+      <w:r>
+        <w:rPr>
+          <w:rFonts w:ascii="Times New Roman" w:hAnsi="Times New Roman" w:cs="Times New Roman"/>
+        </w:rPr>
+        <w:t>On any webpage</w:t>
+      </w:r>
+      <w:r>
+        <w:rPr>
+          <w:rFonts w:ascii="Times New Roman" w:hAnsi="Times New Roman" w:cs="Times New Roman"/>
+        </w:rPr>
+        <w:t xml:space="preserve"> except the login page</w:t>
+      </w:r>
+      <w:r>
+        <w:rPr>
+          <w:rFonts w:ascii="Times New Roman" w:hAnsi="Times New Roman" w:cs="Times New Roman"/>
+        </w:rPr>
+        <w:t xml:space="preserve"> in the application, </w:t>
+      </w:r>
+      <w:r>
+        <w:rPr>
+          <w:rFonts w:ascii="Times New Roman" w:hAnsi="Times New Roman" w:cs="Times New Roman"/>
+        </w:rPr>
+        <w:t xml:space="preserve">the bottom right contains the </w:t>
+      </w:r>
+      <w:r>
+        <w:rPr>
+          <w:rFonts w:ascii="Times New Roman" w:hAnsi="Times New Roman" w:cs="Times New Roman"/>
+        </w:rPr>
+        <w:t>chatbot with a message symbol</w:t>
+      </w:r>
+    </w:p>
+    <w:p>
+      <w:pPr>
+        <w:pStyle w:val="ListParagraph"/>
+        <w:numPr>
+          <w:ilvl w:val="2"/>
+          <w:numId w:val="12"/>
+        </w:numPr>
+        <w:spacing w:line="240" w:lineRule="auto"/>
+        <w:rPr>
+          <w:rFonts w:ascii="Times New Roman" w:hAnsi="Times New Roman" w:cs="Times New Roman"/>
+        </w:rPr>
+      </w:pPr>
+      <w:r>
+        <w:rPr>
+          <w:rFonts w:ascii="Times New Roman" w:hAnsi="Times New Roman" w:cs="Times New Roman"/>
+        </w:rPr>
+        <w:t xml:space="preserve">Clicking on message symbol </w:t>
+      </w:r>
+      <w:r>
+        <w:rPr>
+          <w:rFonts w:ascii="Times New Roman" w:hAnsi="Times New Roman" w:cs="Times New Roman"/>
+        </w:rPr>
+        <w:t xml:space="preserve">opens text box </w:t>
+      </w:r>
+      <w:r>
+        <w:rPr>
+          <w:rFonts w:ascii="Times New Roman" w:hAnsi="Times New Roman" w:cs="Times New Roman"/>
+        </w:rPr>
+        <w:t>to enter question to chatbot</w:t>
+      </w:r>
+    </w:p>
+    <w:p>
+      <w:pPr>
         <w:rPr>
           <w:rFonts w:ascii="Times New Roman" w:hAnsi="Times New Roman" w:cs="Times New Roman"/>
         </w:rPr>
@@ -6531,6 +7012,10 @@
         <w:jc w:val="center"/>
         <w:rPr>
           <w:rFonts w:ascii="Times New Roman" w:hAnsi="Times New Roman" w:cs="Times New Roman"/>
+          <w:b/>
+          <w:bCs/>
+          <w:sz w:val="32"/>
+          <w:szCs w:val="32"/>
         </w:rPr>
       </w:pPr>
       <w:r>
@@ -6539,10 +7024,10 @@
           <w:noProof/>
         </w:rPr>
         <w:drawing>
-          <wp:inline distT="0" distB="0" distL="0" distR="0" wp14:anchorId="0CAEC915" wp14:editId="5C3519FB">
-            <wp:extent cx="4373880" cy="7625167"/>
-            <wp:effectExtent l="0" t="0" r="7620" b="0"/>
-            <wp:docPr id="1549901487" name="Picture 1"/>
+          <wp:inline distT="0" distB="0" distL="0" distR="0" wp14:anchorId="465E073D" wp14:editId="089C43E2">
+            <wp:extent cx="4977307" cy="7521677"/>
+            <wp:effectExtent l="0" t="0" r="0" b="3175"/>
+            <wp:docPr id="891393500" name="Picture 2"/>
             <wp:cNvGraphicFramePr>
               <a:graphicFrameLocks xmlns:a="http://schemas.openxmlformats.org/drawingml/2006/main" noChangeAspect="1"/>
             </wp:cNvGraphicFramePr>
@@ -6550,7 +7035,7 @@
               <a:graphicData uri="http://schemas.openxmlformats.org/drawingml/2006/picture">
                 <pic:pic xmlns:pic="http://schemas.openxmlformats.org/drawingml/2006/picture">
                   <pic:nvPicPr>
-                    <pic:cNvPr id="0" name="Picture 1"/>
+                    <pic:cNvPr id="0" name="Picture 2"/>
                     <pic:cNvPicPr>
                       <a:picLocks noChangeAspect="1" noChangeArrowheads="1"/>
                     </pic:cNvPicPr>
@@ -6571,7 +7056,7 @@
                   <pic:spPr bwMode="auto">
                     <a:xfrm>
                       <a:off x="0" y="0"/>
-                      <a:ext cx="4378666" cy="7633510"/>
+                      <a:ext cx="4978209" cy="7523040"/>
                     </a:xfrm>
                     <a:prstGeom prst="rect">
                       <a:avLst/>
@@ -6602,10 +7087,10 @@
         </w:rPr>
         <w:lastRenderedPageBreak/>
         <w:drawing>
-          <wp:inline distT="0" distB="0" distL="0" distR="0" wp14:anchorId="54635F6E" wp14:editId="45786286">
-            <wp:extent cx="4705512" cy="7703820"/>
+          <wp:inline distT="0" distB="0" distL="0" distR="0" wp14:anchorId="4EF2DA1B" wp14:editId="709A885D">
+            <wp:extent cx="5418455" cy="8229600"/>
             <wp:effectExtent l="0" t="0" r="0" b="0"/>
-            <wp:docPr id="1790439294" name="Picture 2"/>
+            <wp:docPr id="1669203151" name="Picture 3"/>
             <wp:cNvGraphicFramePr>
               <a:graphicFrameLocks xmlns:a="http://schemas.openxmlformats.org/drawingml/2006/main" noChangeAspect="1"/>
             </wp:cNvGraphicFramePr>
@@ -6613,7 +7098,7 @@
               <a:graphicData uri="http://schemas.openxmlformats.org/drawingml/2006/picture">
                 <pic:pic xmlns:pic="http://schemas.openxmlformats.org/drawingml/2006/picture">
                   <pic:nvPicPr>
-                    <pic:cNvPr id="0" name="Picture 2"/>
+                    <pic:cNvPr id="0" name="Picture 3"/>
                     <pic:cNvPicPr>
                       <a:picLocks noChangeAspect="1" noChangeArrowheads="1"/>
                     </pic:cNvPicPr>
@@ -6634,7 +7119,7 @@
                   <pic:spPr bwMode="auto">
                     <a:xfrm>
                       <a:off x="0" y="0"/>
-                      <a:ext cx="4713119" cy="7716275"/>
+                      <a:ext cx="5418455" cy="8229600"/>
                     </a:xfrm>
                     <a:prstGeom prst="rect">
                       <a:avLst/>
@@ -6665,10 +7150,10 @@
         </w:rPr>
         <w:lastRenderedPageBreak/>
         <w:drawing>
-          <wp:inline distT="0" distB="0" distL="0" distR="0" wp14:anchorId="72F46077" wp14:editId="4A9B5E04">
-            <wp:extent cx="4724400" cy="8090410"/>
-            <wp:effectExtent l="0" t="0" r="0" b="6350"/>
-            <wp:docPr id="422584103" name="Picture 3"/>
+          <wp:inline distT="0" distB="0" distL="0" distR="0" wp14:anchorId="19B27639" wp14:editId="3BBC8FAC">
+            <wp:extent cx="5030470" cy="8229600"/>
+            <wp:effectExtent l="0" t="0" r="0" b="0"/>
+            <wp:docPr id="1288788782" name="Picture 4"/>
             <wp:cNvGraphicFramePr>
               <a:graphicFrameLocks xmlns:a="http://schemas.openxmlformats.org/drawingml/2006/main" noChangeAspect="1"/>
             </wp:cNvGraphicFramePr>
@@ -6676,7 +7161,7 @@
               <a:graphicData uri="http://schemas.openxmlformats.org/drawingml/2006/picture">
                 <pic:pic xmlns:pic="http://schemas.openxmlformats.org/drawingml/2006/picture">
                   <pic:nvPicPr>
-                    <pic:cNvPr id="0" name="Picture 3"/>
+                    <pic:cNvPr id="0" name="Picture 4"/>
                     <pic:cNvPicPr>
                       <a:picLocks noChangeAspect="1" noChangeArrowheads="1"/>
                     </pic:cNvPicPr>
@@ -6697,7 +7182,7 @@
                   <pic:spPr bwMode="auto">
                     <a:xfrm>
                       <a:off x="0" y="0"/>
-                      <a:ext cx="4732791" cy="8104780"/>
+                      <a:ext cx="5030470" cy="8229600"/>
                     </a:xfrm>
                     <a:prstGeom prst="rect">
                       <a:avLst/>
@@ -6728,10 +7213,10 @@
         </w:rPr>
         <w:lastRenderedPageBreak/>
         <w:drawing>
-          <wp:inline distT="0" distB="0" distL="0" distR="0" wp14:anchorId="0D821C52" wp14:editId="06C6E210">
-            <wp:extent cx="4986020" cy="8229600"/>
-            <wp:effectExtent l="0" t="0" r="5080" b="0"/>
-            <wp:docPr id="1853352563" name="Picture 4"/>
+          <wp:inline distT="0" distB="0" distL="0" distR="0" wp14:anchorId="555899E5" wp14:editId="79FB66E3">
+            <wp:extent cx="5473065" cy="8229600"/>
+            <wp:effectExtent l="0" t="0" r="0" b="0"/>
+            <wp:docPr id="1107819555" name="Picture 6"/>
             <wp:cNvGraphicFramePr>
               <a:graphicFrameLocks xmlns:a="http://schemas.openxmlformats.org/drawingml/2006/main" noChangeAspect="1"/>
             </wp:cNvGraphicFramePr>
@@ -6739,7 +7224,7 @@
               <a:graphicData uri="http://schemas.openxmlformats.org/drawingml/2006/picture">
                 <pic:pic xmlns:pic="http://schemas.openxmlformats.org/drawingml/2006/picture">
                   <pic:nvPicPr>
-                    <pic:cNvPr id="0" name="Picture 4"/>
+                    <pic:cNvPr id="0" name="Picture 6"/>
                     <pic:cNvPicPr>
                       <a:picLocks noChangeAspect="1" noChangeArrowheads="1"/>
                     </pic:cNvPicPr>
@@ -6760,7 +7245,7 @@
                   <pic:spPr bwMode="auto">
                     <a:xfrm>
                       <a:off x="0" y="0"/>
-                      <a:ext cx="4986020" cy="8229600"/>
+                      <a:ext cx="5473065" cy="8229600"/>
                     </a:xfrm>
                     <a:prstGeom prst="rect">
                       <a:avLst/>
@@ -6779,6 +7264,7 @@
     </w:p>
     <w:p>
       <w:pPr>
+        <w:jc w:val="center"/>
         <w:rPr>
           <w:rFonts w:ascii="Times New Roman" w:hAnsi="Times New Roman" w:cs="Times New Roman"/>
           <w:b/>
@@ -6792,41 +7278,16 @@
           <w:rFonts w:ascii="Times New Roman" w:hAnsi="Times New Roman" w:cs="Times New Roman"/>
           <w:b/>
           <w:bCs/>
+          <w:noProof/>
           <w:sz w:val="32"/>
           <w:szCs w:val="32"/>
         </w:rPr>
         <w:lastRenderedPageBreak/>
-        <w:t>7.</w:t>
-      </w:r>
-      <w:r>
-        <w:rPr>
-          <w:rFonts w:ascii="Times New Roman" w:hAnsi="Times New Roman" w:cs="Times New Roman"/>
-          <w:b/>
-          <w:bCs/>
-          <w:sz w:val="32"/>
-          <w:szCs w:val="32"/>
-        </w:rPr>
-        <w:t>Gantt Chart</w:t>
-      </w:r>
-    </w:p>
-    <w:p>
-      <w:pPr>
-        <w:spacing w:line="240" w:lineRule="auto"/>
-        <w:jc w:val="center"/>
-        <w:rPr>
-          <w:rFonts w:ascii="Times New Roman" w:hAnsi="Times New Roman" w:cs="Times New Roman"/>
-        </w:rPr>
-      </w:pPr>
-      <w:r>
-        <w:rPr>
-          <w:rFonts w:ascii="Times New Roman" w:hAnsi="Times New Roman" w:cs="Times New Roman"/>
-          <w:noProof/>
-        </w:rPr>
         <w:drawing>
-          <wp:inline distT="0" distB="0" distL="0" distR="0" wp14:anchorId="080E3BED" wp14:editId="534A7097">
-            <wp:extent cx="5943600" cy="6968490"/>
-            <wp:effectExtent l="0" t="0" r="0" b="3810"/>
-            <wp:docPr id="630756616" name="Picture 6"/>
+          <wp:inline distT="0" distB="0" distL="0" distR="0" wp14:anchorId="3D5E4A53" wp14:editId="5298C547">
+            <wp:extent cx="5855335" cy="4653280"/>
+            <wp:effectExtent l="0" t="0" r="0" b="0"/>
+            <wp:docPr id="232055454" name="Picture 7"/>
             <wp:cNvGraphicFramePr>
               <a:graphicFrameLocks xmlns:a="http://schemas.openxmlformats.org/drawingml/2006/main" noChangeAspect="1"/>
             </wp:cNvGraphicFramePr>
@@ -6834,7 +7295,7 @@
               <a:graphicData uri="http://schemas.openxmlformats.org/drawingml/2006/picture">
                 <pic:pic xmlns:pic="http://schemas.openxmlformats.org/drawingml/2006/picture">
                   <pic:nvPicPr>
-                    <pic:cNvPr id="0" name="Picture 6"/>
+                    <pic:cNvPr id="0" name="Picture 7"/>
                     <pic:cNvPicPr>
                       <a:picLocks noChangeAspect="1" noChangeArrowheads="1"/>
                     </pic:cNvPicPr>
@@ -6855,7 +7316,7 @@
                   <pic:spPr bwMode="auto">
                     <a:xfrm>
                       <a:off x="0" y="0"/>
-                      <a:ext cx="5943600" cy="6968490"/>
+                      <a:ext cx="5855335" cy="4653280"/>
                     </a:xfrm>
                     <a:prstGeom prst="rect">
                       <a:avLst/>
@@ -6871,9 +7332,567 @@
           </wp:inline>
         </w:drawing>
       </w:r>
+      <w:r>
+        <w:rPr>
+          <w:rFonts w:ascii="Times New Roman" w:hAnsi="Times New Roman" w:cs="Times New Roman"/>
+          <w:b/>
+          <w:bCs/>
+          <w:sz w:val="32"/>
+          <w:szCs w:val="32"/>
+        </w:rPr>
+        <w:t xml:space="preserve"> </w:t>
+      </w:r>
+      <w:r>
+        <w:rPr>
+          <w:rFonts w:ascii="Times New Roman" w:hAnsi="Times New Roman" w:cs="Times New Roman"/>
+          <w:b/>
+          <w:bCs/>
+          <w:sz w:val="32"/>
+          <w:szCs w:val="32"/>
+        </w:rPr>
+        <w:br w:type="page"/>
+      </w:r>
+    </w:p>
+    <w:p>
+      <w:pPr>
+        <w:rPr>
+          <w:rFonts w:ascii="Times New Roman" w:hAnsi="Times New Roman" w:cs="Times New Roman"/>
+        </w:rPr>
+      </w:pPr>
+      <w:r>
+        <w:rPr>
+          <w:rFonts w:ascii="Times New Roman" w:hAnsi="Times New Roman" w:cs="Times New Roman"/>
+          <w:b/>
+          <w:bCs/>
+          <w:sz w:val="32"/>
+          <w:szCs w:val="32"/>
+        </w:rPr>
+        <w:lastRenderedPageBreak/>
+        <w:t>7.</w:t>
+      </w:r>
+      <w:r>
+        <w:rPr>
+          <w:rFonts w:ascii="Times New Roman" w:hAnsi="Times New Roman" w:cs="Times New Roman"/>
+          <w:b/>
+          <w:bCs/>
+          <w:sz w:val="32"/>
+          <w:szCs w:val="32"/>
+        </w:rPr>
+        <w:t>Gantt Chart</w:t>
+      </w:r>
+    </w:p>
+    <w:p>
+      <w:pPr>
+        <w:spacing w:line="240" w:lineRule="auto"/>
+        <w:jc w:val="center"/>
+        <w:rPr>
+          <w:rFonts w:ascii="Times New Roman" w:hAnsi="Times New Roman" w:cs="Times New Roman"/>
+        </w:rPr>
+      </w:pPr>
+      <w:r>
+        <w:rPr>
+          <w:rFonts w:ascii="Times New Roman" w:hAnsi="Times New Roman" w:cs="Times New Roman"/>
+          <w:noProof/>
+        </w:rPr>
+        <w:drawing>
+          <wp:inline distT="0" distB="0" distL="0" distR="0" wp14:anchorId="2292F014" wp14:editId="58204CBC">
+            <wp:extent cx="5943600" cy="6675755"/>
+            <wp:effectExtent l="0" t="0" r="0" b="0"/>
+            <wp:docPr id="1414314984" name="Picture 10"/>
+            <wp:cNvGraphicFramePr>
+              <a:graphicFrameLocks xmlns:a="http://schemas.openxmlformats.org/drawingml/2006/main" noChangeAspect="1"/>
+            </wp:cNvGraphicFramePr>
+            <a:graphic xmlns:a="http://schemas.openxmlformats.org/drawingml/2006/main">
+              <a:graphicData uri="http://schemas.openxmlformats.org/drawingml/2006/picture">
+                <pic:pic xmlns:pic="http://schemas.openxmlformats.org/drawingml/2006/picture">
+                  <pic:nvPicPr>
+                    <pic:cNvPr id="0" name="Picture 10"/>
+                    <pic:cNvPicPr>
+                      <a:picLocks noChangeAspect="1" noChangeArrowheads="1"/>
+                    </pic:cNvPicPr>
+                  </pic:nvPicPr>
+                  <pic:blipFill>
+                    <a:blip r:embed="rId12">
+                      <a:extLst>
+                        <a:ext uri="{28A0092B-C50C-407E-A947-70E740481C1C}">
+                          <a14:useLocalDpi xmlns:a14="http://schemas.microsoft.com/office/drawing/2010/main" val="0"/>
+                        </a:ext>
+                      </a:extLst>
+                    </a:blip>
+                    <a:srcRect/>
+                    <a:stretch>
+                      <a:fillRect/>
+                    </a:stretch>
+                  </pic:blipFill>
+                  <pic:spPr bwMode="auto">
+                    <a:xfrm>
+                      <a:off x="0" y="0"/>
+                      <a:ext cx="5943600" cy="6675755"/>
+                    </a:xfrm>
+                    <a:prstGeom prst="rect">
+                      <a:avLst/>
+                    </a:prstGeom>
+                    <a:noFill/>
+                    <a:ln>
+                      <a:noFill/>
+                    </a:ln>
+                  </pic:spPr>
+                </pic:pic>
+              </a:graphicData>
+            </a:graphic>
+          </wp:inline>
+        </w:drawing>
+      </w:r>
+    </w:p>
+    <w:p>
+      <w:pPr>
+        <w:rPr>
+          <w:rFonts w:ascii="Times New Roman" w:hAnsi="Times New Roman" w:cs="Times New Roman"/>
+        </w:rPr>
+      </w:pPr>
+      <w:r>
+        <w:rPr>
+          <w:rFonts w:ascii="Times New Roman" w:hAnsi="Times New Roman" w:cs="Times New Roman"/>
+        </w:rPr>
+        <w:br w:type="page"/>
+      </w:r>
+    </w:p>
+    <w:p>
+      <w:pPr>
+        <w:spacing w:line="240" w:lineRule="auto"/>
+        <w:rPr>
+          <w:rFonts w:ascii="Times New Roman" w:hAnsi="Times New Roman" w:cs="Times New Roman"/>
+          <w:b/>
+          <w:bCs/>
+          <w:sz w:val="32"/>
+          <w:szCs w:val="32"/>
+        </w:rPr>
+      </w:pPr>
+      <w:r>
+        <w:rPr>
+          <w:rFonts w:ascii="Times New Roman" w:hAnsi="Times New Roman" w:cs="Times New Roman"/>
+          <w:b/>
+          <w:bCs/>
+          <w:sz w:val="32"/>
+          <w:szCs w:val="32"/>
+        </w:rPr>
+        <w:lastRenderedPageBreak/>
+        <w:t xml:space="preserve">8.Sprint </w:t>
+      </w:r>
+      <w:r>
+        <w:rPr>
+          <w:rFonts w:ascii="Times New Roman" w:hAnsi="Times New Roman" w:cs="Times New Roman"/>
+          <w:b/>
+          <w:bCs/>
+          <w:sz w:val="32"/>
+          <w:szCs w:val="32"/>
+        </w:rPr>
+        <w:t>1</w:t>
+      </w:r>
+      <w:r>
+        <w:rPr>
+          <w:rFonts w:ascii="Times New Roman" w:hAnsi="Times New Roman" w:cs="Times New Roman"/>
+          <w:b/>
+          <w:bCs/>
+          <w:sz w:val="32"/>
+          <w:szCs w:val="32"/>
+        </w:rPr>
+        <w:t xml:space="preserve"> &amp; 2</w:t>
+      </w:r>
+      <w:r>
+        <w:rPr>
+          <w:rFonts w:ascii="Times New Roman" w:hAnsi="Times New Roman" w:cs="Times New Roman"/>
+          <w:b/>
+          <w:bCs/>
+          <w:sz w:val="32"/>
+          <w:szCs w:val="32"/>
+        </w:rPr>
+        <w:t xml:space="preserve"> </w:t>
+      </w:r>
+      <w:r>
+        <w:rPr>
+          <w:rFonts w:ascii="Times New Roman" w:hAnsi="Times New Roman" w:cs="Times New Roman"/>
+          <w:b/>
+          <w:bCs/>
+          <w:sz w:val="32"/>
+          <w:szCs w:val="32"/>
+        </w:rPr>
+        <w:t>Backlog</w:t>
+      </w:r>
+    </w:p>
+    <w:p>
+      <w:pPr>
+        <w:spacing w:line="240" w:lineRule="auto"/>
+        <w:jc w:val="center"/>
+        <w:rPr>
+          <w:rFonts w:ascii="Times New Roman" w:hAnsi="Times New Roman" w:cs="Times New Roman"/>
+          <w:sz w:val="32"/>
+          <w:szCs w:val="32"/>
+        </w:rPr>
+      </w:pPr>
+      <w:r>
+        <w:rPr>
+          <w:rFonts w:ascii="Times New Roman" w:hAnsi="Times New Roman" w:cs="Times New Roman"/>
+          <w:noProof/>
+          <w:sz w:val="32"/>
+          <w:szCs w:val="32"/>
+        </w:rPr>
+        <w:drawing>
+          <wp:inline distT="0" distB="0" distL="0" distR="0" wp14:anchorId="337C199C" wp14:editId="29CEB685">
+            <wp:extent cx="5938683" cy="3340509"/>
+            <wp:effectExtent l="0" t="0" r="5080" b="0"/>
+            <wp:docPr id="2130040164" name="Picture 11"/>
+            <wp:cNvGraphicFramePr>
+              <a:graphicFrameLocks xmlns:a="http://schemas.openxmlformats.org/drawingml/2006/main" noChangeAspect="1"/>
+            </wp:cNvGraphicFramePr>
+            <a:graphic xmlns:a="http://schemas.openxmlformats.org/drawingml/2006/main">
+              <a:graphicData uri="http://schemas.openxmlformats.org/drawingml/2006/picture">
+                <pic:pic xmlns:pic="http://schemas.openxmlformats.org/drawingml/2006/picture">
+                  <pic:nvPicPr>
+                    <pic:cNvPr id="2130040164" name="Picture 2130040164"/>
+                    <pic:cNvPicPr/>
+                  </pic:nvPicPr>
+                  <pic:blipFill>
+                    <a:blip r:embed="rId13" cstate="print">
+                      <a:extLst>
+                        <a:ext uri="{28A0092B-C50C-407E-A947-70E740481C1C}">
+                          <a14:useLocalDpi xmlns:a14="http://schemas.microsoft.com/office/drawing/2010/main" val="0"/>
+                        </a:ext>
+                      </a:extLst>
+                    </a:blip>
+                    <a:stretch>
+                      <a:fillRect/>
+                    </a:stretch>
+                  </pic:blipFill>
+                  <pic:spPr>
+                    <a:xfrm>
+                      <a:off x="0" y="0"/>
+                      <a:ext cx="5955453" cy="3349942"/>
+                    </a:xfrm>
+                    <a:prstGeom prst="rect">
+                      <a:avLst/>
+                    </a:prstGeom>
+                  </pic:spPr>
+                </pic:pic>
+              </a:graphicData>
+            </a:graphic>
+          </wp:inline>
+        </w:drawing>
+      </w:r>
+    </w:p>
+    <w:p>
+      <w:pPr>
+        <w:spacing w:line="240" w:lineRule="auto"/>
+        <w:jc w:val="center"/>
+        <w:rPr>
+          <w:rFonts w:ascii="Times New Roman" w:hAnsi="Times New Roman" w:cs="Times New Roman"/>
+          <w:sz w:val="32"/>
+          <w:szCs w:val="32"/>
+        </w:rPr>
+      </w:pPr>
+      <w:r>
+        <w:rPr>
+          <w:rFonts w:ascii="Times New Roman" w:hAnsi="Times New Roman" w:cs="Times New Roman"/>
+          <w:noProof/>
+          <w:sz w:val="32"/>
+          <w:szCs w:val="32"/>
+        </w:rPr>
+        <w:drawing>
+          <wp:inline distT="0" distB="0" distL="0" distR="0" wp14:anchorId="5A529FF3" wp14:editId="78649E9D">
+            <wp:extent cx="5943600" cy="3343275"/>
+            <wp:effectExtent l="0" t="0" r="0" b="9525"/>
+            <wp:docPr id="1368895808" name="Picture 17"/>
+            <wp:cNvGraphicFramePr>
+              <a:graphicFrameLocks xmlns:a="http://schemas.openxmlformats.org/drawingml/2006/main" noChangeAspect="1"/>
+            </wp:cNvGraphicFramePr>
+            <a:graphic xmlns:a="http://schemas.openxmlformats.org/drawingml/2006/main">
+              <a:graphicData uri="http://schemas.openxmlformats.org/drawingml/2006/picture">
+                <pic:pic xmlns:pic="http://schemas.openxmlformats.org/drawingml/2006/picture">
+                  <pic:nvPicPr>
+                    <pic:cNvPr id="1368895808" name="Picture 1368895808"/>
+                    <pic:cNvPicPr/>
+                  </pic:nvPicPr>
+                  <pic:blipFill>
+                    <a:blip r:embed="rId14" cstate="print">
+                      <a:extLst>
+                        <a:ext uri="{28A0092B-C50C-407E-A947-70E740481C1C}">
+                          <a14:useLocalDpi xmlns:a14="http://schemas.microsoft.com/office/drawing/2010/main" val="0"/>
+                        </a:ext>
+                      </a:extLst>
+                    </a:blip>
+                    <a:stretch>
+                      <a:fillRect/>
+                    </a:stretch>
+                  </pic:blipFill>
+                  <pic:spPr>
+                    <a:xfrm>
+                      <a:off x="0" y="0"/>
+                      <a:ext cx="5943600" cy="3343275"/>
+                    </a:xfrm>
+                    <a:prstGeom prst="rect">
+                      <a:avLst/>
+                    </a:prstGeom>
+                  </pic:spPr>
+                </pic:pic>
+              </a:graphicData>
+            </a:graphic>
+          </wp:inline>
+        </w:drawing>
+      </w:r>
+    </w:p>
+    <w:p>
+      <w:pPr>
+        <w:rPr>
+          <w:rFonts w:ascii="Times New Roman" w:hAnsi="Times New Roman" w:cs="Times New Roman"/>
+          <w:sz w:val="32"/>
+          <w:szCs w:val="32"/>
+        </w:rPr>
+      </w:pPr>
+      <w:r>
+        <w:rPr>
+          <w:rFonts w:ascii="Times New Roman" w:hAnsi="Times New Roman" w:cs="Times New Roman"/>
+          <w:sz w:val="32"/>
+          <w:szCs w:val="32"/>
+        </w:rPr>
+        <w:br w:type="page"/>
+      </w:r>
+    </w:p>
+    <w:p>
+      <w:pPr>
+        <w:spacing w:line="240" w:lineRule="auto"/>
+        <w:rPr>
+          <w:rFonts w:ascii="Times New Roman" w:hAnsi="Times New Roman" w:cs="Times New Roman"/>
+          <w:b/>
+          <w:bCs/>
+          <w:noProof/>
+          <w:sz w:val="32"/>
+          <w:szCs w:val="32"/>
+        </w:rPr>
+      </w:pPr>
+      <w:r>
+        <w:rPr>
+          <w:rFonts w:ascii="Times New Roman" w:hAnsi="Times New Roman" w:cs="Times New Roman"/>
+          <w:b/>
+          <w:bCs/>
+          <w:sz w:val="32"/>
+          <w:szCs w:val="32"/>
+        </w:rPr>
+        <w:lastRenderedPageBreak/>
+        <w:t>9.Backlog</w:t>
+      </w:r>
+    </w:p>
+    <w:p>
+      <w:pPr>
+        <w:spacing w:line="240" w:lineRule="auto"/>
+        <w:rPr>
+          <w:rFonts w:ascii="Times New Roman" w:hAnsi="Times New Roman" w:cs="Times New Roman"/>
+          <w:noProof/>
+          <w:sz w:val="32"/>
+          <w:szCs w:val="32"/>
+        </w:rPr>
+      </w:pPr>
+      <w:r>
+        <w:rPr>
+          <w:rFonts w:ascii="Times New Roman" w:hAnsi="Times New Roman" w:cs="Times New Roman"/>
+          <w:noProof/>
+          <w:sz w:val="32"/>
+          <w:szCs w:val="32"/>
+        </w:rPr>
+        <w:drawing>
+          <wp:inline distT="0" distB="0" distL="0" distR="0" wp14:anchorId="21D89E4D" wp14:editId="7FE41169">
+            <wp:extent cx="5943600" cy="3343275"/>
+            <wp:effectExtent l="0" t="0" r="0" b="9525"/>
+            <wp:docPr id="815707060" name="Picture 16"/>
+            <wp:cNvGraphicFramePr>
+              <a:graphicFrameLocks xmlns:a="http://schemas.openxmlformats.org/drawingml/2006/main" noChangeAspect="1"/>
+            </wp:cNvGraphicFramePr>
+            <a:graphic xmlns:a="http://schemas.openxmlformats.org/drawingml/2006/main">
+              <a:graphicData uri="http://schemas.openxmlformats.org/drawingml/2006/picture">
+                <pic:pic xmlns:pic="http://schemas.openxmlformats.org/drawingml/2006/picture">
+                  <pic:nvPicPr>
+                    <pic:cNvPr id="815707060" name="Picture 815707060"/>
+                    <pic:cNvPicPr/>
+                  </pic:nvPicPr>
+                  <pic:blipFill>
+                    <a:blip r:embed="rId15" cstate="print">
+                      <a:extLst>
+                        <a:ext uri="{28A0092B-C50C-407E-A947-70E740481C1C}">
+                          <a14:useLocalDpi xmlns:a14="http://schemas.microsoft.com/office/drawing/2010/main" val="0"/>
+                        </a:ext>
+                      </a:extLst>
+                    </a:blip>
+                    <a:stretch>
+                      <a:fillRect/>
+                    </a:stretch>
+                  </pic:blipFill>
+                  <pic:spPr>
+                    <a:xfrm>
+                      <a:off x="0" y="0"/>
+                      <a:ext cx="5943600" cy="3343275"/>
+                    </a:xfrm>
+                    <a:prstGeom prst="rect">
+                      <a:avLst/>
+                    </a:prstGeom>
+                  </pic:spPr>
+                </pic:pic>
+              </a:graphicData>
+            </a:graphic>
+          </wp:inline>
+        </w:drawing>
+      </w:r>
+    </w:p>
+    <w:p>
+      <w:pPr>
+        <w:spacing w:line="240" w:lineRule="auto"/>
+        <w:rPr>
+          <w:rFonts w:ascii="Times New Roman" w:hAnsi="Times New Roman" w:cs="Times New Roman"/>
+          <w:noProof/>
+          <w:sz w:val="32"/>
+          <w:szCs w:val="32"/>
+        </w:rPr>
+      </w:pPr>
+    </w:p>
+    <w:p>
+      <w:pPr>
+        <w:spacing w:line="240" w:lineRule="auto"/>
+        <w:rPr>
+          <w:rFonts w:ascii="Times New Roman" w:hAnsi="Times New Roman" w:cs="Times New Roman"/>
+          <w:sz w:val="32"/>
+          <w:szCs w:val="32"/>
+        </w:rPr>
+      </w:pPr>
+      <w:r>
+        <w:rPr>
+          <w:rFonts w:ascii="Times New Roman" w:hAnsi="Times New Roman" w:cs="Times New Roman"/>
+          <w:noProof/>
+          <w:sz w:val="32"/>
+          <w:szCs w:val="32"/>
+        </w:rPr>
+        <w:drawing>
+          <wp:inline distT="0" distB="0" distL="0" distR="0" wp14:anchorId="15315CE0" wp14:editId="5A0BD39A">
+            <wp:extent cx="5951792" cy="3347884"/>
+            <wp:effectExtent l="0" t="0" r="0" b="5080"/>
+            <wp:docPr id="1709698587" name="Picture 13"/>
+            <wp:cNvGraphicFramePr>
+              <a:graphicFrameLocks xmlns:a="http://schemas.openxmlformats.org/drawingml/2006/main" noChangeAspect="1"/>
+            </wp:cNvGraphicFramePr>
+            <a:graphic xmlns:a="http://schemas.openxmlformats.org/drawingml/2006/main">
+              <a:graphicData uri="http://schemas.openxmlformats.org/drawingml/2006/picture">
+                <pic:pic xmlns:pic="http://schemas.openxmlformats.org/drawingml/2006/picture">
+                  <pic:nvPicPr>
+                    <pic:cNvPr id="1709698587" name="Picture 1709698587"/>
+                    <pic:cNvPicPr/>
+                  </pic:nvPicPr>
+                  <pic:blipFill>
+                    <a:blip r:embed="rId16" cstate="print">
+                      <a:extLst>
+                        <a:ext uri="{28A0092B-C50C-407E-A947-70E740481C1C}">
+                          <a14:useLocalDpi xmlns:a14="http://schemas.microsoft.com/office/drawing/2010/main" val="0"/>
+                        </a:ext>
+                      </a:extLst>
+                    </a:blip>
+                    <a:stretch>
+                      <a:fillRect/>
+                    </a:stretch>
+                  </pic:blipFill>
+                  <pic:spPr>
+                    <a:xfrm>
+                      <a:off x="0" y="0"/>
+                      <a:ext cx="5976380" cy="3361715"/>
+                    </a:xfrm>
+                    <a:prstGeom prst="rect">
+                      <a:avLst/>
+                    </a:prstGeom>
+                  </pic:spPr>
+                </pic:pic>
+              </a:graphicData>
+            </a:graphic>
+          </wp:inline>
+        </w:drawing>
+      </w:r>
+    </w:p>
+    <w:p>
+      <w:pPr>
+        <w:spacing w:line="240" w:lineRule="auto"/>
+        <w:rPr>
+          <w:rFonts w:ascii="Times New Roman" w:hAnsi="Times New Roman" w:cs="Times New Roman"/>
+          <w:sz w:val="32"/>
+          <w:szCs w:val="32"/>
+        </w:rPr>
+      </w:pPr>
+    </w:p>
+    <w:p>
+      <w:pPr>
+        <w:spacing w:line="240" w:lineRule="auto"/>
+        <w:rPr>
+          <w:rFonts w:ascii="Times New Roman" w:hAnsi="Times New Roman" w:cs="Times New Roman"/>
+          <w:sz w:val="32"/>
+          <w:szCs w:val="32"/>
+        </w:rPr>
+      </w:pPr>
+      <w:r>
+        <w:rPr>
+          <w:rFonts w:ascii="Times New Roman" w:hAnsi="Times New Roman" w:cs="Times New Roman"/>
+          <w:noProof/>
+          <w:sz w:val="32"/>
+          <w:szCs w:val="32"/>
+        </w:rPr>
+        <w:lastRenderedPageBreak/>
+        <w:drawing>
+          <wp:inline distT="0" distB="0" distL="0" distR="0" wp14:anchorId="32600562" wp14:editId="77BAF311">
+            <wp:extent cx="5943600" cy="3343275"/>
+            <wp:effectExtent l="0" t="0" r="0" b="9525"/>
+            <wp:docPr id="634381669" name="Picture 12"/>
+            <wp:cNvGraphicFramePr>
+              <a:graphicFrameLocks xmlns:a="http://schemas.openxmlformats.org/drawingml/2006/main" noChangeAspect="1"/>
+            </wp:cNvGraphicFramePr>
+            <a:graphic xmlns:a="http://schemas.openxmlformats.org/drawingml/2006/main">
+              <a:graphicData uri="http://schemas.openxmlformats.org/drawingml/2006/picture">
+                <pic:pic xmlns:pic="http://schemas.openxmlformats.org/drawingml/2006/picture">
+                  <pic:nvPicPr>
+                    <pic:cNvPr id="634381669" name="Picture 634381669"/>
+                    <pic:cNvPicPr/>
+                  </pic:nvPicPr>
+                  <pic:blipFill>
+                    <a:blip r:embed="rId17" cstate="print">
+                      <a:extLst>
+                        <a:ext uri="{28A0092B-C50C-407E-A947-70E740481C1C}">
+                          <a14:useLocalDpi xmlns:a14="http://schemas.microsoft.com/office/drawing/2010/main" val="0"/>
+                        </a:ext>
+                      </a:extLst>
+                    </a:blip>
+                    <a:stretch>
+                      <a:fillRect/>
+                    </a:stretch>
+                  </pic:blipFill>
+                  <pic:spPr>
+                    <a:xfrm>
+                      <a:off x="0" y="0"/>
+                      <a:ext cx="5943600" cy="3343275"/>
+                    </a:xfrm>
+                    <a:prstGeom prst="rect">
+                      <a:avLst/>
+                    </a:prstGeom>
+                  </pic:spPr>
+                </pic:pic>
+              </a:graphicData>
+            </a:graphic>
+          </wp:inline>
+        </w:drawing>
+      </w:r>
+    </w:p>
+    <w:p>
+      <w:pPr>
+        <w:spacing w:line="240" w:lineRule="auto"/>
+        <w:rPr>
+          <w:rFonts w:ascii="Times New Roman" w:hAnsi="Times New Roman" w:cs="Times New Roman"/>
+          <w:sz w:val="32"/>
+          <w:szCs w:val="32"/>
+        </w:rPr>
+      </w:pPr>
     </w:p>
     <w:sectPr>
-      <w:footerReference w:type="default" r:id="rId12"/>
+      <w:footerReference w:type="default" r:id="rId18"/>
       <w:pgSz w:w="12240" w:h="15840"/>
       <w:pgMar w:top="1440" w:right="1440" w:bottom="1440" w:left="1440" w:header="720" w:footer="720" w:gutter="0"/>
       <w:cols w:space="720"/>

</xml_diff>

<commit_message>
Updated to Version 1.3
</commit_message>
<xml_diff>
--- a/Nammathao_CIS4374_Project.docx
+++ b/Nammathao_CIS4374_Project.docx
@@ -1283,7 +1283,7 @@
         <w:rPr>
           <w:rFonts w:ascii="Times New Roman" w:hAnsi="Times New Roman" w:cs="Times New Roman"/>
         </w:rPr>
-        <w:t>2</w:t>
+        <w:t>3</w:t>
       </w:r>
     </w:p>
     <w:p>
@@ -1304,13 +1304,19 @@
         <w:rPr>
           <w:rFonts w:ascii="Times New Roman" w:hAnsi="Times New Roman" w:cs="Times New Roman"/>
         </w:rPr>
-        <w:t>09.</w:t>
-      </w:r>
-      <w:r>
-        <w:rPr>
-          <w:rFonts w:ascii="Times New Roman" w:hAnsi="Times New Roman" w:cs="Times New Roman"/>
-        </w:rPr>
-        <w:t>24</w:t>
+        <w:t>10</w:t>
+      </w:r>
+      <w:r>
+        <w:rPr>
+          <w:rFonts w:ascii="Times New Roman" w:hAnsi="Times New Roman" w:cs="Times New Roman"/>
+        </w:rPr>
+        <w:t>.</w:t>
+      </w:r>
+      <w:r>
+        <w:rPr>
+          <w:rFonts w:ascii="Times New Roman" w:hAnsi="Times New Roman" w:cs="Times New Roman"/>
+        </w:rPr>
+        <w:t>01</w:t>
       </w:r>
       <w:r>
         <w:rPr>
@@ -7888,6 +7894,2445 @@
           <w:rFonts w:ascii="Times New Roman" w:hAnsi="Times New Roman" w:cs="Times New Roman"/>
           <w:sz w:val="32"/>
           <w:szCs w:val="32"/>
+        </w:rPr>
+      </w:pPr>
+    </w:p>
+    <w:p>
+      <w:pPr>
+        <w:spacing w:line="240" w:lineRule="auto"/>
+        <w:rPr>
+          <w:rFonts w:ascii="Times New Roman" w:hAnsi="Times New Roman" w:cs="Times New Roman"/>
+          <w:b/>
+          <w:bCs/>
+          <w:sz w:val="32"/>
+          <w:szCs w:val="32"/>
+        </w:rPr>
+      </w:pPr>
+      <w:r>
+        <w:rPr>
+          <w:rFonts w:ascii="Times New Roman" w:hAnsi="Times New Roman" w:cs="Times New Roman"/>
+          <w:b/>
+          <w:bCs/>
+          <w:sz w:val="32"/>
+          <w:szCs w:val="32"/>
+        </w:rPr>
+        <w:t>10.</w:t>
+      </w:r>
+      <w:r>
+        <w:rPr>
+          <w:rFonts w:ascii="Times New Roman" w:hAnsi="Times New Roman" w:cs="Times New Roman"/>
+          <w:b/>
+          <w:bCs/>
+          <w:sz w:val="32"/>
+          <w:szCs w:val="32"/>
+        </w:rPr>
+        <w:t>Risk Management List</w:t>
+      </w:r>
+    </w:p>
+    <w:p>
+      <w:pPr>
+        <w:spacing w:line="240" w:lineRule="auto"/>
+        <w:rPr>
+          <w:rFonts w:ascii="Times New Roman" w:hAnsi="Times New Roman" w:cs="Times New Roman"/>
+        </w:rPr>
+      </w:pPr>
+      <w:r>
+        <w:rPr>
+          <w:rFonts w:ascii="Times New Roman" w:hAnsi="Times New Roman" w:cs="Times New Roman"/>
+        </w:rPr>
+        <w:t>Technical Risks:</w:t>
+      </w:r>
+    </w:p>
+    <w:p>
+      <w:pPr>
+        <w:pStyle w:val="ListParagraph"/>
+        <w:numPr>
+          <w:ilvl w:val="0"/>
+          <w:numId w:val="12"/>
+        </w:numPr>
+        <w:spacing w:line="240" w:lineRule="auto"/>
+        <w:rPr>
+          <w:rFonts w:ascii="Times New Roman" w:hAnsi="Times New Roman" w:cs="Times New Roman"/>
+        </w:rPr>
+      </w:pPr>
+      <w:r>
+        <w:rPr>
+          <w:rFonts w:ascii="Times New Roman" w:hAnsi="Times New Roman" w:cs="Times New Roman"/>
+        </w:rPr>
+        <w:t>Incomplete or Incorrect Software Requirements</w:t>
+      </w:r>
+    </w:p>
+    <w:p>
+      <w:pPr>
+        <w:pStyle w:val="ListParagraph"/>
+        <w:numPr>
+          <w:ilvl w:val="0"/>
+          <w:numId w:val="12"/>
+        </w:numPr>
+        <w:spacing w:line="240" w:lineRule="auto"/>
+        <w:rPr>
+          <w:rFonts w:ascii="Times New Roman" w:hAnsi="Times New Roman" w:cs="Times New Roman"/>
+        </w:rPr>
+      </w:pPr>
+      <w:r>
+        <w:rPr>
+          <w:rFonts w:ascii="Times New Roman" w:hAnsi="Times New Roman" w:cs="Times New Roman"/>
+        </w:rPr>
+        <w:t>Device Compatability with Application</w:t>
+      </w:r>
+    </w:p>
+    <w:p>
+      <w:pPr>
+        <w:pStyle w:val="ListParagraph"/>
+        <w:numPr>
+          <w:ilvl w:val="0"/>
+          <w:numId w:val="12"/>
+        </w:numPr>
+        <w:spacing w:line="240" w:lineRule="auto"/>
+        <w:rPr>
+          <w:rFonts w:ascii="Times New Roman" w:hAnsi="Times New Roman" w:cs="Times New Roman"/>
+        </w:rPr>
+      </w:pPr>
+      <w:r>
+        <w:rPr>
+          <w:rFonts w:ascii="Times New Roman" w:hAnsi="Times New Roman" w:cs="Times New Roman"/>
+        </w:rPr>
+        <w:t>Incorrect Data Format</w:t>
+      </w:r>
+      <w:r>
+        <w:rPr>
+          <w:rFonts w:ascii="Times New Roman" w:hAnsi="Times New Roman" w:cs="Times New Roman"/>
+        </w:rPr>
+        <w:t>s</w:t>
+      </w:r>
+    </w:p>
+    <w:p>
+      <w:pPr>
+        <w:pStyle w:val="ListParagraph"/>
+        <w:numPr>
+          <w:ilvl w:val="0"/>
+          <w:numId w:val="12"/>
+        </w:numPr>
+        <w:spacing w:line="240" w:lineRule="auto"/>
+        <w:rPr>
+          <w:rFonts w:ascii="Times New Roman" w:hAnsi="Times New Roman" w:cs="Times New Roman"/>
+        </w:rPr>
+      </w:pPr>
+      <w:r>
+        <w:rPr>
+          <w:rFonts w:ascii="Times New Roman" w:hAnsi="Times New Roman" w:cs="Times New Roman"/>
+        </w:rPr>
+        <w:t>Outdated/Exposed API</w:t>
+      </w:r>
+      <w:r>
+        <w:rPr>
+          <w:rFonts w:ascii="Times New Roman" w:hAnsi="Times New Roman" w:cs="Times New Roman"/>
+        </w:rPr>
+        <w:t xml:space="preserve"> Connection to Third-Party Applications</w:t>
+      </w:r>
+    </w:p>
+    <w:p>
+      <w:pPr>
+        <w:spacing w:line="240" w:lineRule="auto"/>
+        <w:rPr>
+          <w:rFonts w:ascii="Times New Roman" w:hAnsi="Times New Roman" w:cs="Times New Roman"/>
+        </w:rPr>
+      </w:pPr>
+      <w:r>
+        <w:rPr>
+          <w:rFonts w:ascii="Times New Roman" w:hAnsi="Times New Roman" w:cs="Times New Roman"/>
+        </w:rPr>
+        <w:t>Schedule Risks:</w:t>
+      </w:r>
+    </w:p>
+    <w:p>
+      <w:pPr>
+        <w:pStyle w:val="ListParagraph"/>
+        <w:numPr>
+          <w:ilvl w:val="0"/>
+          <w:numId w:val="12"/>
+        </w:numPr>
+        <w:spacing w:line="240" w:lineRule="auto"/>
+        <w:rPr>
+          <w:rFonts w:ascii="Times New Roman" w:hAnsi="Times New Roman" w:cs="Times New Roman"/>
+        </w:rPr>
+      </w:pPr>
+      <w:r>
+        <w:rPr>
+          <w:rFonts w:ascii="Times New Roman" w:hAnsi="Times New Roman" w:cs="Times New Roman"/>
+        </w:rPr>
+        <w:t>Holiday</w:t>
+      </w:r>
+      <w:r>
+        <w:rPr>
+          <w:rFonts w:ascii="Times New Roman" w:hAnsi="Times New Roman" w:cs="Times New Roman"/>
+        </w:rPr>
+        <w:t xml:space="preserve">/Vacation </w:t>
+      </w:r>
+      <w:r>
+        <w:rPr>
+          <w:rFonts w:ascii="Times New Roman" w:hAnsi="Times New Roman" w:cs="Times New Roman"/>
+        </w:rPr>
+        <w:t>Resu</w:t>
+      </w:r>
+      <w:r>
+        <w:rPr>
+          <w:rFonts w:ascii="Times New Roman" w:hAnsi="Times New Roman" w:cs="Times New Roman"/>
+        </w:rPr>
+        <w:t>lting in Developer Unavailability</w:t>
+      </w:r>
+    </w:p>
+    <w:p>
+      <w:pPr>
+        <w:pStyle w:val="ListParagraph"/>
+        <w:numPr>
+          <w:ilvl w:val="0"/>
+          <w:numId w:val="12"/>
+        </w:numPr>
+        <w:spacing w:line="240" w:lineRule="auto"/>
+        <w:rPr>
+          <w:rFonts w:ascii="Times New Roman" w:hAnsi="Times New Roman" w:cs="Times New Roman"/>
+        </w:rPr>
+      </w:pPr>
+      <w:r>
+        <w:rPr>
+          <w:rFonts w:ascii="Times New Roman" w:hAnsi="Times New Roman" w:cs="Times New Roman"/>
+        </w:rPr>
+        <w:t>Natural Disasters</w:t>
+      </w:r>
+      <w:r>
+        <w:rPr>
+          <w:rFonts w:ascii="Times New Roman" w:hAnsi="Times New Roman" w:cs="Times New Roman"/>
+        </w:rPr>
+        <w:t xml:space="preserve"> Causing Project Delays</w:t>
+      </w:r>
+    </w:p>
+    <w:p>
+      <w:pPr>
+        <w:pStyle w:val="ListParagraph"/>
+        <w:numPr>
+          <w:ilvl w:val="0"/>
+          <w:numId w:val="12"/>
+        </w:numPr>
+        <w:spacing w:line="240" w:lineRule="auto"/>
+        <w:rPr>
+          <w:rFonts w:ascii="Times New Roman" w:hAnsi="Times New Roman" w:cs="Times New Roman"/>
+        </w:rPr>
+      </w:pPr>
+      <w:r>
+        <w:rPr>
+          <w:rFonts w:ascii="Times New Roman" w:hAnsi="Times New Roman" w:cs="Times New Roman"/>
+        </w:rPr>
+        <w:t>S</w:t>
+      </w:r>
+      <w:r>
+        <w:rPr>
+          <w:rFonts w:ascii="Times New Roman" w:hAnsi="Times New Roman" w:cs="Times New Roman"/>
+        </w:rPr>
+        <w:t>taff Unavailability from Sick Leave</w:t>
+      </w:r>
+    </w:p>
+    <w:p>
+      <w:pPr>
+        <w:pStyle w:val="ListParagraph"/>
+        <w:numPr>
+          <w:ilvl w:val="0"/>
+          <w:numId w:val="12"/>
+        </w:numPr>
+        <w:spacing w:line="240" w:lineRule="auto"/>
+        <w:rPr>
+          <w:rFonts w:ascii="Times New Roman" w:hAnsi="Times New Roman" w:cs="Times New Roman"/>
+        </w:rPr>
+      </w:pPr>
+      <w:r>
+        <w:rPr>
+          <w:rFonts w:ascii="Times New Roman" w:hAnsi="Times New Roman" w:cs="Times New Roman"/>
+        </w:rPr>
+        <w:t>Missed Deadlines Causing Scheduling</w:t>
+      </w:r>
+      <w:r>
+        <w:rPr>
+          <w:rFonts w:ascii="Times New Roman" w:hAnsi="Times New Roman" w:cs="Times New Roman"/>
+        </w:rPr>
+        <w:t xml:space="preserve"> Delays</w:t>
+      </w:r>
+    </w:p>
+    <w:p>
+      <w:pPr>
+        <w:spacing w:line="240" w:lineRule="auto"/>
+        <w:rPr>
+          <w:rFonts w:ascii="Times New Roman" w:hAnsi="Times New Roman" w:cs="Times New Roman"/>
+        </w:rPr>
+      </w:pPr>
+      <w:r>
+        <w:rPr>
+          <w:rFonts w:ascii="Times New Roman" w:hAnsi="Times New Roman" w:cs="Times New Roman"/>
+        </w:rPr>
+        <w:t>Financial Risks:</w:t>
+      </w:r>
+    </w:p>
+    <w:p>
+      <w:pPr>
+        <w:pStyle w:val="ListParagraph"/>
+        <w:numPr>
+          <w:ilvl w:val="0"/>
+          <w:numId w:val="12"/>
+        </w:numPr>
+        <w:spacing w:line="240" w:lineRule="auto"/>
+        <w:rPr>
+          <w:rFonts w:ascii="Times New Roman" w:hAnsi="Times New Roman" w:cs="Times New Roman"/>
+        </w:rPr>
+      </w:pPr>
+      <w:r>
+        <w:rPr>
+          <w:rFonts w:ascii="Times New Roman" w:hAnsi="Times New Roman" w:cs="Times New Roman"/>
+        </w:rPr>
+        <w:t>Service Outage Costs</w:t>
+      </w:r>
+    </w:p>
+    <w:p>
+      <w:pPr>
+        <w:pStyle w:val="ListParagraph"/>
+        <w:numPr>
+          <w:ilvl w:val="0"/>
+          <w:numId w:val="12"/>
+        </w:numPr>
+        <w:spacing w:line="240" w:lineRule="auto"/>
+        <w:rPr>
+          <w:rFonts w:ascii="Times New Roman" w:hAnsi="Times New Roman" w:cs="Times New Roman"/>
+        </w:rPr>
+      </w:pPr>
+      <w:r>
+        <w:rPr>
+          <w:rFonts w:ascii="Times New Roman" w:hAnsi="Times New Roman" w:cs="Times New Roman"/>
+        </w:rPr>
+        <w:t xml:space="preserve">Application </w:t>
+      </w:r>
+      <w:r>
+        <w:rPr>
+          <w:rFonts w:ascii="Times New Roman" w:hAnsi="Times New Roman" w:cs="Times New Roman"/>
+        </w:rPr>
+        <w:t>Maintenance Costs</w:t>
+      </w:r>
+    </w:p>
+    <w:p>
+      <w:pPr>
+        <w:pStyle w:val="ListParagraph"/>
+        <w:numPr>
+          <w:ilvl w:val="0"/>
+          <w:numId w:val="12"/>
+        </w:numPr>
+        <w:spacing w:line="240" w:lineRule="auto"/>
+        <w:rPr>
+          <w:rFonts w:ascii="Times New Roman" w:hAnsi="Times New Roman" w:cs="Times New Roman"/>
+        </w:rPr>
+      </w:pPr>
+      <w:r>
+        <w:rPr>
+          <w:rFonts w:ascii="Times New Roman" w:hAnsi="Times New Roman" w:cs="Times New Roman"/>
+        </w:rPr>
+        <w:t xml:space="preserve">Costs of Repair after a </w:t>
+      </w:r>
+      <w:r>
+        <w:rPr>
+          <w:rFonts w:ascii="Times New Roman" w:hAnsi="Times New Roman" w:cs="Times New Roman"/>
+        </w:rPr>
+        <w:t>Natural Disaster</w:t>
+      </w:r>
+    </w:p>
+    <w:p>
+      <w:pPr>
+        <w:pStyle w:val="ListParagraph"/>
+        <w:numPr>
+          <w:ilvl w:val="0"/>
+          <w:numId w:val="12"/>
+        </w:numPr>
+        <w:spacing w:line="240" w:lineRule="auto"/>
+        <w:rPr>
+          <w:rFonts w:ascii="Times New Roman" w:hAnsi="Times New Roman" w:cs="Times New Roman"/>
+        </w:rPr>
+      </w:pPr>
+      <w:r>
+        <w:rPr>
+          <w:rFonts w:ascii="Times New Roman" w:hAnsi="Times New Roman" w:cs="Times New Roman"/>
+        </w:rPr>
+        <w:t xml:space="preserve">Financial Loss from </w:t>
+      </w:r>
+      <w:r>
+        <w:rPr>
+          <w:rFonts w:ascii="Times New Roman" w:hAnsi="Times New Roman" w:cs="Times New Roman"/>
+        </w:rPr>
+        <w:t>Third-Party Parking Payment Failure</w:t>
+      </w:r>
+      <w:r>
+        <w:rPr>
+          <w:rFonts w:ascii="Times New Roman" w:hAnsi="Times New Roman" w:cs="Times New Roman"/>
+        </w:rPr>
+        <w:t>s</w:t>
+      </w:r>
+    </w:p>
+    <w:p>
+      <w:pPr>
+        <w:spacing w:line="240" w:lineRule="auto"/>
+        <w:rPr>
+          <w:rFonts w:ascii="Times New Roman" w:hAnsi="Times New Roman" w:cs="Times New Roman"/>
+        </w:rPr>
+      </w:pPr>
+      <w:proofErr w:type="gramStart"/>
+      <w:r>
+        <w:rPr>
+          <w:rFonts w:ascii="Times New Roman" w:hAnsi="Times New Roman" w:cs="Times New Roman"/>
+        </w:rPr>
+        <w:t>People</w:t>
+      </w:r>
+      <w:proofErr w:type="gramEnd"/>
+      <w:r>
+        <w:rPr>
+          <w:rFonts w:ascii="Times New Roman" w:hAnsi="Times New Roman" w:cs="Times New Roman"/>
+        </w:rPr>
+        <w:t xml:space="preserve"> Risks:</w:t>
+      </w:r>
+    </w:p>
+    <w:p>
+      <w:pPr>
+        <w:pStyle w:val="ListParagraph"/>
+        <w:numPr>
+          <w:ilvl w:val="0"/>
+          <w:numId w:val="12"/>
+        </w:numPr>
+        <w:spacing w:line="240" w:lineRule="auto"/>
+        <w:rPr>
+          <w:rFonts w:ascii="Times New Roman" w:hAnsi="Times New Roman" w:cs="Times New Roman"/>
+        </w:rPr>
+      </w:pPr>
+      <w:r>
+        <w:rPr>
+          <w:rFonts w:ascii="Times New Roman" w:hAnsi="Times New Roman" w:cs="Times New Roman"/>
+        </w:rPr>
+        <w:t>Insufficient Parking Operator Traini</w:t>
+      </w:r>
+      <w:r>
+        <w:rPr>
+          <w:rFonts w:ascii="Times New Roman" w:hAnsi="Times New Roman" w:cs="Times New Roman"/>
+        </w:rPr>
+        <w:t>ng</w:t>
+      </w:r>
+    </w:p>
+    <w:p>
+      <w:pPr>
+        <w:pStyle w:val="ListParagraph"/>
+        <w:numPr>
+          <w:ilvl w:val="0"/>
+          <w:numId w:val="12"/>
+        </w:numPr>
+        <w:spacing w:line="240" w:lineRule="auto"/>
+        <w:rPr>
+          <w:rFonts w:ascii="Times New Roman" w:hAnsi="Times New Roman" w:cs="Times New Roman"/>
+        </w:rPr>
+      </w:pPr>
+      <w:r>
+        <w:rPr>
+          <w:rFonts w:ascii="Times New Roman" w:hAnsi="Times New Roman" w:cs="Times New Roman"/>
+        </w:rPr>
+        <w:t>Users with Lack of Technical Knowledge</w:t>
+      </w:r>
+    </w:p>
+    <w:p>
+      <w:pPr>
+        <w:pStyle w:val="ListParagraph"/>
+        <w:numPr>
+          <w:ilvl w:val="0"/>
+          <w:numId w:val="12"/>
+        </w:numPr>
+        <w:spacing w:line="240" w:lineRule="auto"/>
+        <w:rPr>
+          <w:rFonts w:ascii="Times New Roman" w:hAnsi="Times New Roman" w:cs="Times New Roman"/>
+        </w:rPr>
+      </w:pPr>
+      <w:r>
+        <w:rPr>
+          <w:rFonts w:ascii="Times New Roman" w:hAnsi="Times New Roman" w:cs="Times New Roman"/>
+        </w:rPr>
+        <w:lastRenderedPageBreak/>
+        <w:t xml:space="preserve">Loss </w:t>
+      </w:r>
+      <w:r>
+        <w:rPr>
+          <w:rFonts w:ascii="Times New Roman" w:hAnsi="Times New Roman" w:cs="Times New Roman"/>
+        </w:rPr>
+        <w:t>of Experienced Knowledge in App Development</w:t>
+      </w:r>
+    </w:p>
+    <w:p>
+      <w:pPr>
+        <w:pStyle w:val="ListParagraph"/>
+        <w:numPr>
+          <w:ilvl w:val="0"/>
+          <w:numId w:val="12"/>
+        </w:numPr>
+        <w:spacing w:line="240" w:lineRule="auto"/>
+        <w:rPr>
+          <w:rFonts w:ascii="Times New Roman" w:hAnsi="Times New Roman" w:cs="Times New Roman"/>
+        </w:rPr>
+      </w:pPr>
+      <w:r>
+        <w:rPr>
+          <w:rFonts w:ascii="Times New Roman" w:hAnsi="Times New Roman" w:cs="Times New Roman"/>
+        </w:rPr>
+        <w:t xml:space="preserve">Stakeholders </w:t>
+      </w:r>
+      <w:r>
+        <w:rPr>
+          <w:rFonts w:ascii="Times New Roman" w:hAnsi="Times New Roman" w:cs="Times New Roman"/>
+        </w:rPr>
+        <w:t>Requesting Additional Functionality</w:t>
+      </w:r>
+    </w:p>
+    <w:p>
+      <w:pPr>
+        <w:spacing w:line="240" w:lineRule="auto"/>
+        <w:rPr>
+          <w:rFonts w:ascii="Times New Roman" w:hAnsi="Times New Roman" w:cs="Times New Roman"/>
+        </w:rPr>
+      </w:pPr>
+    </w:p>
+    <w:p>
+      <w:pPr>
+        <w:spacing w:line="240" w:lineRule="auto"/>
+        <w:rPr>
+          <w:rFonts w:ascii="Times New Roman" w:hAnsi="Times New Roman" w:cs="Times New Roman"/>
+          <w:b/>
+          <w:bCs/>
+          <w:sz w:val="32"/>
+          <w:szCs w:val="32"/>
+        </w:rPr>
+      </w:pPr>
+      <w:r>
+        <w:rPr>
+          <w:rFonts w:ascii="Times New Roman" w:hAnsi="Times New Roman" w:cs="Times New Roman"/>
+          <w:b/>
+          <w:bCs/>
+          <w:sz w:val="32"/>
+          <w:szCs w:val="32"/>
+        </w:rPr>
+        <w:t>11.Risk Register</w:t>
+      </w:r>
+    </w:p>
+    <w:tbl>
+      <w:tblPr>
+        <w:tblStyle w:val="TableGrid"/>
+        <w:tblW w:w="0" w:type="auto"/>
+        <w:tblLook w:val="04A0" w:firstRow="1" w:lastRow="0" w:firstColumn="1" w:lastColumn="0" w:noHBand="0" w:noVBand="1"/>
+      </w:tblPr>
+      <w:tblGrid>
+        <w:gridCol w:w="542"/>
+        <w:gridCol w:w="1600"/>
+        <w:gridCol w:w="1290"/>
+        <w:gridCol w:w="1030"/>
+        <w:gridCol w:w="1522"/>
+        <w:gridCol w:w="1643"/>
+        <w:gridCol w:w="1723"/>
+      </w:tblGrid>
+      <w:tr>
+        <w:tc>
+          <w:tcPr>
+            <w:tcW w:w="771" w:type="dxa"/>
+          </w:tcPr>
+          <w:p>
+            <w:pPr>
+              <w:jc w:val="center"/>
+              <w:rPr>
+                <w:rFonts w:ascii="Times New Roman" w:hAnsi="Times New Roman" w:cs="Times New Roman"/>
+              </w:rPr>
+            </w:pPr>
+            <w:r>
+              <w:rPr>
+                <w:rFonts w:ascii="Times New Roman" w:hAnsi="Times New Roman" w:cs="Times New Roman"/>
+              </w:rPr>
+              <w:t>ID</w:t>
+            </w:r>
+          </w:p>
+        </w:tc>
+        <w:tc>
+          <w:tcPr>
+            <w:tcW w:w="1633" w:type="dxa"/>
+          </w:tcPr>
+          <w:p>
+            <w:pPr>
+              <w:jc w:val="center"/>
+              <w:rPr>
+                <w:rFonts w:ascii="Times New Roman" w:hAnsi="Times New Roman" w:cs="Times New Roman"/>
+              </w:rPr>
+            </w:pPr>
+            <w:r>
+              <w:rPr>
+                <w:rFonts w:ascii="Times New Roman" w:hAnsi="Times New Roman" w:cs="Times New Roman"/>
+              </w:rPr>
+              <w:t>Description</w:t>
+            </w:r>
+          </w:p>
+        </w:tc>
+        <w:tc>
+          <w:tcPr>
+            <w:tcW w:w="1314" w:type="dxa"/>
+          </w:tcPr>
+          <w:p>
+            <w:pPr>
+              <w:jc w:val="center"/>
+              <w:rPr>
+                <w:rFonts w:ascii="Times New Roman" w:hAnsi="Times New Roman" w:cs="Times New Roman"/>
+              </w:rPr>
+            </w:pPr>
+            <w:r>
+              <w:rPr>
+                <w:rFonts w:ascii="Times New Roman" w:hAnsi="Times New Roman" w:cs="Times New Roman"/>
+              </w:rPr>
+              <w:t>Probability</w:t>
+            </w:r>
+          </w:p>
+        </w:tc>
+        <w:tc>
+          <w:tcPr>
+            <w:tcW w:w="1030" w:type="dxa"/>
+          </w:tcPr>
+          <w:p>
+            <w:pPr>
+              <w:jc w:val="center"/>
+              <w:rPr>
+                <w:rFonts w:ascii="Times New Roman" w:hAnsi="Times New Roman" w:cs="Times New Roman"/>
+              </w:rPr>
+            </w:pPr>
+            <w:r>
+              <w:rPr>
+                <w:rFonts w:ascii="Times New Roman" w:hAnsi="Times New Roman" w:cs="Times New Roman"/>
+              </w:rPr>
+              <w:t>Impact</w:t>
+            </w:r>
+          </w:p>
+        </w:tc>
+        <w:tc>
+          <w:tcPr>
+            <w:tcW w:w="1293" w:type="dxa"/>
+          </w:tcPr>
+          <w:p>
+            <w:pPr>
+              <w:jc w:val="center"/>
+              <w:rPr>
+                <w:rFonts w:ascii="Times New Roman" w:hAnsi="Times New Roman" w:cs="Times New Roman"/>
+              </w:rPr>
+            </w:pPr>
+            <w:r>
+              <w:rPr>
+                <w:rFonts w:ascii="Times New Roman" w:hAnsi="Times New Roman" w:cs="Times New Roman"/>
+              </w:rPr>
+              <w:t>Owner</w:t>
+            </w:r>
+          </w:p>
+        </w:tc>
+        <w:tc>
+          <w:tcPr>
+            <w:tcW w:w="1586" w:type="dxa"/>
+          </w:tcPr>
+          <w:p>
+            <w:pPr>
+              <w:jc w:val="center"/>
+              <w:rPr>
+                <w:rFonts w:ascii="Times New Roman" w:hAnsi="Times New Roman" w:cs="Times New Roman"/>
+              </w:rPr>
+            </w:pPr>
+            <w:r>
+              <w:rPr>
+                <w:rFonts w:ascii="Times New Roman" w:hAnsi="Times New Roman" w:cs="Times New Roman"/>
+              </w:rPr>
+              <w:t>Re</w:t>
+            </w:r>
+            <w:r>
+              <w:rPr>
+                <w:rFonts w:ascii="Times New Roman" w:hAnsi="Times New Roman" w:cs="Times New Roman"/>
+              </w:rPr>
+              <w:t>sponse Strategy</w:t>
+            </w:r>
+          </w:p>
+        </w:tc>
+        <w:tc>
+          <w:tcPr>
+            <w:tcW w:w="1723" w:type="dxa"/>
+          </w:tcPr>
+          <w:p>
+            <w:pPr>
+              <w:jc w:val="center"/>
+              <w:rPr>
+                <w:rFonts w:ascii="Times New Roman" w:hAnsi="Times New Roman" w:cs="Times New Roman"/>
+              </w:rPr>
+            </w:pPr>
+            <w:r>
+              <w:rPr>
+                <w:rFonts w:ascii="Times New Roman" w:hAnsi="Times New Roman" w:cs="Times New Roman"/>
+              </w:rPr>
+              <w:t>Status/Notes</w:t>
+            </w:r>
+          </w:p>
+        </w:tc>
+      </w:tr>
+      <w:tr>
+        <w:tc>
+          <w:tcPr>
+            <w:tcW w:w="771" w:type="dxa"/>
+          </w:tcPr>
+          <w:p>
+            <w:pPr>
+              <w:jc w:val="center"/>
+              <w:rPr>
+                <w:rFonts w:ascii="Times New Roman" w:hAnsi="Times New Roman" w:cs="Times New Roman"/>
+              </w:rPr>
+            </w:pPr>
+            <w:r>
+              <w:rPr>
+                <w:rFonts w:ascii="Times New Roman" w:hAnsi="Times New Roman" w:cs="Times New Roman"/>
+              </w:rPr>
+              <w:t>R-01</w:t>
+            </w:r>
+          </w:p>
+        </w:tc>
+        <w:tc>
+          <w:tcPr>
+            <w:tcW w:w="1633" w:type="dxa"/>
+          </w:tcPr>
+          <w:p>
+            <w:pPr>
+              <w:jc w:val="center"/>
+              <w:rPr>
+                <w:rFonts w:ascii="Times New Roman" w:hAnsi="Times New Roman" w:cs="Times New Roman"/>
+              </w:rPr>
+            </w:pPr>
+            <w:r>
+              <w:rPr>
+                <w:rFonts w:ascii="Times New Roman" w:hAnsi="Times New Roman" w:cs="Times New Roman"/>
+              </w:rPr>
+              <w:t>Incorrect Data Formats</w:t>
+            </w:r>
+          </w:p>
+        </w:tc>
+        <w:tc>
+          <w:tcPr>
+            <w:tcW w:w="1314" w:type="dxa"/>
+          </w:tcPr>
+          <w:p>
+            <w:pPr>
+              <w:jc w:val="center"/>
+              <w:rPr>
+                <w:rFonts w:ascii="Times New Roman" w:hAnsi="Times New Roman" w:cs="Times New Roman"/>
+              </w:rPr>
+            </w:pPr>
+            <w:r>
+              <w:rPr>
+                <w:rFonts w:ascii="Times New Roman" w:hAnsi="Times New Roman" w:cs="Times New Roman"/>
+              </w:rPr>
+              <w:t>Low</w:t>
+            </w:r>
+          </w:p>
+        </w:tc>
+        <w:tc>
+          <w:tcPr>
+            <w:tcW w:w="1030" w:type="dxa"/>
+          </w:tcPr>
+          <w:p>
+            <w:pPr>
+              <w:jc w:val="center"/>
+              <w:rPr>
+                <w:rFonts w:ascii="Times New Roman" w:hAnsi="Times New Roman" w:cs="Times New Roman"/>
+              </w:rPr>
+            </w:pPr>
+            <w:r>
+              <w:rPr>
+                <w:rFonts w:ascii="Times New Roman" w:hAnsi="Times New Roman" w:cs="Times New Roman"/>
+              </w:rPr>
+              <w:t>Medium</w:t>
+            </w:r>
+          </w:p>
+        </w:tc>
+        <w:tc>
+          <w:tcPr>
+            <w:tcW w:w="1293" w:type="dxa"/>
+          </w:tcPr>
+          <w:p>
+            <w:pPr>
+              <w:jc w:val="center"/>
+              <w:rPr>
+                <w:rFonts w:ascii="Times New Roman" w:hAnsi="Times New Roman" w:cs="Times New Roman"/>
+              </w:rPr>
+            </w:pPr>
+            <w:r>
+              <w:rPr>
+                <w:rFonts w:ascii="Times New Roman" w:hAnsi="Times New Roman" w:cs="Times New Roman"/>
+              </w:rPr>
+              <w:t>Technical Lead</w:t>
+            </w:r>
+          </w:p>
+        </w:tc>
+        <w:tc>
+          <w:tcPr>
+            <w:tcW w:w="1586" w:type="dxa"/>
+          </w:tcPr>
+          <w:p>
+            <w:pPr>
+              <w:jc w:val="center"/>
+              <w:rPr>
+                <w:rFonts w:ascii="Times New Roman" w:hAnsi="Times New Roman" w:cs="Times New Roman"/>
+              </w:rPr>
+            </w:pPr>
+            <w:r>
+              <w:rPr>
+                <w:rFonts w:ascii="Times New Roman" w:hAnsi="Times New Roman" w:cs="Times New Roman"/>
+              </w:rPr>
+              <w:t>In the database, enforce data format</w:t>
+            </w:r>
+            <w:r>
+              <w:rPr>
+                <w:rFonts w:ascii="Times New Roman" w:hAnsi="Times New Roman" w:cs="Times New Roman"/>
+              </w:rPr>
+              <w:t xml:space="preserve"> and provide checks </w:t>
+            </w:r>
+          </w:p>
+        </w:tc>
+        <w:tc>
+          <w:tcPr>
+            <w:tcW w:w="1723" w:type="dxa"/>
+          </w:tcPr>
+          <w:p>
+            <w:pPr>
+              <w:jc w:val="center"/>
+              <w:rPr>
+                <w:rFonts w:ascii="Times New Roman" w:hAnsi="Times New Roman" w:cs="Times New Roman"/>
+              </w:rPr>
+            </w:pPr>
+            <w:r>
+              <w:rPr>
+                <w:rFonts w:ascii="Times New Roman" w:hAnsi="Times New Roman" w:cs="Times New Roman"/>
+              </w:rPr>
+              <w:t>Planned to execute in future Sprint</w:t>
+            </w:r>
+          </w:p>
+        </w:tc>
+      </w:tr>
+      <w:tr>
+        <w:tc>
+          <w:tcPr>
+            <w:tcW w:w="771" w:type="dxa"/>
+          </w:tcPr>
+          <w:p>
+            <w:pPr>
+              <w:jc w:val="center"/>
+              <w:rPr>
+                <w:rFonts w:ascii="Times New Roman" w:hAnsi="Times New Roman" w:cs="Times New Roman"/>
+              </w:rPr>
+            </w:pPr>
+            <w:r>
+              <w:rPr>
+                <w:rFonts w:ascii="Times New Roman" w:hAnsi="Times New Roman" w:cs="Times New Roman"/>
+              </w:rPr>
+              <w:t>R-02</w:t>
+            </w:r>
+          </w:p>
+        </w:tc>
+        <w:tc>
+          <w:tcPr>
+            <w:tcW w:w="1633" w:type="dxa"/>
+          </w:tcPr>
+          <w:p>
+            <w:pPr>
+              <w:jc w:val="center"/>
+              <w:rPr>
+                <w:rFonts w:ascii="Times New Roman" w:hAnsi="Times New Roman" w:cs="Times New Roman"/>
+              </w:rPr>
+            </w:pPr>
+            <w:r>
+              <w:rPr>
+                <w:rFonts w:ascii="Times New Roman" w:hAnsi="Times New Roman" w:cs="Times New Roman"/>
+              </w:rPr>
+              <w:t>Device Compatability with Application</w:t>
+            </w:r>
+          </w:p>
+        </w:tc>
+        <w:tc>
+          <w:tcPr>
+            <w:tcW w:w="1314" w:type="dxa"/>
+          </w:tcPr>
+          <w:p>
+            <w:pPr>
+              <w:jc w:val="center"/>
+              <w:rPr>
+                <w:rFonts w:ascii="Times New Roman" w:hAnsi="Times New Roman" w:cs="Times New Roman"/>
+              </w:rPr>
+            </w:pPr>
+            <w:r>
+              <w:rPr>
+                <w:rFonts w:ascii="Times New Roman" w:hAnsi="Times New Roman" w:cs="Times New Roman"/>
+              </w:rPr>
+              <w:t>Low</w:t>
+            </w:r>
+          </w:p>
+        </w:tc>
+        <w:tc>
+          <w:tcPr>
+            <w:tcW w:w="1030" w:type="dxa"/>
+          </w:tcPr>
+          <w:p>
+            <w:pPr>
+              <w:jc w:val="center"/>
+              <w:rPr>
+                <w:rFonts w:ascii="Times New Roman" w:hAnsi="Times New Roman" w:cs="Times New Roman"/>
+              </w:rPr>
+            </w:pPr>
+            <w:r>
+              <w:rPr>
+                <w:rFonts w:ascii="Times New Roman" w:hAnsi="Times New Roman" w:cs="Times New Roman"/>
+              </w:rPr>
+              <w:t>Low</w:t>
+            </w:r>
+          </w:p>
+        </w:tc>
+        <w:tc>
+          <w:tcPr>
+            <w:tcW w:w="1293" w:type="dxa"/>
+          </w:tcPr>
+          <w:p>
+            <w:pPr>
+              <w:jc w:val="center"/>
+              <w:rPr>
+                <w:rFonts w:ascii="Times New Roman" w:hAnsi="Times New Roman" w:cs="Times New Roman"/>
+              </w:rPr>
+            </w:pPr>
+            <w:r>
+              <w:rPr>
+                <w:rFonts w:ascii="Times New Roman" w:hAnsi="Times New Roman" w:cs="Times New Roman"/>
+              </w:rPr>
+              <w:t>QA Tester</w:t>
+            </w:r>
+          </w:p>
+        </w:tc>
+        <w:tc>
+          <w:tcPr>
+            <w:tcW w:w="1586" w:type="dxa"/>
+          </w:tcPr>
+          <w:p>
+            <w:pPr>
+              <w:jc w:val="center"/>
+              <w:rPr>
+                <w:rFonts w:ascii="Times New Roman" w:hAnsi="Times New Roman" w:cs="Times New Roman"/>
+              </w:rPr>
+            </w:pPr>
+            <w:r>
+              <w:rPr>
+                <w:rFonts w:ascii="Times New Roman" w:hAnsi="Times New Roman" w:cs="Times New Roman"/>
+              </w:rPr>
+              <w:t xml:space="preserve">Development of application will use the least </w:t>
+            </w:r>
+            <w:proofErr w:type="gramStart"/>
+            <w:r>
+              <w:rPr>
+                <w:rFonts w:ascii="Times New Roman" w:hAnsi="Times New Roman" w:cs="Times New Roman"/>
+              </w:rPr>
+              <w:t>amount</w:t>
+            </w:r>
+            <w:proofErr w:type="gramEnd"/>
+            <w:r>
+              <w:rPr>
+                <w:rFonts w:ascii="Times New Roman" w:hAnsi="Times New Roman" w:cs="Times New Roman"/>
+              </w:rPr>
+              <w:t xml:space="preserve"> of resources possible</w:t>
+            </w:r>
+            <w:r>
+              <w:rPr>
+                <w:rFonts w:ascii="Times New Roman" w:hAnsi="Times New Roman" w:cs="Times New Roman"/>
+              </w:rPr>
+              <w:t xml:space="preserve"> using cloud operations</w:t>
+            </w:r>
+          </w:p>
+        </w:tc>
+        <w:tc>
+          <w:tcPr>
+            <w:tcW w:w="1723" w:type="dxa"/>
+          </w:tcPr>
+          <w:p>
+            <w:pPr>
+              <w:jc w:val="center"/>
+              <w:rPr>
+                <w:rFonts w:ascii="Times New Roman" w:hAnsi="Times New Roman" w:cs="Times New Roman"/>
+              </w:rPr>
+            </w:pPr>
+            <w:r>
+              <w:rPr>
+                <w:rFonts w:ascii="Times New Roman" w:hAnsi="Times New Roman" w:cs="Times New Roman"/>
+              </w:rPr>
+              <w:t>Reference</w:t>
+            </w:r>
+            <w:r>
+              <w:rPr>
+                <w:rFonts w:ascii="Times New Roman" w:hAnsi="Times New Roman" w:cs="Times New Roman"/>
+              </w:rPr>
+              <w:t xml:space="preserve"> devices that have longterm-</w:t>
+            </w:r>
+            <w:proofErr w:type="gramStart"/>
+            <w:r>
+              <w:rPr>
+                <w:rFonts w:ascii="Times New Roman" w:hAnsi="Times New Roman" w:cs="Times New Roman"/>
+              </w:rPr>
+              <w:t>support</w:t>
+            </w:r>
+            <w:proofErr w:type="gramEnd"/>
+            <w:r>
+              <w:rPr>
+                <w:rFonts w:ascii="Times New Roman" w:hAnsi="Times New Roman" w:cs="Times New Roman"/>
+              </w:rPr>
+              <w:t xml:space="preserve"> </w:t>
+            </w:r>
+            <w:r>
+              <w:rPr>
+                <w:rFonts w:ascii="Times New Roman" w:hAnsi="Times New Roman" w:cs="Times New Roman"/>
+              </w:rPr>
+              <w:t>and highlight the oldest supported device</w:t>
+            </w:r>
+          </w:p>
+        </w:tc>
+      </w:tr>
+      <w:tr>
+        <w:tc>
+          <w:tcPr>
+            <w:tcW w:w="771" w:type="dxa"/>
+          </w:tcPr>
+          <w:p>
+            <w:pPr>
+              <w:jc w:val="center"/>
+              <w:rPr>
+                <w:rFonts w:ascii="Times New Roman" w:hAnsi="Times New Roman" w:cs="Times New Roman"/>
+              </w:rPr>
+            </w:pPr>
+            <w:r>
+              <w:rPr>
+                <w:rFonts w:ascii="Times New Roman" w:hAnsi="Times New Roman" w:cs="Times New Roman"/>
+              </w:rPr>
+              <w:t>R-03</w:t>
+            </w:r>
+          </w:p>
+        </w:tc>
+        <w:tc>
+          <w:tcPr>
+            <w:tcW w:w="1633" w:type="dxa"/>
+          </w:tcPr>
+          <w:p>
+            <w:pPr>
+              <w:jc w:val="center"/>
+              <w:rPr>
+                <w:rFonts w:ascii="Times New Roman" w:hAnsi="Times New Roman" w:cs="Times New Roman"/>
+              </w:rPr>
+            </w:pPr>
+            <w:r>
+              <w:rPr>
+                <w:rFonts w:ascii="Times New Roman" w:hAnsi="Times New Roman" w:cs="Times New Roman"/>
+              </w:rPr>
+              <w:t>Service Outage Costs</w:t>
+            </w:r>
+          </w:p>
+        </w:tc>
+        <w:tc>
+          <w:tcPr>
+            <w:tcW w:w="1314" w:type="dxa"/>
+          </w:tcPr>
+          <w:p>
+            <w:pPr>
+              <w:jc w:val="center"/>
+              <w:rPr>
+                <w:rFonts w:ascii="Times New Roman" w:hAnsi="Times New Roman" w:cs="Times New Roman"/>
+              </w:rPr>
+            </w:pPr>
+            <w:r>
+              <w:rPr>
+                <w:rFonts w:ascii="Times New Roman" w:hAnsi="Times New Roman" w:cs="Times New Roman"/>
+              </w:rPr>
+              <w:t>Medium</w:t>
+            </w:r>
+          </w:p>
+        </w:tc>
+        <w:tc>
+          <w:tcPr>
+            <w:tcW w:w="1030" w:type="dxa"/>
+          </w:tcPr>
+          <w:p>
+            <w:pPr>
+              <w:jc w:val="center"/>
+              <w:rPr>
+                <w:rFonts w:ascii="Times New Roman" w:hAnsi="Times New Roman" w:cs="Times New Roman"/>
+              </w:rPr>
+            </w:pPr>
+            <w:r>
+              <w:rPr>
+                <w:rFonts w:ascii="Times New Roman" w:hAnsi="Times New Roman" w:cs="Times New Roman"/>
+              </w:rPr>
+              <w:t>High</w:t>
+            </w:r>
+          </w:p>
+        </w:tc>
+        <w:tc>
+          <w:tcPr>
+            <w:tcW w:w="1293" w:type="dxa"/>
+          </w:tcPr>
+          <w:p>
+            <w:pPr>
+              <w:jc w:val="center"/>
+              <w:rPr>
+                <w:rFonts w:ascii="Times New Roman" w:hAnsi="Times New Roman" w:cs="Times New Roman"/>
+              </w:rPr>
+            </w:pPr>
+            <w:r>
+              <w:rPr>
+                <w:rFonts w:ascii="Times New Roman" w:hAnsi="Times New Roman" w:cs="Times New Roman"/>
+              </w:rPr>
+              <w:t>IT Infrastructure Manager</w:t>
+            </w:r>
+          </w:p>
+        </w:tc>
+        <w:tc>
+          <w:tcPr>
+            <w:tcW w:w="1586" w:type="dxa"/>
+          </w:tcPr>
+          <w:p>
+            <w:pPr>
+              <w:jc w:val="center"/>
+              <w:rPr>
+                <w:rFonts w:ascii="Times New Roman" w:hAnsi="Times New Roman" w:cs="Times New Roman"/>
+              </w:rPr>
+            </w:pPr>
+            <w:r>
+              <w:rPr>
+                <w:rFonts w:ascii="Times New Roman" w:hAnsi="Times New Roman" w:cs="Times New Roman"/>
+              </w:rPr>
+              <w:t xml:space="preserve">Establish backup servers and configure cloud </w:t>
+            </w:r>
+            <w:r>
+              <w:rPr>
+                <w:rFonts w:ascii="Times New Roman" w:hAnsi="Times New Roman" w:cs="Times New Roman"/>
+              </w:rPr>
+              <w:t xml:space="preserve">providers to utilize more resources </w:t>
+            </w:r>
+            <w:r>
+              <w:rPr>
+                <w:rFonts w:ascii="Times New Roman" w:hAnsi="Times New Roman" w:cs="Times New Roman"/>
+              </w:rPr>
+              <w:t>during outage period</w:t>
+            </w:r>
+          </w:p>
+        </w:tc>
+        <w:tc>
+          <w:tcPr>
+            <w:tcW w:w="1723" w:type="dxa"/>
+          </w:tcPr>
+          <w:p>
+            <w:pPr>
+              <w:jc w:val="center"/>
+              <w:rPr>
+                <w:rFonts w:ascii="Times New Roman" w:hAnsi="Times New Roman" w:cs="Times New Roman"/>
+              </w:rPr>
+            </w:pPr>
+            <w:r>
+              <w:rPr>
+                <w:rFonts w:ascii="Times New Roman" w:hAnsi="Times New Roman" w:cs="Times New Roman"/>
+              </w:rPr>
+              <w:t>Planned during future Sprint after configuration of frontend</w:t>
+            </w:r>
+          </w:p>
+        </w:tc>
+      </w:tr>
+      <w:tr>
+        <w:tc>
+          <w:tcPr>
+            <w:tcW w:w="771" w:type="dxa"/>
+          </w:tcPr>
+          <w:p>
+            <w:pPr>
+              <w:jc w:val="center"/>
+              <w:rPr>
+                <w:rFonts w:ascii="Times New Roman" w:hAnsi="Times New Roman" w:cs="Times New Roman"/>
+              </w:rPr>
+            </w:pPr>
+            <w:r>
+              <w:rPr>
+                <w:rFonts w:ascii="Times New Roman" w:hAnsi="Times New Roman" w:cs="Times New Roman"/>
+              </w:rPr>
+              <w:t>R-04</w:t>
+            </w:r>
+          </w:p>
+        </w:tc>
+        <w:tc>
+          <w:tcPr>
+            <w:tcW w:w="1633" w:type="dxa"/>
+          </w:tcPr>
+          <w:p>
+            <w:pPr>
+              <w:jc w:val="center"/>
+              <w:rPr>
+                <w:rFonts w:ascii="Times New Roman" w:hAnsi="Times New Roman" w:cs="Times New Roman"/>
+              </w:rPr>
+            </w:pPr>
+            <w:r>
+              <w:rPr>
+                <w:rFonts w:ascii="Times New Roman" w:hAnsi="Times New Roman" w:cs="Times New Roman"/>
+              </w:rPr>
+              <w:t>User with Lack of Technical Knowledge</w:t>
+            </w:r>
+          </w:p>
+        </w:tc>
+        <w:tc>
+          <w:tcPr>
+            <w:tcW w:w="1314" w:type="dxa"/>
+          </w:tcPr>
+          <w:p>
+            <w:pPr>
+              <w:jc w:val="center"/>
+              <w:rPr>
+                <w:rFonts w:ascii="Times New Roman" w:hAnsi="Times New Roman" w:cs="Times New Roman"/>
+              </w:rPr>
+            </w:pPr>
+            <w:r>
+              <w:rPr>
+                <w:rFonts w:ascii="Times New Roman" w:hAnsi="Times New Roman" w:cs="Times New Roman"/>
+              </w:rPr>
+              <w:t>High</w:t>
+            </w:r>
+          </w:p>
+        </w:tc>
+        <w:tc>
+          <w:tcPr>
+            <w:tcW w:w="1030" w:type="dxa"/>
+          </w:tcPr>
+          <w:p>
+            <w:pPr>
+              <w:jc w:val="center"/>
+              <w:rPr>
+                <w:rFonts w:ascii="Times New Roman" w:hAnsi="Times New Roman" w:cs="Times New Roman"/>
+              </w:rPr>
+            </w:pPr>
+            <w:r>
+              <w:rPr>
+                <w:rFonts w:ascii="Times New Roman" w:hAnsi="Times New Roman" w:cs="Times New Roman"/>
+              </w:rPr>
+              <w:t>Medium</w:t>
+            </w:r>
+          </w:p>
+        </w:tc>
+        <w:tc>
+          <w:tcPr>
+            <w:tcW w:w="1293" w:type="dxa"/>
+          </w:tcPr>
+          <w:p>
+            <w:pPr>
+              <w:jc w:val="center"/>
+              <w:rPr>
+                <w:rFonts w:ascii="Times New Roman" w:hAnsi="Times New Roman" w:cs="Times New Roman"/>
+              </w:rPr>
+            </w:pPr>
+            <w:r>
+              <w:rPr>
+                <w:rFonts w:ascii="Times New Roman" w:hAnsi="Times New Roman" w:cs="Times New Roman"/>
+              </w:rPr>
+              <w:t>Support Lead</w:t>
+            </w:r>
+          </w:p>
+        </w:tc>
+        <w:tc>
+          <w:tcPr>
+            <w:tcW w:w="1586" w:type="dxa"/>
+          </w:tcPr>
+          <w:p>
+            <w:pPr>
+              <w:jc w:val="center"/>
+              <w:rPr>
+                <w:rFonts w:ascii="Times New Roman" w:hAnsi="Times New Roman" w:cs="Times New Roman"/>
+              </w:rPr>
+            </w:pPr>
+            <w:r>
+              <w:rPr>
+                <w:rFonts w:ascii="Times New Roman" w:hAnsi="Times New Roman" w:cs="Times New Roman"/>
+              </w:rPr>
+              <w:t xml:space="preserve">During development, </w:t>
+            </w:r>
+            <w:r>
+              <w:rPr>
+                <w:rFonts w:ascii="Times New Roman" w:hAnsi="Times New Roman" w:cs="Times New Roman"/>
+              </w:rPr>
+              <w:t xml:space="preserve">establish </w:t>
+            </w:r>
+            <w:r>
+              <w:rPr>
+                <w:rFonts w:ascii="Times New Roman" w:hAnsi="Times New Roman" w:cs="Times New Roman"/>
+              </w:rPr>
+              <w:t>an FAQ with common questions and provide a step-by-step guide to user application features</w:t>
+            </w:r>
+          </w:p>
+        </w:tc>
+        <w:tc>
+          <w:tcPr>
+            <w:tcW w:w="1723" w:type="dxa"/>
+          </w:tcPr>
+          <w:p>
+            <w:pPr>
+              <w:jc w:val="center"/>
+              <w:rPr>
+                <w:rFonts w:ascii="Times New Roman" w:hAnsi="Times New Roman" w:cs="Times New Roman"/>
+              </w:rPr>
+            </w:pPr>
+            <w:r>
+              <w:rPr>
+                <w:rFonts w:ascii="Times New Roman" w:hAnsi="Times New Roman" w:cs="Times New Roman"/>
+              </w:rPr>
+              <w:t>Consider</w:t>
+            </w:r>
+            <w:r>
+              <w:rPr>
+                <w:rFonts w:ascii="Times New Roman" w:hAnsi="Times New Roman" w:cs="Times New Roman"/>
+              </w:rPr>
+              <w:t xml:space="preserve"> a usability test with sizeable sample size </w:t>
+            </w:r>
+            <w:r>
+              <w:rPr>
+                <w:rFonts w:ascii="Times New Roman" w:hAnsi="Times New Roman" w:cs="Times New Roman"/>
+              </w:rPr>
+              <w:t>with people outside of developers and stakeholders</w:t>
+            </w:r>
+          </w:p>
+        </w:tc>
+      </w:tr>
+      <w:tr>
+        <w:tc>
+          <w:tcPr>
+            <w:tcW w:w="771" w:type="dxa"/>
+          </w:tcPr>
+          <w:p>
+            <w:pPr>
+              <w:jc w:val="center"/>
+              <w:rPr>
+                <w:rFonts w:ascii="Times New Roman" w:hAnsi="Times New Roman" w:cs="Times New Roman"/>
+              </w:rPr>
+            </w:pPr>
+            <w:r>
+              <w:rPr>
+                <w:rFonts w:ascii="Times New Roman" w:hAnsi="Times New Roman" w:cs="Times New Roman"/>
+              </w:rPr>
+              <w:t>R-05</w:t>
+            </w:r>
+          </w:p>
+        </w:tc>
+        <w:tc>
+          <w:tcPr>
+            <w:tcW w:w="1633" w:type="dxa"/>
+          </w:tcPr>
+          <w:p>
+            <w:pPr>
+              <w:jc w:val="center"/>
+              <w:rPr>
+                <w:rFonts w:ascii="Times New Roman" w:hAnsi="Times New Roman" w:cs="Times New Roman"/>
+              </w:rPr>
+            </w:pPr>
+            <w:r>
+              <w:rPr>
+                <w:rFonts w:ascii="Times New Roman" w:hAnsi="Times New Roman" w:cs="Times New Roman"/>
+              </w:rPr>
+              <w:t>Application Maintenance Costs</w:t>
+            </w:r>
+          </w:p>
+        </w:tc>
+        <w:tc>
+          <w:tcPr>
+            <w:tcW w:w="1314" w:type="dxa"/>
+          </w:tcPr>
+          <w:p>
+            <w:pPr>
+              <w:jc w:val="center"/>
+              <w:rPr>
+                <w:rFonts w:ascii="Times New Roman" w:hAnsi="Times New Roman" w:cs="Times New Roman"/>
+              </w:rPr>
+            </w:pPr>
+            <w:r>
+              <w:rPr>
+                <w:rFonts w:ascii="Times New Roman" w:hAnsi="Times New Roman" w:cs="Times New Roman"/>
+              </w:rPr>
+              <w:t>High</w:t>
+            </w:r>
+          </w:p>
+        </w:tc>
+        <w:tc>
+          <w:tcPr>
+            <w:tcW w:w="1030" w:type="dxa"/>
+          </w:tcPr>
+          <w:p>
+            <w:pPr>
+              <w:jc w:val="center"/>
+              <w:rPr>
+                <w:rFonts w:ascii="Times New Roman" w:hAnsi="Times New Roman" w:cs="Times New Roman"/>
+              </w:rPr>
+            </w:pPr>
+            <w:r>
+              <w:rPr>
+                <w:rFonts w:ascii="Times New Roman" w:hAnsi="Times New Roman" w:cs="Times New Roman"/>
+              </w:rPr>
+              <w:t>High</w:t>
+            </w:r>
+          </w:p>
+        </w:tc>
+        <w:tc>
+          <w:tcPr>
+            <w:tcW w:w="1293" w:type="dxa"/>
+          </w:tcPr>
+          <w:p>
+            <w:pPr>
+              <w:jc w:val="center"/>
+              <w:rPr>
+                <w:rFonts w:ascii="Times New Roman" w:hAnsi="Times New Roman" w:cs="Times New Roman"/>
+              </w:rPr>
+            </w:pPr>
+            <w:r>
+              <w:rPr>
+                <w:rFonts w:ascii="Times New Roman" w:hAnsi="Times New Roman" w:cs="Times New Roman"/>
+              </w:rPr>
+              <w:t>IT Manager</w:t>
+            </w:r>
+          </w:p>
+        </w:tc>
+        <w:tc>
+          <w:tcPr>
+            <w:tcW w:w="1586" w:type="dxa"/>
+          </w:tcPr>
+          <w:p>
+            <w:pPr>
+              <w:jc w:val="center"/>
+              <w:rPr>
+                <w:rFonts w:ascii="Times New Roman" w:hAnsi="Times New Roman" w:cs="Times New Roman"/>
+              </w:rPr>
+            </w:pPr>
+            <w:r>
+              <w:rPr>
+                <w:rFonts w:ascii="Times New Roman" w:hAnsi="Times New Roman" w:cs="Times New Roman"/>
+              </w:rPr>
+              <w:t xml:space="preserve">Set a maintenance </w:t>
+            </w:r>
+            <w:r>
+              <w:rPr>
+                <w:rFonts w:ascii="Times New Roman" w:hAnsi="Times New Roman" w:cs="Times New Roman"/>
+              </w:rPr>
+              <w:t xml:space="preserve">schedule for </w:t>
+            </w:r>
+            <w:r>
+              <w:rPr>
+                <w:rFonts w:ascii="Times New Roman" w:hAnsi="Times New Roman" w:cs="Times New Roman"/>
+              </w:rPr>
+              <w:lastRenderedPageBreak/>
+              <w:t xml:space="preserve">the application to </w:t>
+            </w:r>
+            <w:r>
+              <w:rPr>
+                <w:rFonts w:ascii="Times New Roman" w:hAnsi="Times New Roman" w:cs="Times New Roman"/>
+              </w:rPr>
+              <w:t xml:space="preserve">apply updates to security </w:t>
+            </w:r>
+            <w:r>
+              <w:rPr>
+                <w:rFonts w:ascii="Times New Roman" w:hAnsi="Times New Roman" w:cs="Times New Roman"/>
+              </w:rPr>
+              <w:t>and functionality</w:t>
+            </w:r>
+          </w:p>
+        </w:tc>
+        <w:tc>
+          <w:tcPr>
+            <w:tcW w:w="1723" w:type="dxa"/>
+          </w:tcPr>
+          <w:p>
+            <w:pPr>
+              <w:jc w:val="center"/>
+              <w:rPr>
+                <w:rFonts w:ascii="Times New Roman" w:hAnsi="Times New Roman" w:cs="Times New Roman"/>
+              </w:rPr>
+            </w:pPr>
+            <w:r>
+              <w:rPr>
+                <w:rFonts w:ascii="Times New Roman" w:hAnsi="Times New Roman" w:cs="Times New Roman"/>
+              </w:rPr>
+              <w:lastRenderedPageBreak/>
+              <w:t xml:space="preserve">Planned for Sprint during </w:t>
+            </w:r>
+            <w:r>
+              <w:rPr>
+                <w:rFonts w:ascii="Times New Roman" w:hAnsi="Times New Roman" w:cs="Times New Roman"/>
+              </w:rPr>
+              <w:lastRenderedPageBreak/>
+              <w:t>implementation timeframe</w:t>
+            </w:r>
+          </w:p>
+        </w:tc>
+      </w:tr>
+      <w:tr>
+        <w:tc>
+          <w:tcPr>
+            <w:tcW w:w="771" w:type="dxa"/>
+          </w:tcPr>
+          <w:p>
+            <w:pPr>
+              <w:jc w:val="center"/>
+              <w:rPr>
+                <w:rFonts w:ascii="Times New Roman" w:hAnsi="Times New Roman" w:cs="Times New Roman"/>
+              </w:rPr>
+            </w:pPr>
+            <w:r>
+              <w:rPr>
+                <w:rFonts w:ascii="Times New Roman" w:hAnsi="Times New Roman" w:cs="Times New Roman"/>
+              </w:rPr>
+              <w:lastRenderedPageBreak/>
+              <w:t>R-06</w:t>
+            </w:r>
+          </w:p>
+        </w:tc>
+        <w:tc>
+          <w:tcPr>
+            <w:tcW w:w="1633" w:type="dxa"/>
+          </w:tcPr>
+          <w:p>
+            <w:pPr>
+              <w:jc w:val="center"/>
+              <w:rPr>
+                <w:rFonts w:ascii="Times New Roman" w:hAnsi="Times New Roman" w:cs="Times New Roman"/>
+              </w:rPr>
+            </w:pPr>
+            <w:r>
+              <w:rPr>
+                <w:rFonts w:ascii="Times New Roman" w:hAnsi="Times New Roman" w:cs="Times New Roman"/>
+              </w:rPr>
+              <w:t>Natural Disasters Causing Project Delays</w:t>
+            </w:r>
+          </w:p>
+        </w:tc>
+        <w:tc>
+          <w:tcPr>
+            <w:tcW w:w="1314" w:type="dxa"/>
+          </w:tcPr>
+          <w:p>
+            <w:pPr>
+              <w:jc w:val="center"/>
+              <w:rPr>
+                <w:rFonts w:ascii="Times New Roman" w:hAnsi="Times New Roman" w:cs="Times New Roman"/>
+              </w:rPr>
+            </w:pPr>
+            <w:r>
+              <w:rPr>
+                <w:rFonts w:ascii="Times New Roman" w:hAnsi="Times New Roman" w:cs="Times New Roman"/>
+              </w:rPr>
+              <w:t>Low</w:t>
+            </w:r>
+          </w:p>
+        </w:tc>
+        <w:tc>
+          <w:tcPr>
+            <w:tcW w:w="1030" w:type="dxa"/>
+          </w:tcPr>
+          <w:p>
+            <w:pPr>
+              <w:jc w:val="center"/>
+              <w:rPr>
+                <w:rFonts w:ascii="Times New Roman" w:hAnsi="Times New Roman" w:cs="Times New Roman"/>
+              </w:rPr>
+            </w:pPr>
+            <w:r>
+              <w:rPr>
+                <w:rFonts w:ascii="Times New Roman" w:hAnsi="Times New Roman" w:cs="Times New Roman"/>
+              </w:rPr>
+              <w:t>High</w:t>
+            </w:r>
+          </w:p>
+        </w:tc>
+        <w:tc>
+          <w:tcPr>
+            <w:tcW w:w="1293" w:type="dxa"/>
+          </w:tcPr>
+          <w:p>
+            <w:pPr>
+              <w:jc w:val="center"/>
+              <w:rPr>
+                <w:rFonts w:ascii="Times New Roman" w:hAnsi="Times New Roman" w:cs="Times New Roman"/>
+              </w:rPr>
+            </w:pPr>
+            <w:r>
+              <w:rPr>
+                <w:rFonts w:ascii="Times New Roman" w:hAnsi="Times New Roman" w:cs="Times New Roman"/>
+              </w:rPr>
+              <w:t>Project Manager</w:t>
+            </w:r>
+          </w:p>
+        </w:tc>
+        <w:tc>
+          <w:tcPr>
+            <w:tcW w:w="1586" w:type="dxa"/>
+          </w:tcPr>
+          <w:p>
+            <w:pPr>
+              <w:jc w:val="center"/>
+              <w:rPr>
+                <w:rFonts w:ascii="Times New Roman" w:hAnsi="Times New Roman" w:cs="Times New Roman"/>
+              </w:rPr>
+            </w:pPr>
+            <w:r>
+              <w:rPr>
+                <w:rFonts w:ascii="Times New Roman" w:hAnsi="Times New Roman" w:cs="Times New Roman"/>
+              </w:rPr>
+              <w:t xml:space="preserve">Develop </w:t>
+            </w:r>
+            <w:r>
+              <w:rPr>
+                <w:rFonts w:ascii="Times New Roman" w:hAnsi="Times New Roman" w:cs="Times New Roman"/>
+              </w:rPr>
+              <w:t>procedures to plan for possible natural disasters in the region</w:t>
+            </w:r>
+            <w:r>
+              <w:rPr>
+                <w:rFonts w:ascii="Times New Roman" w:hAnsi="Times New Roman" w:cs="Times New Roman"/>
+              </w:rPr>
+              <w:t>. Set up backups and failsafes outside of region.</w:t>
+            </w:r>
+          </w:p>
+        </w:tc>
+        <w:tc>
+          <w:tcPr>
+            <w:tcW w:w="1723" w:type="dxa"/>
+          </w:tcPr>
+          <w:p>
+            <w:pPr>
+              <w:jc w:val="center"/>
+              <w:rPr>
+                <w:rFonts w:ascii="Times New Roman" w:hAnsi="Times New Roman" w:cs="Times New Roman"/>
+              </w:rPr>
+            </w:pPr>
+            <w:r>
+              <w:rPr>
+                <w:rFonts w:ascii="Times New Roman" w:hAnsi="Times New Roman" w:cs="Times New Roman"/>
+              </w:rPr>
+              <w:t>Research in progress</w:t>
+            </w:r>
+          </w:p>
+        </w:tc>
+      </w:tr>
+      <w:tr>
+        <w:tc>
+          <w:tcPr>
+            <w:tcW w:w="771" w:type="dxa"/>
+          </w:tcPr>
+          <w:p>
+            <w:pPr>
+              <w:jc w:val="center"/>
+              <w:rPr>
+                <w:rFonts w:ascii="Times New Roman" w:hAnsi="Times New Roman" w:cs="Times New Roman"/>
+              </w:rPr>
+            </w:pPr>
+            <w:r>
+              <w:rPr>
+                <w:rFonts w:ascii="Times New Roman" w:hAnsi="Times New Roman" w:cs="Times New Roman"/>
+              </w:rPr>
+              <w:t>R-07</w:t>
+            </w:r>
+          </w:p>
+        </w:tc>
+        <w:tc>
+          <w:tcPr>
+            <w:tcW w:w="1633" w:type="dxa"/>
+          </w:tcPr>
+          <w:p>
+            <w:pPr>
+              <w:jc w:val="center"/>
+              <w:rPr>
+                <w:rFonts w:ascii="Times New Roman" w:hAnsi="Times New Roman" w:cs="Times New Roman"/>
+              </w:rPr>
+            </w:pPr>
+            <w:r>
+              <w:rPr>
+                <w:rFonts w:ascii="Times New Roman" w:hAnsi="Times New Roman" w:cs="Times New Roman"/>
+              </w:rPr>
+              <w:t>Loss of Experienced Knowledge in App Development</w:t>
+            </w:r>
+          </w:p>
+        </w:tc>
+        <w:tc>
+          <w:tcPr>
+            <w:tcW w:w="1314" w:type="dxa"/>
+          </w:tcPr>
+          <w:p>
+            <w:pPr>
+              <w:jc w:val="center"/>
+              <w:rPr>
+                <w:rFonts w:ascii="Times New Roman" w:hAnsi="Times New Roman" w:cs="Times New Roman"/>
+              </w:rPr>
+            </w:pPr>
+            <w:r>
+              <w:rPr>
+                <w:rFonts w:ascii="Times New Roman" w:hAnsi="Times New Roman" w:cs="Times New Roman"/>
+              </w:rPr>
+              <w:t>High</w:t>
+            </w:r>
+          </w:p>
+        </w:tc>
+        <w:tc>
+          <w:tcPr>
+            <w:tcW w:w="1030" w:type="dxa"/>
+          </w:tcPr>
+          <w:p>
+            <w:pPr>
+              <w:jc w:val="center"/>
+              <w:rPr>
+                <w:rFonts w:ascii="Times New Roman" w:hAnsi="Times New Roman" w:cs="Times New Roman"/>
+              </w:rPr>
+            </w:pPr>
+            <w:r>
+              <w:rPr>
+                <w:rFonts w:ascii="Times New Roman" w:hAnsi="Times New Roman" w:cs="Times New Roman"/>
+              </w:rPr>
+              <w:t>High</w:t>
+            </w:r>
+          </w:p>
+        </w:tc>
+        <w:tc>
+          <w:tcPr>
+            <w:tcW w:w="1293" w:type="dxa"/>
+          </w:tcPr>
+          <w:p>
+            <w:pPr>
+              <w:jc w:val="center"/>
+              <w:rPr>
+                <w:rFonts w:ascii="Times New Roman" w:hAnsi="Times New Roman" w:cs="Times New Roman"/>
+              </w:rPr>
+            </w:pPr>
+            <w:r>
+              <w:rPr>
+                <w:rFonts w:ascii="Times New Roman" w:hAnsi="Times New Roman" w:cs="Times New Roman"/>
+              </w:rPr>
+              <w:t>Developer Lead</w:t>
+            </w:r>
+          </w:p>
+        </w:tc>
+        <w:tc>
+          <w:tcPr>
+            <w:tcW w:w="1586" w:type="dxa"/>
+          </w:tcPr>
+          <w:p>
+            <w:pPr>
+              <w:jc w:val="center"/>
+              <w:rPr>
+                <w:rFonts w:ascii="Times New Roman" w:hAnsi="Times New Roman" w:cs="Times New Roman"/>
+              </w:rPr>
+            </w:pPr>
+            <w:r>
+              <w:rPr>
+                <w:rFonts w:ascii="Times New Roman" w:hAnsi="Times New Roman" w:cs="Times New Roman"/>
+              </w:rPr>
+              <w:t>During Sprints, add documentation</w:t>
+            </w:r>
+            <w:r>
+              <w:rPr>
+                <w:rFonts w:ascii="Times New Roman" w:hAnsi="Times New Roman" w:cs="Times New Roman"/>
+              </w:rPr>
+              <w:t xml:space="preserve"> of what was done and </w:t>
+            </w:r>
+            <w:r>
+              <w:rPr>
+                <w:rFonts w:ascii="Times New Roman" w:hAnsi="Times New Roman" w:cs="Times New Roman"/>
+              </w:rPr>
+              <w:t>fixes made to encountered problems</w:t>
+            </w:r>
+          </w:p>
+        </w:tc>
+        <w:tc>
+          <w:tcPr>
+            <w:tcW w:w="1723" w:type="dxa"/>
+          </w:tcPr>
+          <w:p>
+            <w:pPr>
+              <w:jc w:val="center"/>
+              <w:rPr>
+                <w:rFonts w:ascii="Times New Roman" w:hAnsi="Times New Roman" w:cs="Times New Roman"/>
+              </w:rPr>
+            </w:pPr>
+            <w:r>
+              <w:rPr>
+                <w:rFonts w:ascii="Times New Roman" w:hAnsi="Times New Roman" w:cs="Times New Roman"/>
+              </w:rPr>
+              <w:t>Rough drafts in progress</w:t>
+            </w:r>
+          </w:p>
+        </w:tc>
+      </w:tr>
+      <w:tr>
+        <w:tc>
+          <w:tcPr>
+            <w:tcW w:w="771" w:type="dxa"/>
+          </w:tcPr>
+          <w:p>
+            <w:pPr>
+              <w:jc w:val="center"/>
+              <w:rPr>
+                <w:rFonts w:ascii="Times New Roman" w:hAnsi="Times New Roman" w:cs="Times New Roman"/>
+              </w:rPr>
+            </w:pPr>
+            <w:r>
+              <w:rPr>
+                <w:rFonts w:ascii="Times New Roman" w:hAnsi="Times New Roman" w:cs="Times New Roman"/>
+              </w:rPr>
+              <w:t>R-08</w:t>
+            </w:r>
+          </w:p>
+        </w:tc>
+        <w:tc>
+          <w:tcPr>
+            <w:tcW w:w="1633" w:type="dxa"/>
+          </w:tcPr>
+          <w:p>
+            <w:pPr>
+              <w:jc w:val="center"/>
+              <w:rPr>
+                <w:rFonts w:ascii="Times New Roman" w:hAnsi="Times New Roman" w:cs="Times New Roman"/>
+              </w:rPr>
+            </w:pPr>
+            <w:r>
+              <w:rPr>
+                <w:rFonts w:ascii="Times New Roman" w:hAnsi="Times New Roman" w:cs="Times New Roman"/>
+              </w:rPr>
+              <w:t>Costs of Repairs after Natural Disaster</w:t>
+            </w:r>
+          </w:p>
+        </w:tc>
+        <w:tc>
+          <w:tcPr>
+            <w:tcW w:w="1314" w:type="dxa"/>
+          </w:tcPr>
+          <w:p>
+            <w:pPr>
+              <w:jc w:val="center"/>
+              <w:rPr>
+                <w:rFonts w:ascii="Times New Roman" w:hAnsi="Times New Roman" w:cs="Times New Roman"/>
+              </w:rPr>
+            </w:pPr>
+            <w:r>
+              <w:rPr>
+                <w:rFonts w:ascii="Times New Roman" w:hAnsi="Times New Roman" w:cs="Times New Roman"/>
+              </w:rPr>
+              <w:t>Low</w:t>
+            </w:r>
+          </w:p>
+        </w:tc>
+        <w:tc>
+          <w:tcPr>
+            <w:tcW w:w="1030" w:type="dxa"/>
+          </w:tcPr>
+          <w:p>
+            <w:pPr>
+              <w:jc w:val="center"/>
+              <w:rPr>
+                <w:rFonts w:ascii="Times New Roman" w:hAnsi="Times New Roman" w:cs="Times New Roman"/>
+              </w:rPr>
+            </w:pPr>
+            <w:r>
+              <w:rPr>
+                <w:rFonts w:ascii="Times New Roman" w:hAnsi="Times New Roman" w:cs="Times New Roman"/>
+              </w:rPr>
+              <w:t>High</w:t>
+            </w:r>
+          </w:p>
+        </w:tc>
+        <w:tc>
+          <w:tcPr>
+            <w:tcW w:w="1293" w:type="dxa"/>
+          </w:tcPr>
+          <w:p>
+            <w:pPr>
+              <w:jc w:val="center"/>
+              <w:rPr>
+                <w:rFonts w:ascii="Times New Roman" w:hAnsi="Times New Roman" w:cs="Times New Roman"/>
+              </w:rPr>
+            </w:pPr>
+            <w:r>
+              <w:rPr>
+                <w:rFonts w:ascii="Times New Roman" w:hAnsi="Times New Roman" w:cs="Times New Roman"/>
+              </w:rPr>
+              <w:t>Project Manager</w:t>
+            </w:r>
+          </w:p>
+        </w:tc>
+        <w:tc>
+          <w:tcPr>
+            <w:tcW w:w="1586" w:type="dxa"/>
+          </w:tcPr>
+          <w:p>
+            <w:pPr>
+              <w:jc w:val="center"/>
+              <w:rPr>
+                <w:rFonts w:ascii="Times New Roman" w:hAnsi="Times New Roman" w:cs="Times New Roman"/>
+              </w:rPr>
+            </w:pPr>
+            <w:r>
+              <w:rPr>
+                <w:rFonts w:ascii="Times New Roman" w:hAnsi="Times New Roman" w:cs="Times New Roman"/>
+              </w:rPr>
+              <w:t xml:space="preserve">Plan out </w:t>
+            </w:r>
+            <w:r>
+              <w:rPr>
+                <w:rFonts w:ascii="Times New Roman" w:hAnsi="Times New Roman" w:cs="Times New Roman"/>
+              </w:rPr>
+              <w:t xml:space="preserve">the potential cost of the required service to keep application running </w:t>
+            </w:r>
+          </w:p>
+        </w:tc>
+        <w:tc>
+          <w:tcPr>
+            <w:tcW w:w="1723" w:type="dxa"/>
+          </w:tcPr>
+          <w:p>
+            <w:pPr>
+              <w:jc w:val="center"/>
+              <w:rPr>
+                <w:rFonts w:ascii="Times New Roman" w:hAnsi="Times New Roman" w:cs="Times New Roman"/>
+              </w:rPr>
+            </w:pPr>
+            <w:r>
+              <w:rPr>
+                <w:rFonts w:ascii="Times New Roman" w:hAnsi="Times New Roman" w:cs="Times New Roman"/>
+              </w:rPr>
+              <w:t>Review in process</w:t>
+            </w:r>
+          </w:p>
+        </w:tc>
+      </w:tr>
+      <w:tr>
+        <w:tc>
+          <w:tcPr>
+            <w:tcW w:w="771" w:type="dxa"/>
+          </w:tcPr>
+          <w:p>
+            <w:pPr>
+              <w:jc w:val="center"/>
+              <w:rPr>
+                <w:rFonts w:ascii="Times New Roman" w:hAnsi="Times New Roman" w:cs="Times New Roman"/>
+              </w:rPr>
+            </w:pPr>
+            <w:r>
+              <w:rPr>
+                <w:rFonts w:ascii="Times New Roman" w:hAnsi="Times New Roman" w:cs="Times New Roman"/>
+              </w:rPr>
+              <w:t>R-09</w:t>
+            </w:r>
+          </w:p>
+        </w:tc>
+        <w:tc>
+          <w:tcPr>
+            <w:tcW w:w="1633" w:type="dxa"/>
+          </w:tcPr>
+          <w:p>
+            <w:pPr>
+              <w:jc w:val="center"/>
+              <w:rPr>
+                <w:rFonts w:ascii="Times New Roman" w:hAnsi="Times New Roman" w:cs="Times New Roman"/>
+              </w:rPr>
+            </w:pPr>
+            <w:r>
+              <w:rPr>
+                <w:rFonts w:ascii="Times New Roman" w:hAnsi="Times New Roman" w:cs="Times New Roman"/>
+              </w:rPr>
+              <w:t>Staff Unavailability from Sick Leave</w:t>
+            </w:r>
+          </w:p>
+        </w:tc>
+        <w:tc>
+          <w:tcPr>
+            <w:tcW w:w="1314" w:type="dxa"/>
+          </w:tcPr>
+          <w:p>
+            <w:pPr>
+              <w:jc w:val="center"/>
+              <w:rPr>
+                <w:rFonts w:ascii="Times New Roman" w:hAnsi="Times New Roman" w:cs="Times New Roman"/>
+              </w:rPr>
+            </w:pPr>
+            <w:r>
+              <w:rPr>
+                <w:rFonts w:ascii="Times New Roman" w:hAnsi="Times New Roman" w:cs="Times New Roman"/>
+              </w:rPr>
+              <w:t>Low</w:t>
+            </w:r>
+          </w:p>
+        </w:tc>
+        <w:tc>
+          <w:tcPr>
+            <w:tcW w:w="1030" w:type="dxa"/>
+          </w:tcPr>
+          <w:p>
+            <w:pPr>
+              <w:jc w:val="center"/>
+              <w:rPr>
+                <w:rFonts w:ascii="Times New Roman" w:hAnsi="Times New Roman" w:cs="Times New Roman"/>
+              </w:rPr>
+            </w:pPr>
+            <w:r>
+              <w:rPr>
+                <w:rFonts w:ascii="Times New Roman" w:hAnsi="Times New Roman" w:cs="Times New Roman"/>
+              </w:rPr>
+              <w:t>Low</w:t>
+            </w:r>
+          </w:p>
+        </w:tc>
+        <w:tc>
+          <w:tcPr>
+            <w:tcW w:w="1293" w:type="dxa"/>
+          </w:tcPr>
+          <w:p>
+            <w:pPr>
+              <w:jc w:val="center"/>
+              <w:rPr>
+                <w:rFonts w:ascii="Times New Roman" w:hAnsi="Times New Roman" w:cs="Times New Roman"/>
+              </w:rPr>
+            </w:pPr>
+            <w:r>
+              <w:rPr>
+                <w:rFonts w:ascii="Times New Roman" w:hAnsi="Times New Roman" w:cs="Times New Roman"/>
+              </w:rPr>
+              <w:t>Project Manager</w:t>
+            </w:r>
+          </w:p>
+        </w:tc>
+        <w:tc>
+          <w:tcPr>
+            <w:tcW w:w="1586" w:type="dxa"/>
+          </w:tcPr>
+          <w:p>
+            <w:pPr>
+              <w:jc w:val="center"/>
+              <w:rPr>
+                <w:rFonts w:ascii="Times New Roman" w:hAnsi="Times New Roman" w:cs="Times New Roman"/>
+              </w:rPr>
+            </w:pPr>
+            <w:r>
+              <w:rPr>
+                <w:rFonts w:ascii="Times New Roman" w:hAnsi="Times New Roman" w:cs="Times New Roman"/>
+              </w:rPr>
+              <w:t>Plan for how many employees can do the task at a minimum, then</w:t>
+            </w:r>
+            <w:r>
+              <w:rPr>
+                <w:rFonts w:ascii="Times New Roman" w:hAnsi="Times New Roman" w:cs="Times New Roman"/>
+              </w:rPr>
+              <w:t xml:space="preserve"> set up work schedules to ensure that any person out </w:t>
+            </w:r>
+            <w:r>
+              <w:rPr>
+                <w:rFonts w:ascii="Times New Roman" w:hAnsi="Times New Roman" w:cs="Times New Roman"/>
+              </w:rPr>
+              <w:t>will</w:t>
+            </w:r>
+            <w:r>
+              <w:rPr>
+                <w:rFonts w:ascii="Times New Roman" w:hAnsi="Times New Roman" w:cs="Times New Roman"/>
+              </w:rPr>
+              <w:t xml:space="preserve"> not fall below the minimum</w:t>
+            </w:r>
+          </w:p>
+        </w:tc>
+        <w:tc>
+          <w:tcPr>
+            <w:tcW w:w="1723" w:type="dxa"/>
+          </w:tcPr>
+          <w:p>
+            <w:pPr>
+              <w:jc w:val="center"/>
+              <w:rPr>
+                <w:rFonts w:ascii="Times New Roman" w:hAnsi="Times New Roman" w:cs="Times New Roman"/>
+              </w:rPr>
+            </w:pPr>
+            <w:r>
+              <w:rPr>
+                <w:rFonts w:ascii="Times New Roman" w:hAnsi="Times New Roman" w:cs="Times New Roman"/>
+              </w:rPr>
+              <w:t xml:space="preserve">Report </w:t>
+            </w:r>
+            <w:proofErr w:type="gramStart"/>
+            <w:r>
+              <w:rPr>
+                <w:rFonts w:ascii="Times New Roman" w:hAnsi="Times New Roman" w:cs="Times New Roman"/>
+              </w:rPr>
+              <w:t>from first</w:t>
+            </w:r>
+            <w:proofErr w:type="gramEnd"/>
+            <w:r>
+              <w:rPr>
+                <w:rFonts w:ascii="Times New Roman" w:hAnsi="Times New Roman" w:cs="Times New Roman"/>
+              </w:rPr>
+              <w:t xml:space="preserve"> Sprint in progress</w:t>
+            </w:r>
+          </w:p>
+        </w:tc>
+      </w:tr>
+      <w:tr>
+        <w:tc>
+          <w:tcPr>
+            <w:tcW w:w="771" w:type="dxa"/>
+          </w:tcPr>
+          <w:p>
+            <w:pPr>
+              <w:jc w:val="center"/>
+              <w:rPr>
+                <w:rFonts w:ascii="Times New Roman" w:hAnsi="Times New Roman" w:cs="Times New Roman"/>
+              </w:rPr>
+            </w:pPr>
+            <w:r>
+              <w:rPr>
+                <w:rFonts w:ascii="Times New Roman" w:hAnsi="Times New Roman" w:cs="Times New Roman"/>
+              </w:rPr>
+              <w:lastRenderedPageBreak/>
+              <w:t>R-10</w:t>
+            </w:r>
+          </w:p>
+        </w:tc>
+        <w:tc>
+          <w:tcPr>
+            <w:tcW w:w="1633" w:type="dxa"/>
+          </w:tcPr>
+          <w:p>
+            <w:pPr>
+              <w:jc w:val="center"/>
+              <w:rPr>
+                <w:rFonts w:ascii="Times New Roman" w:hAnsi="Times New Roman" w:cs="Times New Roman"/>
+              </w:rPr>
+            </w:pPr>
+            <w:r>
+              <w:rPr>
+                <w:rFonts w:ascii="Times New Roman" w:hAnsi="Times New Roman" w:cs="Times New Roman"/>
+              </w:rPr>
+              <w:t>Incomplete or Incorrect Software Requirements</w:t>
+            </w:r>
+          </w:p>
+        </w:tc>
+        <w:tc>
+          <w:tcPr>
+            <w:tcW w:w="1314" w:type="dxa"/>
+          </w:tcPr>
+          <w:p>
+            <w:pPr>
+              <w:jc w:val="center"/>
+              <w:rPr>
+                <w:rFonts w:ascii="Times New Roman" w:hAnsi="Times New Roman" w:cs="Times New Roman"/>
+              </w:rPr>
+            </w:pPr>
+            <w:r>
+              <w:rPr>
+                <w:rFonts w:ascii="Times New Roman" w:hAnsi="Times New Roman" w:cs="Times New Roman"/>
+              </w:rPr>
+              <w:t>Medium</w:t>
+            </w:r>
+          </w:p>
+        </w:tc>
+        <w:tc>
+          <w:tcPr>
+            <w:tcW w:w="1030" w:type="dxa"/>
+          </w:tcPr>
+          <w:p>
+            <w:pPr>
+              <w:jc w:val="center"/>
+              <w:rPr>
+                <w:rFonts w:ascii="Times New Roman" w:hAnsi="Times New Roman" w:cs="Times New Roman"/>
+              </w:rPr>
+            </w:pPr>
+            <w:r>
+              <w:rPr>
+                <w:rFonts w:ascii="Times New Roman" w:hAnsi="Times New Roman" w:cs="Times New Roman"/>
+              </w:rPr>
+              <w:t>Low</w:t>
+            </w:r>
+          </w:p>
+        </w:tc>
+        <w:tc>
+          <w:tcPr>
+            <w:tcW w:w="1293" w:type="dxa"/>
+          </w:tcPr>
+          <w:p>
+            <w:pPr>
+              <w:jc w:val="center"/>
+              <w:rPr>
+                <w:rFonts w:ascii="Times New Roman" w:hAnsi="Times New Roman" w:cs="Times New Roman"/>
+              </w:rPr>
+            </w:pPr>
+            <w:r>
+              <w:rPr>
+                <w:rFonts w:ascii="Times New Roman" w:hAnsi="Times New Roman" w:cs="Times New Roman"/>
+              </w:rPr>
+              <w:t>Project Manager</w:t>
+            </w:r>
+          </w:p>
+        </w:tc>
+        <w:tc>
+          <w:tcPr>
+            <w:tcW w:w="1586" w:type="dxa"/>
+          </w:tcPr>
+          <w:p>
+            <w:pPr>
+              <w:jc w:val="center"/>
+              <w:rPr>
+                <w:rFonts w:ascii="Times New Roman" w:hAnsi="Times New Roman" w:cs="Times New Roman"/>
+              </w:rPr>
+            </w:pPr>
+            <w:r>
+              <w:rPr>
+                <w:rFonts w:ascii="Times New Roman" w:hAnsi="Times New Roman" w:cs="Times New Roman"/>
+              </w:rPr>
+              <w:t xml:space="preserve">Plan </w:t>
+            </w:r>
+            <w:r>
+              <w:rPr>
+                <w:rFonts w:ascii="Times New Roman" w:hAnsi="Times New Roman" w:cs="Times New Roman"/>
+              </w:rPr>
+              <w:t xml:space="preserve">for the </w:t>
+            </w:r>
+            <w:r>
+              <w:rPr>
+                <w:rFonts w:ascii="Times New Roman" w:hAnsi="Times New Roman" w:cs="Times New Roman"/>
+              </w:rPr>
+              <w:t>minimum requirements needed for application to work</w:t>
+            </w:r>
+          </w:p>
+        </w:tc>
+        <w:tc>
+          <w:tcPr>
+            <w:tcW w:w="1723" w:type="dxa"/>
+          </w:tcPr>
+          <w:p>
+            <w:pPr>
+              <w:jc w:val="center"/>
+              <w:rPr>
+                <w:rFonts w:ascii="Times New Roman" w:hAnsi="Times New Roman" w:cs="Times New Roman"/>
+              </w:rPr>
+            </w:pPr>
+            <w:r>
+              <w:rPr>
+                <w:rFonts w:ascii="Times New Roman" w:hAnsi="Times New Roman" w:cs="Times New Roman"/>
+              </w:rPr>
+              <w:t>In progress with initial Sprint</w:t>
+            </w:r>
+          </w:p>
+        </w:tc>
+      </w:tr>
+    </w:tbl>
+    <w:p>
+      <w:pPr>
+        <w:spacing w:line="240" w:lineRule="auto"/>
+        <w:rPr>
+          <w:rFonts w:ascii="Times New Roman" w:hAnsi="Times New Roman" w:cs="Times New Roman"/>
+        </w:rPr>
+      </w:pPr>
+    </w:p>
+    <w:p>
+      <w:pPr>
+        <w:spacing w:line="240" w:lineRule="auto"/>
+        <w:rPr>
+          <w:rFonts w:ascii="Times New Roman" w:hAnsi="Times New Roman" w:cs="Times New Roman"/>
+          <w:b/>
+          <w:bCs/>
+          <w:sz w:val="32"/>
+          <w:szCs w:val="32"/>
+        </w:rPr>
+      </w:pPr>
+      <w:r>
+        <w:rPr>
+          <w:rFonts w:ascii="Times New Roman" w:hAnsi="Times New Roman" w:cs="Times New Roman"/>
+          <w:b/>
+          <w:bCs/>
+          <w:sz w:val="32"/>
+          <w:szCs w:val="32"/>
+        </w:rPr>
+        <w:t>12.</w:t>
+      </w:r>
+      <w:r>
+        <w:rPr>
+          <w:rFonts w:ascii="Times New Roman" w:hAnsi="Times New Roman" w:cs="Times New Roman"/>
+          <w:b/>
+          <w:bCs/>
+          <w:sz w:val="32"/>
+          <w:szCs w:val="32"/>
+        </w:rPr>
+        <w:t>Communication Plan</w:t>
+      </w:r>
+    </w:p>
+    <w:p>
+      <w:pPr>
+        <w:spacing w:line="240" w:lineRule="auto"/>
+        <w:rPr>
+          <w:rFonts w:ascii="Times New Roman" w:hAnsi="Times New Roman" w:cs="Times New Roman"/>
+        </w:rPr>
+      </w:pPr>
+      <w:r>
+        <w:rPr>
+          <w:rFonts w:ascii="Times New Roman" w:hAnsi="Times New Roman" w:cs="Times New Roman"/>
+        </w:rPr>
+        <w:t>From our team of 20 members</w:t>
+      </w:r>
+      <w:r>
+        <w:rPr>
+          <w:rFonts w:ascii="Times New Roman" w:hAnsi="Times New Roman" w:cs="Times New Roman"/>
+        </w:rPr>
+        <w:t>, we will split the team to 2 teams in which each team will have a daily stand-up</w:t>
+      </w:r>
+      <w:r>
+        <w:rPr>
+          <w:rFonts w:ascii="Times New Roman" w:hAnsi="Times New Roman" w:cs="Times New Roman"/>
+        </w:rPr>
+        <w:t xml:space="preserve"> that will last between 10-15 minutes. </w:t>
+      </w:r>
+      <w:r>
+        <w:rPr>
+          <w:rFonts w:ascii="Times New Roman" w:hAnsi="Times New Roman" w:cs="Times New Roman"/>
+        </w:rPr>
+        <w:t xml:space="preserve">After the standup, the team </w:t>
+      </w:r>
+      <w:r>
+        <w:rPr>
+          <w:rFonts w:ascii="Times New Roman" w:hAnsi="Times New Roman" w:cs="Times New Roman"/>
+        </w:rPr>
+        <w:t>leaders</w:t>
+      </w:r>
+      <w:r>
+        <w:rPr>
+          <w:rFonts w:ascii="Times New Roman" w:hAnsi="Times New Roman" w:cs="Times New Roman"/>
+        </w:rPr>
+        <w:t xml:space="preserve"> </w:t>
+      </w:r>
+      <w:r>
+        <w:rPr>
+          <w:rFonts w:ascii="Times New Roman" w:hAnsi="Times New Roman" w:cs="Times New Roman"/>
+        </w:rPr>
+        <w:t>of both teams will meet for the day and discuss how things are going.</w:t>
+      </w:r>
+    </w:p>
+    <w:p>
+      <w:pPr>
+        <w:spacing w:line="240" w:lineRule="auto"/>
+        <w:rPr>
+          <w:rFonts w:ascii="Times New Roman" w:hAnsi="Times New Roman" w:cs="Times New Roman"/>
+        </w:rPr>
+      </w:pPr>
+    </w:p>
+    <w:p>
+      <w:pPr>
+        <w:spacing w:line="240" w:lineRule="auto"/>
+        <w:rPr>
+          <w:rFonts w:ascii="Times New Roman" w:hAnsi="Times New Roman" w:cs="Times New Roman"/>
+        </w:rPr>
+      </w:pPr>
+      <w:r>
+        <w:rPr>
+          <w:rFonts w:ascii="Times New Roman" w:hAnsi="Times New Roman" w:cs="Times New Roman"/>
+        </w:rPr>
+        <w:t xml:space="preserve">Every </w:t>
+      </w:r>
+      <w:r>
+        <w:rPr>
+          <w:rFonts w:ascii="Times New Roman" w:hAnsi="Times New Roman" w:cs="Times New Roman"/>
+        </w:rPr>
+        <w:t xml:space="preserve">week, the teams will get </w:t>
+      </w:r>
+      <w:r>
+        <w:rPr>
+          <w:rFonts w:ascii="Times New Roman" w:hAnsi="Times New Roman" w:cs="Times New Roman"/>
+        </w:rPr>
+        <w:t>together</w:t>
+      </w:r>
+      <w:r>
+        <w:rPr>
+          <w:rFonts w:ascii="Times New Roman" w:hAnsi="Times New Roman" w:cs="Times New Roman"/>
+        </w:rPr>
+        <w:t xml:space="preserve"> and perform a live demo of what was accomplished for that week </w:t>
+      </w:r>
+      <w:r>
+        <w:rPr>
+          <w:rFonts w:ascii="Times New Roman" w:hAnsi="Times New Roman" w:cs="Times New Roman"/>
+        </w:rPr>
+        <w:t xml:space="preserve">and discuss what the next steps will be </w:t>
+      </w:r>
+      <w:r>
+        <w:rPr>
+          <w:rFonts w:ascii="Times New Roman" w:hAnsi="Times New Roman" w:cs="Times New Roman"/>
+        </w:rPr>
+        <w:t>and what improvements can be made</w:t>
+      </w:r>
+      <w:r>
+        <w:rPr>
+          <w:rFonts w:ascii="Times New Roman" w:hAnsi="Times New Roman" w:cs="Times New Roman"/>
+        </w:rPr>
+        <w:t>. This weekly meeting would last about 30 minutes</w:t>
+      </w:r>
+      <w:r>
+        <w:rPr>
+          <w:rFonts w:ascii="Times New Roman" w:hAnsi="Times New Roman" w:cs="Times New Roman"/>
+        </w:rPr>
+        <w:t>.</w:t>
+      </w:r>
+    </w:p>
+    <w:p>
+      <w:pPr>
+        <w:spacing w:line="240" w:lineRule="auto"/>
+        <w:rPr>
+          <w:rFonts w:ascii="Times New Roman" w:hAnsi="Times New Roman" w:cs="Times New Roman"/>
+        </w:rPr>
+      </w:pPr>
+    </w:p>
+    <w:p>
+      <w:pPr>
+        <w:spacing w:line="240" w:lineRule="auto"/>
+        <w:rPr>
+          <w:rFonts w:ascii="Times New Roman" w:hAnsi="Times New Roman" w:cs="Times New Roman"/>
+        </w:rPr>
+      </w:pPr>
+      <w:r>
+        <w:rPr>
+          <w:rFonts w:ascii="Times New Roman" w:hAnsi="Times New Roman" w:cs="Times New Roman"/>
+        </w:rPr>
+        <w:t xml:space="preserve">Once a month, the team will get the stakeholders to show the progress of </w:t>
+      </w:r>
+      <w:r>
+        <w:rPr>
+          <w:rFonts w:ascii="Times New Roman" w:hAnsi="Times New Roman" w:cs="Times New Roman"/>
+        </w:rPr>
+        <w:t>all the sprints that occurred</w:t>
+      </w:r>
+      <w:r>
+        <w:rPr>
+          <w:rFonts w:ascii="Times New Roman" w:hAnsi="Times New Roman" w:cs="Times New Roman"/>
+        </w:rPr>
+        <w:t xml:space="preserve"> to receive feedback and verify </w:t>
+      </w:r>
+      <w:r>
+        <w:rPr>
+          <w:rFonts w:ascii="Times New Roman" w:hAnsi="Times New Roman" w:cs="Times New Roman"/>
+        </w:rPr>
+        <w:t xml:space="preserve">to them that progress is being made on the project. </w:t>
+      </w:r>
+      <w:r>
+        <w:rPr>
+          <w:rFonts w:ascii="Times New Roman" w:hAnsi="Times New Roman" w:cs="Times New Roman"/>
+        </w:rPr>
+        <w:t xml:space="preserve">This monthly meeting would last no longer than </w:t>
+      </w:r>
+      <w:r>
+        <w:rPr>
+          <w:rFonts w:ascii="Times New Roman" w:hAnsi="Times New Roman" w:cs="Times New Roman"/>
+        </w:rPr>
+        <w:t>1 hour.</w:t>
+      </w:r>
+    </w:p>
+    <w:p>
+      <w:pPr>
+        <w:spacing w:line="240" w:lineRule="auto"/>
+        <w:rPr>
+          <w:rFonts w:ascii="Times New Roman" w:hAnsi="Times New Roman" w:cs="Times New Roman"/>
         </w:rPr>
       </w:pPr>
     </w:p>
@@ -8549,6 +10994,119 @@
     </w:lvl>
   </w:abstractNum>
   <w:abstractNum w:abstractNumId="5" w15:restartNumberingAfterBreak="0">
+    <w:nsid w:val="31E27080"/>
+    <w:multiLevelType w:val="hybridMultilevel"/>
+    <w:tmpl w:val="3BD4831C"/>
+    <w:lvl w:ilvl="0" w:tplc="04090001">
+      <w:start w:val="1"/>
+      <w:numFmt w:val="bullet"/>
+      <w:lvlText w:val=""/>
+      <w:lvlJc w:val="left"/>
+      <w:pPr>
+        <w:ind w:left="720" w:hanging="360"/>
+      </w:pPr>
+      <w:rPr>
+        <w:rFonts w:ascii="Symbol" w:hAnsi="Symbol" w:hint="default"/>
+      </w:rPr>
+    </w:lvl>
+    <w:lvl w:ilvl="1" w:tplc="04090001">
+      <w:start w:val="1"/>
+      <w:numFmt w:val="bullet"/>
+      <w:lvlText w:val=""/>
+      <w:lvlJc w:val="left"/>
+      <w:pPr>
+        <w:ind w:left="2160" w:hanging="360"/>
+      </w:pPr>
+      <w:rPr>
+        <w:rFonts w:ascii="Symbol" w:hAnsi="Symbol" w:hint="default"/>
+      </w:rPr>
+    </w:lvl>
+    <w:lvl w:ilvl="2" w:tplc="04090005" w:tentative="1">
+      <w:start w:val="1"/>
+      <w:numFmt w:val="bullet"/>
+      <w:lvlText w:val=""/>
+      <w:lvlJc w:val="left"/>
+      <w:pPr>
+        <w:ind w:left="2160" w:hanging="360"/>
+      </w:pPr>
+      <w:rPr>
+        <w:rFonts w:ascii="Wingdings" w:hAnsi="Wingdings" w:hint="default"/>
+      </w:rPr>
+    </w:lvl>
+    <w:lvl w:ilvl="3" w:tplc="04090001" w:tentative="1">
+      <w:start w:val="1"/>
+      <w:numFmt w:val="bullet"/>
+      <w:lvlText w:val=""/>
+      <w:lvlJc w:val="left"/>
+      <w:pPr>
+        <w:ind w:left="2880" w:hanging="360"/>
+      </w:pPr>
+      <w:rPr>
+        <w:rFonts w:ascii="Symbol" w:hAnsi="Symbol" w:hint="default"/>
+      </w:rPr>
+    </w:lvl>
+    <w:lvl w:ilvl="4" w:tplc="04090003" w:tentative="1">
+      <w:start w:val="1"/>
+      <w:numFmt w:val="bullet"/>
+      <w:lvlText w:val="o"/>
+      <w:lvlJc w:val="left"/>
+      <w:pPr>
+        <w:ind w:left="3600" w:hanging="360"/>
+      </w:pPr>
+      <w:rPr>
+        <w:rFonts w:ascii="Courier New" w:hAnsi="Courier New" w:cs="Courier New" w:hint="default"/>
+      </w:rPr>
+    </w:lvl>
+    <w:lvl w:ilvl="5" w:tplc="04090005" w:tentative="1">
+      <w:start w:val="1"/>
+      <w:numFmt w:val="bullet"/>
+      <w:lvlText w:val=""/>
+      <w:lvlJc w:val="left"/>
+      <w:pPr>
+        <w:ind w:left="4320" w:hanging="360"/>
+      </w:pPr>
+      <w:rPr>
+        <w:rFonts w:ascii="Wingdings" w:hAnsi="Wingdings" w:hint="default"/>
+      </w:rPr>
+    </w:lvl>
+    <w:lvl w:ilvl="6" w:tplc="04090001" w:tentative="1">
+      <w:start w:val="1"/>
+      <w:numFmt w:val="bullet"/>
+      <w:lvlText w:val=""/>
+      <w:lvlJc w:val="left"/>
+      <w:pPr>
+        <w:ind w:left="5040" w:hanging="360"/>
+      </w:pPr>
+      <w:rPr>
+        <w:rFonts w:ascii="Symbol" w:hAnsi="Symbol" w:hint="default"/>
+      </w:rPr>
+    </w:lvl>
+    <w:lvl w:ilvl="7" w:tplc="04090003" w:tentative="1">
+      <w:start w:val="1"/>
+      <w:numFmt w:val="bullet"/>
+      <w:lvlText w:val="o"/>
+      <w:lvlJc w:val="left"/>
+      <w:pPr>
+        <w:ind w:left="5760" w:hanging="360"/>
+      </w:pPr>
+      <w:rPr>
+        <w:rFonts w:ascii="Courier New" w:hAnsi="Courier New" w:cs="Courier New" w:hint="default"/>
+      </w:rPr>
+    </w:lvl>
+    <w:lvl w:ilvl="8" w:tplc="04090005" w:tentative="1">
+      <w:start w:val="1"/>
+      <w:numFmt w:val="bullet"/>
+      <w:lvlText w:val=""/>
+      <w:lvlJc w:val="left"/>
+      <w:pPr>
+        <w:ind w:left="6480" w:hanging="360"/>
+      </w:pPr>
+      <w:rPr>
+        <w:rFonts w:ascii="Wingdings" w:hAnsi="Wingdings" w:hint="default"/>
+      </w:rPr>
+    </w:lvl>
+  </w:abstractNum>
+  <w:abstractNum w:abstractNumId="6" w15:restartNumberingAfterBreak="0">
     <w:nsid w:val="3AD67578"/>
     <w:multiLevelType w:val="hybridMultilevel"/>
     <w:tmpl w:val="57DAC4D0"/>
@@ -8661,7 +11219,7 @@
       </w:rPr>
     </w:lvl>
   </w:abstractNum>
-  <w:abstractNum w:abstractNumId="6" w15:restartNumberingAfterBreak="0">
+  <w:abstractNum w:abstractNumId="7" w15:restartNumberingAfterBreak="0">
     <w:nsid w:val="66E53858"/>
     <w:multiLevelType w:val="hybridMultilevel"/>
     <w:tmpl w:val="A670A140"/>
@@ -8774,7 +11332,7 @@
       </w:rPr>
     </w:lvl>
   </w:abstractNum>
-  <w:abstractNum w:abstractNumId="7" w15:restartNumberingAfterBreak="0">
+  <w:abstractNum w:abstractNumId="8" w15:restartNumberingAfterBreak="0">
     <w:nsid w:val="6C776033"/>
     <w:multiLevelType w:val="hybridMultilevel"/>
     <w:tmpl w:val="E71A6B86"/>
@@ -8887,7 +11445,7 @@
       </w:rPr>
     </w:lvl>
   </w:abstractNum>
-  <w:abstractNum w:abstractNumId="8" w15:restartNumberingAfterBreak="0">
+  <w:abstractNum w:abstractNumId="9" w15:restartNumberingAfterBreak="0">
     <w:nsid w:val="6D97009D"/>
     <w:multiLevelType w:val="hybridMultilevel"/>
     <w:tmpl w:val="7C8464E2"/>
@@ -9000,7 +11558,7 @@
       </w:rPr>
     </w:lvl>
   </w:abstractNum>
-  <w:abstractNum w:abstractNumId="9" w15:restartNumberingAfterBreak="0">
+  <w:abstractNum w:abstractNumId="10" w15:restartNumberingAfterBreak="0">
     <w:nsid w:val="73085909"/>
     <w:multiLevelType w:val="hybridMultilevel"/>
     <w:tmpl w:val="A84C1CCE"/>
@@ -9110,7 +11668,7 @@
       </w:rPr>
     </w:lvl>
   </w:abstractNum>
-  <w:abstractNum w:abstractNumId="10" w15:restartNumberingAfterBreak="0">
+  <w:abstractNum w:abstractNumId="11" w15:restartNumberingAfterBreak="0">
     <w:nsid w:val="78080D0F"/>
     <w:multiLevelType w:val="hybridMultilevel"/>
     <w:tmpl w:val="0242EE4A"/>
@@ -9223,7 +11781,7 @@
       </w:rPr>
     </w:lvl>
   </w:abstractNum>
-  <w:abstractNum w:abstractNumId="11" w15:restartNumberingAfterBreak="0">
+  <w:abstractNum w:abstractNumId="12" w15:restartNumberingAfterBreak="0">
     <w:nsid w:val="7F472D05"/>
     <w:multiLevelType w:val="hybridMultilevel"/>
     <w:tmpl w:val="25F0C5F4"/>
@@ -9340,25 +11898,25 @@
     <w:abstractNumId w:val="0"/>
   </w:num>
   <w:num w:numId="2" w16cid:durableId="1108349107">
-    <w:abstractNumId w:val="6"/>
+    <w:abstractNumId w:val="7"/>
   </w:num>
   <w:num w:numId="3" w16cid:durableId="1041322040">
-    <w:abstractNumId w:val="10"/>
+    <w:abstractNumId w:val="11"/>
   </w:num>
   <w:num w:numId="4" w16cid:durableId="183322338">
-    <w:abstractNumId w:val="11"/>
+    <w:abstractNumId w:val="12"/>
   </w:num>
   <w:num w:numId="5" w16cid:durableId="1326472688">
     <w:abstractNumId w:val="2"/>
   </w:num>
   <w:num w:numId="6" w16cid:durableId="1041974859">
+    <w:abstractNumId w:val="9"/>
+  </w:num>
+  <w:num w:numId="7" w16cid:durableId="979772841">
     <w:abstractNumId w:val="8"/>
   </w:num>
-  <w:num w:numId="7" w16cid:durableId="979772841">
-    <w:abstractNumId w:val="7"/>
-  </w:num>
   <w:num w:numId="8" w16cid:durableId="666977979">
-    <w:abstractNumId w:val="5"/>
+    <w:abstractNumId w:val="6"/>
   </w:num>
   <w:num w:numId="9" w16cid:durableId="691032030">
     <w:abstractNumId w:val="4"/>
@@ -9370,7 +11928,10 @@
     <w:abstractNumId w:val="1"/>
   </w:num>
   <w:num w:numId="12" w16cid:durableId="1635138606">
-    <w:abstractNumId w:val="9"/>
+    <w:abstractNumId w:val="10"/>
+  </w:num>
+  <w:num w:numId="13" w16cid:durableId="1913350865">
+    <w:abstractNumId w:val="5"/>
   </w:num>
 </w:numbering>
 </file>
@@ -10336,6 +12897,25 @@
     <w:uiPriority w:val="99"/>
     <w:rsid w:val="00C24B25"/>
   </w:style>
+  <w:style w:type="table" w:styleId="TableGrid">
+    <w:name w:val="Table Grid"/>
+    <w:basedOn w:val="TableNormal"/>
+    <w:uiPriority w:val="39"/>
+    <w:rsid w:val="00115406"/>
+    <w:pPr>
+      <w:spacing w:after="0" w:line="240" w:lineRule="auto"/>
+    </w:pPr>
+    <w:tblPr>
+      <w:tblBorders>
+        <w:top w:val="single" w:sz="4" w:space="0" w:color="auto"/>
+        <w:left w:val="single" w:sz="4" w:space="0" w:color="auto"/>
+        <w:bottom w:val="single" w:sz="4" w:space="0" w:color="auto"/>
+        <w:right w:val="single" w:sz="4" w:space="0" w:color="auto"/>
+        <w:insideH w:val="single" w:sz="4" w:space="0" w:color="auto"/>
+        <w:insideV w:val="single" w:sz="4" w:space="0" w:color="auto"/>
+      </w:tblBorders>
+    </w:tblPr>
+  </w:style>
 </w:styles>
 </file>
 

</xml_diff>

<commit_message>
Updated to Version 1.4
</commit_message>
<xml_diff>
--- a/Nammathao_CIS4374_Project.docx
+++ b/Nammathao_CIS4374_Project.docx
@@ -940,19 +940,11 @@
         </w:rPr>
         <w:t xml:space="preserve">is used in comparison to </w:t>
       </w:r>
-      <w:proofErr w:type="gramStart"/>
-      <w:r>
-        <w:rPr>
-          <w:rFonts w:ascii="Times New Roman" w:hAnsi="Times New Roman" w:cs="Times New Roman"/>
-        </w:rPr>
-        <w:t>using</w:t>
-      </w:r>
-      <w:proofErr w:type="gramEnd"/>
-      <w:r>
-        <w:rPr>
-          <w:rFonts w:ascii="Times New Roman" w:hAnsi="Times New Roman" w:cs="Times New Roman"/>
-        </w:rPr>
-        <w:t xml:space="preserve"> the city to find parking</w:t>
+      <w:r>
+        <w:rPr>
+          <w:rFonts w:ascii="Times New Roman" w:hAnsi="Times New Roman" w:cs="Times New Roman"/>
+        </w:rPr>
+        <w:t>using the city to find parking</w:t>
       </w:r>
     </w:p>
     <w:p>
@@ -1283,7 +1275,7 @@
         <w:rPr>
           <w:rFonts w:ascii="Times New Roman" w:hAnsi="Times New Roman" w:cs="Times New Roman"/>
         </w:rPr>
-        <w:t>3</w:t>
+        <w:t>4</w:t>
       </w:r>
     </w:p>
     <w:p>
@@ -1316,7 +1308,13 @@
         <w:rPr>
           <w:rFonts w:ascii="Times New Roman" w:hAnsi="Times New Roman" w:cs="Times New Roman"/>
         </w:rPr>
-        <w:t>01</w:t>
+        <w:t>0</w:t>
+      </w:r>
+      <w:r>
+        <w:rPr>
+          <w:rFonts w:ascii="Times New Roman" w:hAnsi="Times New Roman" w:cs="Times New Roman"/>
+        </w:rPr>
+        <w:t>8</w:t>
       </w:r>
       <w:r>
         <w:rPr>
@@ -3758,42 +3756,24 @@
         </w:rPr>
         <w:t xml:space="preserve">Website generates </w:t>
       </w:r>
-      <w:proofErr w:type="gramStart"/>
       <w:r>
         <w:rPr>
           <w:rFonts w:ascii="Times New Roman" w:hAnsi="Times New Roman" w:cs="Times New Roman"/>
         </w:rPr>
         <w:t>report</w:t>
       </w:r>
-      <w:proofErr w:type="gramEnd"/>
       <w:r>
         <w:rPr>
           <w:rFonts w:ascii="Times New Roman" w:hAnsi="Times New Roman" w:cs="Times New Roman"/>
         </w:rPr>
         <w:t xml:space="preserve"> and </w:t>
       </w:r>
-      <w:proofErr w:type="gramStart"/>
-      <w:r>
-        <w:rPr>
-          <w:rFonts w:ascii="Times New Roman" w:hAnsi="Times New Roman" w:cs="Times New Roman"/>
-        </w:rPr>
-        <w:t>report is</w:t>
-      </w:r>
-      <w:proofErr w:type="gramEnd"/>
-      <w:r>
-        <w:rPr>
-          <w:rFonts w:ascii="Times New Roman" w:hAnsi="Times New Roman" w:cs="Times New Roman"/>
-        </w:rPr>
-        <w:t xml:space="preserve"> sent to user </w:t>
-      </w:r>
-      <w:proofErr w:type="gramStart"/>
-      <w:r>
-        <w:rPr>
-          <w:rFonts w:ascii="Times New Roman" w:hAnsi="Times New Roman" w:cs="Times New Roman"/>
-        </w:rPr>
-        <w:t>email</w:t>
-      </w:r>
-      <w:proofErr w:type="gramEnd"/>
+      <w:r>
+        <w:rPr>
+          <w:rFonts w:ascii="Times New Roman" w:hAnsi="Times New Roman" w:cs="Times New Roman"/>
+        </w:rPr>
+        <w:t>report is sent to user email</w:t>
+      </w:r>
     </w:p>
     <w:p>
       <w:pPr>
@@ -3960,21 +3940,7 @@
         <w:rPr>
           <w:rFonts w:ascii="Times New Roman" w:hAnsi="Times New Roman" w:cs="Times New Roman"/>
         </w:rPr>
-        <w:t xml:space="preserve">is provided in the confirmation screen </w:t>
-      </w:r>
-      <w:proofErr w:type="gramStart"/>
-      <w:r>
-        <w:rPr>
-          <w:rFonts w:ascii="Times New Roman" w:hAnsi="Times New Roman" w:cs="Times New Roman"/>
-        </w:rPr>
-        <w:t>and also</w:t>
-      </w:r>
-      <w:proofErr w:type="gramEnd"/>
-      <w:r>
-        <w:rPr>
-          <w:rFonts w:ascii="Times New Roman" w:hAnsi="Times New Roman" w:cs="Times New Roman"/>
-        </w:rPr>
-        <w:t xml:space="preserve"> sent with the email</w:t>
+        <w:t>is provided in the confirmation screen and also sent with the email</w:t>
       </w:r>
       <w:r>
         <w:rPr>
@@ -4976,21 +4942,7 @@
         <w:rPr>
           <w:rFonts w:ascii="Times New Roman" w:hAnsi="Times New Roman" w:cs="Times New Roman"/>
         </w:rPr>
-        <w:t xml:space="preserve">Extends a Parking Reservation </w:t>
-      </w:r>
-      <w:proofErr w:type="gramStart"/>
-      <w:r>
-        <w:rPr>
-          <w:rFonts w:ascii="Times New Roman" w:hAnsi="Times New Roman" w:cs="Times New Roman"/>
-        </w:rPr>
-        <w:t>by</w:t>
-      </w:r>
-      <w:proofErr w:type="gramEnd"/>
-      <w:r>
-        <w:rPr>
-          <w:rFonts w:ascii="Times New Roman" w:hAnsi="Times New Roman" w:cs="Times New Roman"/>
-        </w:rPr>
-        <w:t xml:space="preserve"> a Selected Amount Verified by the Parking Garage</w:t>
+        <w:t>Extends a Parking Reservation by a Selected Amount Verified by the Parking Garage</w:t>
       </w:r>
     </w:p>
     <w:p>
@@ -5186,19 +5138,11 @@
         </w:rPr>
         <w:t xml:space="preserve">From </w:t>
       </w:r>
-      <w:proofErr w:type="gramStart"/>
-      <w:r>
-        <w:rPr>
-          <w:rFonts w:ascii="Times New Roman" w:hAnsi="Times New Roman" w:cs="Times New Roman"/>
-        </w:rPr>
-        <w:t>extend</w:t>
-      </w:r>
-      <w:proofErr w:type="gramEnd"/>
-      <w:r>
-        <w:rPr>
-          <w:rFonts w:ascii="Times New Roman" w:hAnsi="Times New Roman" w:cs="Times New Roman"/>
-        </w:rPr>
-        <w:t xml:space="preserve"> reservation page, user selects how much time they want to extend the reservation (minimum amount is 30 minutes)</w:t>
+      <w:r>
+        <w:rPr>
+          <w:rFonts w:ascii="Times New Roman" w:hAnsi="Times New Roman" w:cs="Times New Roman"/>
+        </w:rPr>
+        <w:t>extend reservation page, user selects how much time they want to extend the reservation (minimum amount is 30 minutes)</w:t>
       </w:r>
     </w:p>
     <w:p>
@@ -5217,21 +5161,7 @@
         <w:rPr>
           <w:rFonts w:ascii="Times New Roman" w:hAnsi="Times New Roman" w:cs="Times New Roman"/>
         </w:rPr>
-        <w:t xml:space="preserve">After selecting extension time, </w:t>
-      </w:r>
-      <w:proofErr w:type="gramStart"/>
-      <w:r>
-        <w:rPr>
-          <w:rFonts w:ascii="Times New Roman" w:hAnsi="Times New Roman" w:cs="Times New Roman"/>
-        </w:rPr>
-        <w:t>user is</w:t>
-      </w:r>
-      <w:proofErr w:type="gramEnd"/>
-      <w:r>
-        <w:rPr>
-          <w:rFonts w:ascii="Times New Roman" w:hAnsi="Times New Roman" w:cs="Times New Roman"/>
-        </w:rPr>
-        <w:t xml:space="preserve"> prompted to enter payment information </w:t>
+        <w:t xml:space="preserve">After selecting extension time, user is prompted to enter payment information </w:t>
       </w:r>
       <w:r>
         <w:rPr>
@@ -5989,21 +5919,7 @@
         <w:rPr>
           <w:rFonts w:ascii="Times New Roman" w:hAnsi="Times New Roman" w:cs="Times New Roman"/>
         </w:rPr>
-        <w:t xml:space="preserve"> Administrator account and is </w:t>
-      </w:r>
-      <w:proofErr w:type="gramStart"/>
-      <w:r>
-        <w:rPr>
-          <w:rFonts w:ascii="Times New Roman" w:hAnsi="Times New Roman" w:cs="Times New Roman"/>
-        </w:rPr>
-        <w:t>at</w:t>
-      </w:r>
-      <w:proofErr w:type="gramEnd"/>
-      <w:r>
-        <w:rPr>
-          <w:rFonts w:ascii="Times New Roman" w:hAnsi="Times New Roman" w:cs="Times New Roman"/>
-        </w:rPr>
-        <w:t xml:space="preserve"> the Administrator Dashboard</w:t>
+        <w:t xml:space="preserve"> Administrator account and is at the Administrator Dashboard</w:t>
       </w:r>
       <w:r>
         <w:rPr>
@@ -6066,21 +5982,7 @@
         <w:rPr>
           <w:rFonts w:ascii="Times New Roman" w:hAnsi="Times New Roman" w:cs="Times New Roman"/>
         </w:rPr>
-        <w:t xml:space="preserve">In accounts subsection, </w:t>
-      </w:r>
-      <w:proofErr w:type="gramStart"/>
-      <w:r>
-        <w:rPr>
-          <w:rFonts w:ascii="Times New Roman" w:hAnsi="Times New Roman" w:cs="Times New Roman"/>
-        </w:rPr>
-        <w:t>user</w:t>
-      </w:r>
-      <w:proofErr w:type="gramEnd"/>
-      <w:r>
-        <w:rPr>
-          <w:rFonts w:ascii="Times New Roman" w:hAnsi="Times New Roman" w:cs="Times New Roman"/>
-        </w:rPr>
-        <w:t xml:space="preserve"> can search for the required user</w:t>
+        <w:t>In accounts subsection, user can search for the required user</w:t>
       </w:r>
       <w:r>
         <w:rPr>
@@ -6238,21 +6140,7 @@
         <w:rPr>
           <w:rFonts w:ascii="Times New Roman" w:hAnsi="Times New Roman" w:cs="Times New Roman"/>
         </w:rPr>
-        <w:t xml:space="preserve">confirmation screen is shown to the </w:t>
-      </w:r>
-      <w:proofErr w:type="gramStart"/>
-      <w:r>
-        <w:rPr>
-          <w:rFonts w:ascii="Times New Roman" w:hAnsi="Times New Roman" w:cs="Times New Roman"/>
-        </w:rPr>
-        <w:t>user</w:t>
-      </w:r>
-      <w:proofErr w:type="gramEnd"/>
-      <w:r>
-        <w:rPr>
-          <w:rFonts w:ascii="Times New Roman" w:hAnsi="Times New Roman" w:cs="Times New Roman"/>
-        </w:rPr>
-        <w:t xml:space="preserve"> and an email is sent to the user that the account was removed</w:t>
+        <w:t>confirmation screen is shown to the user and an email is sent to the user that the account was removed</w:t>
       </w:r>
     </w:p>
     <w:p>
@@ -6441,21 +6329,7 @@
         <w:rPr>
           <w:rFonts w:ascii="Times New Roman" w:hAnsi="Times New Roman" w:cs="Times New Roman"/>
         </w:rPr>
-        <w:t xml:space="preserve">The button redirects the user to a page </w:t>
-      </w:r>
-      <w:proofErr w:type="gramStart"/>
-      <w:r>
-        <w:rPr>
-          <w:rFonts w:ascii="Times New Roman" w:hAnsi="Times New Roman" w:cs="Times New Roman"/>
-        </w:rPr>
-        <w:t>similar to</w:t>
-      </w:r>
-      <w:proofErr w:type="gramEnd"/>
-      <w:r>
-        <w:rPr>
-          <w:rFonts w:ascii="Times New Roman" w:hAnsi="Times New Roman" w:cs="Times New Roman"/>
-        </w:rPr>
-        <w:t xml:space="preserve"> a physical copy of the </w:t>
+        <w:t xml:space="preserve">The button redirects the user to a page similar to a physical copy of the </w:t>
       </w:r>
       <w:r>
         <w:rPr>
@@ -8278,19 +8152,11 @@
           <w:rFonts w:ascii="Times New Roman" w:hAnsi="Times New Roman" w:cs="Times New Roman"/>
         </w:rPr>
       </w:pPr>
-      <w:proofErr w:type="gramStart"/>
-      <w:r>
-        <w:rPr>
-          <w:rFonts w:ascii="Times New Roman" w:hAnsi="Times New Roman" w:cs="Times New Roman"/>
-        </w:rPr>
-        <w:t>People</w:t>
-      </w:r>
-      <w:proofErr w:type="gramEnd"/>
-      <w:r>
-        <w:rPr>
-          <w:rFonts w:ascii="Times New Roman" w:hAnsi="Times New Roman" w:cs="Times New Roman"/>
-        </w:rPr>
-        <w:t xml:space="preserve"> Risks:</w:t>
+      <w:r>
+        <w:rPr>
+          <w:rFonts w:ascii="Times New Roman" w:hAnsi="Times New Roman" w:cs="Times New Roman"/>
+        </w:rPr>
+        <w:t>People Risks:</w:t>
       </w:r>
     </w:p>
     <w:p>
@@ -8666,7 +8532,13 @@
               <w:rPr>
                 <w:rFonts w:ascii="Times New Roman" w:hAnsi="Times New Roman" w:cs="Times New Roman"/>
               </w:rPr>
-              <w:t>Technical Lead</w:t>
+              <w:t>Database</w:t>
+            </w:r>
+            <w:r>
+              <w:rPr>
+                <w:rFonts w:ascii="Times New Roman" w:hAnsi="Times New Roman" w:cs="Times New Roman"/>
+              </w:rPr>
+              <w:t xml:space="preserve"> Lead</w:t>
             </w:r>
           </w:p>
         </w:tc>
@@ -8826,21 +8698,7 @@
               <w:rPr>
                 <w:rFonts w:ascii="Times New Roman" w:hAnsi="Times New Roman" w:cs="Times New Roman"/>
               </w:rPr>
-              <w:t xml:space="preserve">Development of application will use the least </w:t>
-            </w:r>
-            <w:proofErr w:type="gramStart"/>
-            <w:r>
-              <w:rPr>
-                <w:rFonts w:ascii="Times New Roman" w:hAnsi="Times New Roman" w:cs="Times New Roman"/>
-              </w:rPr>
-              <w:t>amount</w:t>
-            </w:r>
-            <w:proofErr w:type="gramEnd"/>
-            <w:r>
-              <w:rPr>
-                <w:rFonts w:ascii="Times New Roman" w:hAnsi="Times New Roman" w:cs="Times New Roman"/>
-              </w:rPr>
-              <w:t xml:space="preserve"> of resources possible</w:t>
+              <w:t>Development of application will use the least amount of resources possible</w:t>
             </w:r>
             <w:r>
               <w:rPr>
@@ -8871,21 +8729,7 @@
               <w:rPr>
                 <w:rFonts w:ascii="Times New Roman" w:hAnsi="Times New Roman" w:cs="Times New Roman"/>
               </w:rPr>
-              <w:t xml:space="preserve"> devices that have longterm-</w:t>
-            </w:r>
-            <w:proofErr w:type="gramStart"/>
-            <w:r>
-              <w:rPr>
-                <w:rFonts w:ascii="Times New Roman" w:hAnsi="Times New Roman" w:cs="Times New Roman"/>
-              </w:rPr>
-              <w:t>support</w:t>
-            </w:r>
-            <w:proofErr w:type="gramEnd"/>
-            <w:r>
-              <w:rPr>
-                <w:rFonts w:ascii="Times New Roman" w:hAnsi="Times New Roman" w:cs="Times New Roman"/>
-              </w:rPr>
-              <w:t xml:space="preserve"> </w:t>
+              <w:t xml:space="preserve"> devices that have longterm-support </w:t>
             </w:r>
             <w:r>
               <w:rPr>
@@ -9954,21 +9798,7 @@
               <w:rPr>
                 <w:rFonts w:ascii="Times New Roman" w:hAnsi="Times New Roman" w:cs="Times New Roman"/>
               </w:rPr>
-              <w:t xml:space="preserve">Report </w:t>
-            </w:r>
-            <w:proofErr w:type="gramStart"/>
-            <w:r>
-              <w:rPr>
-                <w:rFonts w:ascii="Times New Roman" w:hAnsi="Times New Roman" w:cs="Times New Roman"/>
-              </w:rPr>
-              <w:t>from first</w:t>
-            </w:r>
-            <w:proofErr w:type="gramEnd"/>
-            <w:r>
-              <w:rPr>
-                <w:rFonts w:ascii="Times New Roman" w:hAnsi="Times New Roman" w:cs="Times New Roman"/>
-              </w:rPr>
-              <w:t xml:space="preserve"> Sprint in progress</w:t>
+              <w:t>Report from first Sprint in progress</w:t>
             </w:r>
           </w:p>
         </w:tc>
@@ -10336,8 +10166,1730 @@
         </w:rPr>
       </w:pPr>
     </w:p>
+    <w:p>
+      <w:pPr>
+        <w:spacing w:line="240" w:lineRule="auto"/>
+        <w:rPr>
+          <w:rFonts w:ascii="Times New Roman" w:hAnsi="Times New Roman" w:cs="Times New Roman"/>
+          <w:b/>
+          <w:bCs/>
+          <w:sz w:val="32"/>
+          <w:szCs w:val="32"/>
+        </w:rPr>
+      </w:pPr>
+      <w:r>
+        <w:rPr>
+          <w:rFonts w:ascii="Times New Roman" w:hAnsi="Times New Roman" w:cs="Times New Roman"/>
+          <w:b/>
+          <w:bCs/>
+          <w:sz w:val="32"/>
+          <w:szCs w:val="32"/>
+        </w:rPr>
+        <w:t>13.</w:t>
+      </w:r>
+      <w:r>
+        <w:rPr>
+          <w:rFonts w:ascii="Times New Roman" w:hAnsi="Times New Roman" w:cs="Times New Roman"/>
+          <w:b/>
+          <w:bCs/>
+          <w:sz w:val="32"/>
+          <w:szCs w:val="32"/>
+        </w:rPr>
+        <w:t>Roles &amp; Resources</w:t>
+      </w:r>
+    </w:p>
+    <w:p>
+      <w:pPr>
+        <w:spacing w:line="240" w:lineRule="auto"/>
+        <w:rPr>
+          <w:rFonts w:ascii="Times New Roman" w:hAnsi="Times New Roman" w:cs="Times New Roman"/>
+        </w:rPr>
+      </w:pPr>
+      <w:r>
+        <w:rPr>
+          <w:rFonts w:ascii="Times New Roman" w:hAnsi="Times New Roman" w:cs="Times New Roman"/>
+        </w:rPr>
+        <w:t>Roles:</w:t>
+      </w:r>
+    </w:p>
+    <w:p>
+      <w:pPr>
+        <w:pStyle w:val="ListParagraph"/>
+        <w:numPr>
+          <w:ilvl w:val="0"/>
+          <w:numId w:val="12"/>
+        </w:numPr>
+        <w:spacing w:line="240" w:lineRule="auto"/>
+        <w:rPr>
+          <w:rFonts w:ascii="Times New Roman" w:hAnsi="Times New Roman" w:cs="Times New Roman"/>
+        </w:rPr>
+      </w:pPr>
+      <w:r>
+        <w:rPr>
+          <w:rFonts w:ascii="Times New Roman" w:hAnsi="Times New Roman" w:cs="Times New Roman"/>
+          <w:b/>
+          <w:bCs/>
+        </w:rPr>
+        <w:t>Project Manager</w:t>
+      </w:r>
+      <w:r>
+        <w:rPr>
+          <w:rFonts w:ascii="Times New Roman" w:hAnsi="Times New Roman" w:cs="Times New Roman"/>
+        </w:rPr>
+        <w:t xml:space="preserve"> </w:t>
+      </w:r>
+      <w:r>
+        <w:rPr>
+          <w:rFonts w:ascii="Times New Roman" w:hAnsi="Times New Roman" w:cs="Times New Roman"/>
+        </w:rPr>
+        <w:t xml:space="preserve">= </w:t>
+      </w:r>
+      <w:r>
+        <w:rPr>
+          <w:rFonts w:ascii="Times New Roman" w:hAnsi="Times New Roman" w:cs="Times New Roman"/>
+        </w:rPr>
+        <w:t>plan how the CarParka Smart Parking Platform project is broken into parts, track the project progress</w:t>
+      </w:r>
+      <w:r>
+        <w:rPr>
+          <w:rFonts w:ascii="Times New Roman" w:hAnsi="Times New Roman" w:cs="Times New Roman"/>
+        </w:rPr>
+        <w:t xml:space="preserve"> from schedule and budget, coordinate with Scrum Master, and report project progress to the City of Houston each month</w:t>
+      </w:r>
+      <w:r>
+        <w:rPr>
+          <w:rFonts w:ascii="Times New Roman" w:hAnsi="Times New Roman" w:cs="Times New Roman"/>
+        </w:rPr>
+        <w:t>.</w:t>
+      </w:r>
+    </w:p>
+    <w:p>
+      <w:pPr>
+        <w:pStyle w:val="ListParagraph"/>
+        <w:numPr>
+          <w:ilvl w:val="1"/>
+          <w:numId w:val="12"/>
+        </w:numPr>
+        <w:spacing w:line="240" w:lineRule="auto"/>
+        <w:rPr>
+          <w:rFonts w:ascii="Times New Roman" w:hAnsi="Times New Roman" w:cs="Times New Roman"/>
+        </w:rPr>
+      </w:pPr>
+      <w:r>
+        <w:rPr>
+          <w:rFonts w:ascii="Times New Roman" w:hAnsi="Times New Roman" w:cs="Times New Roman"/>
+          <w:b/>
+          <w:bCs/>
+        </w:rPr>
+        <w:t xml:space="preserve">Name = </w:t>
+      </w:r>
+      <w:r>
+        <w:rPr>
+          <w:rFonts w:ascii="Times New Roman" w:hAnsi="Times New Roman" w:cs="Times New Roman"/>
+        </w:rPr>
+        <w:t>Timothy Nammathao</w:t>
+      </w:r>
+    </w:p>
+    <w:p>
+      <w:pPr>
+        <w:pStyle w:val="ListParagraph"/>
+        <w:numPr>
+          <w:ilvl w:val="0"/>
+          <w:numId w:val="12"/>
+        </w:numPr>
+        <w:spacing w:line="240" w:lineRule="auto"/>
+        <w:rPr>
+          <w:rFonts w:ascii="Times New Roman" w:hAnsi="Times New Roman" w:cs="Times New Roman"/>
+          <w:b/>
+          <w:bCs/>
+        </w:rPr>
+      </w:pPr>
+      <w:r>
+        <w:rPr>
+          <w:rFonts w:ascii="Times New Roman" w:hAnsi="Times New Roman" w:cs="Times New Roman"/>
+          <w:b/>
+          <w:bCs/>
+        </w:rPr>
+        <w:t>Developer</w:t>
+      </w:r>
+      <w:r>
+        <w:rPr>
+          <w:rFonts w:ascii="Times New Roman" w:hAnsi="Times New Roman" w:cs="Times New Roman"/>
+          <w:b/>
+          <w:bCs/>
+        </w:rPr>
+        <w:t>s</w:t>
+      </w:r>
+      <w:r>
+        <w:rPr>
+          <w:rFonts w:ascii="Times New Roman" w:hAnsi="Times New Roman" w:cs="Times New Roman"/>
+          <w:b/>
+          <w:bCs/>
+        </w:rPr>
+        <w:t xml:space="preserve"> = </w:t>
+      </w:r>
+      <w:r>
+        <w:rPr>
+          <w:rFonts w:ascii="Times New Roman" w:hAnsi="Times New Roman" w:cs="Times New Roman"/>
+        </w:rPr>
+        <w:t>build the CarParka platform from the webpage, mobile application, and database</w:t>
+      </w:r>
+      <w:r>
+        <w:rPr>
+          <w:rFonts w:ascii="Times New Roman" w:hAnsi="Times New Roman" w:cs="Times New Roman"/>
+        </w:rPr>
+        <w:t xml:space="preserve"> design</w:t>
+      </w:r>
+    </w:p>
+    <w:p>
+      <w:pPr>
+        <w:pStyle w:val="ListParagraph"/>
+        <w:numPr>
+          <w:ilvl w:val="1"/>
+          <w:numId w:val="12"/>
+        </w:numPr>
+        <w:spacing w:line="240" w:lineRule="auto"/>
+        <w:rPr>
+          <w:rFonts w:ascii="Times New Roman" w:hAnsi="Times New Roman" w:cs="Times New Roman"/>
+          <w:b/>
+          <w:bCs/>
+        </w:rPr>
+      </w:pPr>
+      <w:r>
+        <w:rPr>
+          <w:rFonts w:ascii="Times New Roman" w:hAnsi="Times New Roman" w:cs="Times New Roman"/>
+          <w:b/>
+          <w:bCs/>
+        </w:rPr>
+        <w:t>Web Developer</w:t>
+      </w:r>
+    </w:p>
+    <w:p>
+      <w:pPr>
+        <w:pStyle w:val="ListParagraph"/>
+        <w:numPr>
+          <w:ilvl w:val="2"/>
+          <w:numId w:val="12"/>
+        </w:numPr>
+        <w:spacing w:line="240" w:lineRule="auto"/>
+        <w:rPr>
+          <w:rFonts w:ascii="Times New Roman" w:hAnsi="Times New Roman" w:cs="Times New Roman"/>
+          <w:b/>
+          <w:bCs/>
+        </w:rPr>
+      </w:pPr>
+      <w:r>
+        <w:rPr>
+          <w:rFonts w:ascii="Times New Roman" w:hAnsi="Times New Roman" w:cs="Times New Roman"/>
+          <w:b/>
+          <w:bCs/>
+        </w:rPr>
+        <w:t xml:space="preserve">Name = </w:t>
+      </w:r>
+      <w:r>
+        <w:rPr>
+          <w:rFonts w:ascii="Times New Roman" w:hAnsi="Times New Roman" w:cs="Times New Roman"/>
+        </w:rPr>
+        <w:t>Ricky</w:t>
+      </w:r>
+      <w:r>
+        <w:rPr>
+          <w:rFonts w:ascii="Times New Roman" w:hAnsi="Times New Roman" w:cs="Times New Roman"/>
+        </w:rPr>
+        <w:t xml:space="preserve"> Abbot</w:t>
+      </w:r>
+      <w:r>
+        <w:rPr>
+          <w:rFonts w:ascii="Times New Roman" w:hAnsi="Times New Roman" w:cs="Times New Roman"/>
+        </w:rPr>
+        <w:t xml:space="preserve"> (Lead)</w:t>
+      </w:r>
+    </w:p>
+    <w:p>
+      <w:pPr>
+        <w:pStyle w:val="ListParagraph"/>
+        <w:numPr>
+          <w:ilvl w:val="2"/>
+          <w:numId w:val="12"/>
+        </w:numPr>
+        <w:spacing w:line="240" w:lineRule="auto"/>
+        <w:rPr>
+          <w:rFonts w:ascii="Times New Roman" w:hAnsi="Times New Roman" w:cs="Times New Roman"/>
+          <w:b/>
+          <w:bCs/>
+        </w:rPr>
+      </w:pPr>
+      <w:r>
+        <w:rPr>
+          <w:rFonts w:ascii="Times New Roman" w:hAnsi="Times New Roman" w:cs="Times New Roman"/>
+          <w:b/>
+          <w:bCs/>
+        </w:rPr>
+        <w:t xml:space="preserve">Name = </w:t>
+      </w:r>
+      <w:r>
+        <w:rPr>
+          <w:rFonts w:ascii="Times New Roman" w:hAnsi="Times New Roman" w:cs="Times New Roman"/>
+        </w:rPr>
+        <w:t>Shay Marks</w:t>
+      </w:r>
+    </w:p>
+    <w:p>
+      <w:pPr>
+        <w:pStyle w:val="ListParagraph"/>
+        <w:numPr>
+          <w:ilvl w:val="2"/>
+          <w:numId w:val="12"/>
+        </w:numPr>
+        <w:spacing w:line="240" w:lineRule="auto"/>
+        <w:rPr>
+          <w:rFonts w:ascii="Times New Roman" w:hAnsi="Times New Roman" w:cs="Times New Roman"/>
+          <w:b/>
+          <w:bCs/>
+        </w:rPr>
+      </w:pPr>
+      <w:r>
+        <w:rPr>
+          <w:rFonts w:ascii="Times New Roman" w:hAnsi="Times New Roman" w:cs="Times New Roman"/>
+          <w:b/>
+          <w:bCs/>
+        </w:rPr>
+        <w:t xml:space="preserve">Name = </w:t>
+      </w:r>
+      <w:r>
+        <w:rPr>
+          <w:rFonts w:ascii="Times New Roman" w:hAnsi="Times New Roman" w:cs="Times New Roman"/>
+        </w:rPr>
+        <w:t>Michael Summers</w:t>
+      </w:r>
+    </w:p>
+    <w:p>
+      <w:pPr>
+        <w:pStyle w:val="ListParagraph"/>
+        <w:numPr>
+          <w:ilvl w:val="2"/>
+          <w:numId w:val="12"/>
+        </w:numPr>
+        <w:spacing w:line="240" w:lineRule="auto"/>
+        <w:rPr>
+          <w:rFonts w:ascii="Times New Roman" w:hAnsi="Times New Roman" w:cs="Times New Roman"/>
+          <w:b/>
+          <w:bCs/>
+        </w:rPr>
+      </w:pPr>
+      <w:r>
+        <w:rPr>
+          <w:rFonts w:ascii="Times New Roman" w:hAnsi="Times New Roman" w:cs="Times New Roman"/>
+          <w:b/>
+          <w:bCs/>
+        </w:rPr>
+        <w:t xml:space="preserve">Name = </w:t>
+      </w:r>
+      <w:r>
+        <w:rPr>
+          <w:rFonts w:ascii="Times New Roman" w:hAnsi="Times New Roman" w:cs="Times New Roman"/>
+        </w:rPr>
+        <w:t>Arianna Vincent</w:t>
+      </w:r>
+    </w:p>
+    <w:p>
+      <w:pPr>
+        <w:pStyle w:val="ListParagraph"/>
+        <w:numPr>
+          <w:ilvl w:val="1"/>
+          <w:numId w:val="12"/>
+        </w:numPr>
+        <w:spacing w:line="240" w:lineRule="auto"/>
+        <w:rPr>
+          <w:rFonts w:ascii="Times New Roman" w:hAnsi="Times New Roman" w:cs="Times New Roman"/>
+          <w:b/>
+          <w:bCs/>
+        </w:rPr>
+      </w:pPr>
+      <w:r>
+        <w:rPr>
+          <w:rFonts w:ascii="Times New Roman" w:hAnsi="Times New Roman" w:cs="Times New Roman"/>
+          <w:b/>
+          <w:bCs/>
+        </w:rPr>
+        <w:t>Mobile Developer</w:t>
+      </w:r>
+    </w:p>
+    <w:p>
+      <w:pPr>
+        <w:pStyle w:val="ListParagraph"/>
+        <w:numPr>
+          <w:ilvl w:val="2"/>
+          <w:numId w:val="12"/>
+        </w:numPr>
+        <w:spacing w:line="240" w:lineRule="auto"/>
+        <w:rPr>
+          <w:rFonts w:ascii="Times New Roman" w:hAnsi="Times New Roman" w:cs="Times New Roman"/>
+          <w:b/>
+          <w:bCs/>
+        </w:rPr>
+      </w:pPr>
+      <w:r>
+        <w:rPr>
+          <w:rFonts w:ascii="Times New Roman" w:hAnsi="Times New Roman" w:cs="Times New Roman"/>
+          <w:b/>
+          <w:bCs/>
+        </w:rPr>
+        <w:t xml:space="preserve">Name = </w:t>
+      </w:r>
+      <w:r>
+        <w:rPr>
+          <w:rFonts w:ascii="Times New Roman" w:hAnsi="Times New Roman" w:cs="Times New Roman"/>
+        </w:rPr>
+        <w:t>Mikayla Newton</w:t>
+      </w:r>
+      <w:r>
+        <w:rPr>
+          <w:rFonts w:ascii="Times New Roman" w:hAnsi="Times New Roman" w:cs="Times New Roman"/>
+        </w:rPr>
+        <w:t xml:space="preserve"> (Lead)</w:t>
+      </w:r>
+    </w:p>
+    <w:p>
+      <w:pPr>
+        <w:pStyle w:val="ListParagraph"/>
+        <w:numPr>
+          <w:ilvl w:val="2"/>
+          <w:numId w:val="12"/>
+        </w:numPr>
+        <w:spacing w:line="240" w:lineRule="auto"/>
+        <w:rPr>
+          <w:rFonts w:ascii="Times New Roman" w:hAnsi="Times New Roman" w:cs="Times New Roman"/>
+          <w:b/>
+          <w:bCs/>
+        </w:rPr>
+      </w:pPr>
+      <w:r>
+        <w:rPr>
+          <w:rFonts w:ascii="Times New Roman" w:hAnsi="Times New Roman" w:cs="Times New Roman"/>
+          <w:b/>
+          <w:bCs/>
+        </w:rPr>
+        <w:t xml:space="preserve">Name = </w:t>
+      </w:r>
+      <w:r>
+        <w:rPr>
+          <w:rFonts w:ascii="Times New Roman" w:hAnsi="Times New Roman" w:cs="Times New Roman"/>
+        </w:rPr>
+        <w:t>Andre Calderon</w:t>
+      </w:r>
+    </w:p>
+    <w:p>
+      <w:pPr>
+        <w:pStyle w:val="ListParagraph"/>
+        <w:numPr>
+          <w:ilvl w:val="2"/>
+          <w:numId w:val="12"/>
+        </w:numPr>
+        <w:spacing w:line="240" w:lineRule="auto"/>
+        <w:rPr>
+          <w:rFonts w:ascii="Times New Roman" w:hAnsi="Times New Roman" w:cs="Times New Roman"/>
+          <w:b/>
+          <w:bCs/>
+        </w:rPr>
+      </w:pPr>
+      <w:r>
+        <w:rPr>
+          <w:rFonts w:ascii="Times New Roman" w:hAnsi="Times New Roman" w:cs="Times New Roman"/>
+          <w:b/>
+          <w:bCs/>
+        </w:rPr>
+        <w:t xml:space="preserve">Name = </w:t>
+      </w:r>
+      <w:r>
+        <w:rPr>
+          <w:rFonts w:ascii="Times New Roman" w:hAnsi="Times New Roman" w:cs="Times New Roman"/>
+        </w:rPr>
+        <w:t>Chelsey Hanson</w:t>
+      </w:r>
+    </w:p>
+    <w:p>
+      <w:pPr>
+        <w:pStyle w:val="ListParagraph"/>
+        <w:numPr>
+          <w:ilvl w:val="2"/>
+          <w:numId w:val="12"/>
+        </w:numPr>
+        <w:spacing w:line="240" w:lineRule="auto"/>
+        <w:rPr>
+          <w:rFonts w:ascii="Times New Roman" w:hAnsi="Times New Roman" w:cs="Times New Roman"/>
+          <w:b/>
+          <w:bCs/>
+        </w:rPr>
+      </w:pPr>
+      <w:r>
+        <w:rPr>
+          <w:rFonts w:ascii="Times New Roman" w:hAnsi="Times New Roman" w:cs="Times New Roman"/>
+          <w:b/>
+          <w:bCs/>
+        </w:rPr>
+        <w:t xml:space="preserve">Name = </w:t>
+      </w:r>
+      <w:r>
+        <w:rPr>
+          <w:rFonts w:ascii="Times New Roman" w:hAnsi="Times New Roman" w:cs="Times New Roman"/>
+        </w:rPr>
+        <w:t>Amy Reeves</w:t>
+      </w:r>
+    </w:p>
+    <w:p>
+      <w:pPr>
+        <w:pStyle w:val="ListParagraph"/>
+        <w:numPr>
+          <w:ilvl w:val="1"/>
+          <w:numId w:val="12"/>
+        </w:numPr>
+        <w:spacing w:line="240" w:lineRule="auto"/>
+        <w:rPr>
+          <w:rFonts w:ascii="Times New Roman" w:hAnsi="Times New Roman" w:cs="Times New Roman"/>
+          <w:b/>
+          <w:bCs/>
+        </w:rPr>
+      </w:pPr>
+      <w:r>
+        <w:rPr>
+          <w:rFonts w:ascii="Times New Roman" w:hAnsi="Times New Roman" w:cs="Times New Roman"/>
+          <w:b/>
+          <w:bCs/>
+        </w:rPr>
+        <w:t>Database Developer</w:t>
+      </w:r>
+    </w:p>
+    <w:p>
+      <w:pPr>
+        <w:pStyle w:val="ListParagraph"/>
+        <w:numPr>
+          <w:ilvl w:val="2"/>
+          <w:numId w:val="12"/>
+        </w:numPr>
+        <w:spacing w:line="240" w:lineRule="auto"/>
+        <w:rPr>
+          <w:rFonts w:ascii="Times New Roman" w:hAnsi="Times New Roman" w:cs="Times New Roman"/>
+          <w:b/>
+          <w:bCs/>
+        </w:rPr>
+      </w:pPr>
+      <w:r>
+        <w:rPr>
+          <w:rFonts w:ascii="Times New Roman" w:hAnsi="Times New Roman" w:cs="Times New Roman"/>
+          <w:b/>
+          <w:bCs/>
+        </w:rPr>
+        <w:t xml:space="preserve">Name = </w:t>
+      </w:r>
+      <w:r>
+        <w:rPr>
+          <w:rFonts w:ascii="Times New Roman" w:hAnsi="Times New Roman" w:cs="Times New Roman"/>
+        </w:rPr>
+        <w:t>Jennifer Thomson</w:t>
+      </w:r>
+    </w:p>
+    <w:p>
+      <w:pPr>
+        <w:pStyle w:val="ListParagraph"/>
+        <w:numPr>
+          <w:ilvl w:val="2"/>
+          <w:numId w:val="12"/>
+        </w:numPr>
+        <w:spacing w:line="240" w:lineRule="auto"/>
+        <w:rPr>
+          <w:rFonts w:ascii="Times New Roman" w:hAnsi="Times New Roman" w:cs="Times New Roman"/>
+          <w:b/>
+          <w:bCs/>
+        </w:rPr>
+      </w:pPr>
+      <w:r>
+        <w:rPr>
+          <w:rFonts w:ascii="Times New Roman" w:hAnsi="Times New Roman" w:cs="Times New Roman"/>
+          <w:b/>
+          <w:bCs/>
+        </w:rPr>
+        <w:lastRenderedPageBreak/>
+        <w:t xml:space="preserve">Name = </w:t>
+      </w:r>
+      <w:r>
+        <w:rPr>
+          <w:rFonts w:ascii="Times New Roman" w:hAnsi="Times New Roman" w:cs="Times New Roman"/>
+        </w:rPr>
+        <w:t>Tate Salman</w:t>
+      </w:r>
+    </w:p>
+    <w:p>
+      <w:pPr>
+        <w:pStyle w:val="ListParagraph"/>
+        <w:numPr>
+          <w:ilvl w:val="0"/>
+          <w:numId w:val="12"/>
+        </w:numPr>
+        <w:spacing w:line="240" w:lineRule="auto"/>
+        <w:rPr>
+          <w:rFonts w:ascii="Times New Roman" w:hAnsi="Times New Roman" w:cs="Times New Roman"/>
+          <w:b/>
+          <w:bCs/>
+        </w:rPr>
+      </w:pPr>
+      <w:r>
+        <w:rPr>
+          <w:rFonts w:ascii="Times New Roman" w:hAnsi="Times New Roman" w:cs="Times New Roman"/>
+          <w:b/>
+          <w:bCs/>
+        </w:rPr>
+        <w:t>QA Testers</w:t>
+      </w:r>
+      <w:r>
+        <w:rPr>
+          <w:rFonts w:ascii="Times New Roman" w:hAnsi="Times New Roman" w:cs="Times New Roman"/>
+          <w:b/>
+          <w:bCs/>
+        </w:rPr>
+        <w:t xml:space="preserve"> = </w:t>
+      </w:r>
+      <w:r>
+        <w:rPr>
+          <w:rFonts w:ascii="Times New Roman" w:hAnsi="Times New Roman" w:cs="Times New Roman"/>
+        </w:rPr>
+        <w:t xml:space="preserve">verify </w:t>
+      </w:r>
+      <w:r>
+        <w:rPr>
+          <w:rFonts w:ascii="Times New Roman" w:hAnsi="Times New Roman" w:cs="Times New Roman"/>
+        </w:rPr>
+        <w:t>the platform is functioning correctly and meets the operating requirements. They will also report bugs to developers.</w:t>
+      </w:r>
+    </w:p>
+    <w:p>
+      <w:pPr>
+        <w:pStyle w:val="ListParagraph"/>
+        <w:numPr>
+          <w:ilvl w:val="1"/>
+          <w:numId w:val="12"/>
+        </w:numPr>
+        <w:spacing w:line="240" w:lineRule="auto"/>
+        <w:rPr>
+          <w:rFonts w:ascii="Times New Roman" w:hAnsi="Times New Roman" w:cs="Times New Roman"/>
+          <w:b/>
+          <w:bCs/>
+        </w:rPr>
+      </w:pPr>
+      <w:r>
+        <w:rPr>
+          <w:rFonts w:ascii="Times New Roman" w:hAnsi="Times New Roman" w:cs="Times New Roman"/>
+          <w:b/>
+          <w:bCs/>
+        </w:rPr>
+        <w:t>Web Tester</w:t>
+      </w:r>
+    </w:p>
+    <w:p>
+      <w:pPr>
+        <w:pStyle w:val="ListParagraph"/>
+        <w:numPr>
+          <w:ilvl w:val="2"/>
+          <w:numId w:val="12"/>
+        </w:numPr>
+        <w:spacing w:line="240" w:lineRule="auto"/>
+        <w:rPr>
+          <w:rFonts w:ascii="Times New Roman" w:hAnsi="Times New Roman" w:cs="Times New Roman"/>
+          <w:b/>
+          <w:bCs/>
+        </w:rPr>
+      </w:pPr>
+      <w:r>
+        <w:rPr>
+          <w:rFonts w:ascii="Times New Roman" w:hAnsi="Times New Roman" w:cs="Times New Roman"/>
+          <w:b/>
+          <w:bCs/>
+        </w:rPr>
+        <w:t xml:space="preserve">Name = </w:t>
+      </w:r>
+      <w:r>
+        <w:rPr>
+          <w:rFonts w:ascii="Times New Roman" w:hAnsi="Times New Roman" w:cs="Times New Roman"/>
+        </w:rPr>
+        <w:t>Jamie Tart</w:t>
+      </w:r>
+    </w:p>
+    <w:p>
+      <w:pPr>
+        <w:pStyle w:val="ListParagraph"/>
+        <w:numPr>
+          <w:ilvl w:val="2"/>
+          <w:numId w:val="12"/>
+        </w:numPr>
+        <w:spacing w:line="240" w:lineRule="auto"/>
+        <w:rPr>
+          <w:rFonts w:ascii="Times New Roman" w:hAnsi="Times New Roman" w:cs="Times New Roman"/>
+          <w:b/>
+          <w:bCs/>
+        </w:rPr>
+      </w:pPr>
+      <w:r>
+        <w:rPr>
+          <w:rFonts w:ascii="Times New Roman" w:hAnsi="Times New Roman" w:cs="Times New Roman"/>
+          <w:b/>
+          <w:bCs/>
+        </w:rPr>
+        <w:t xml:space="preserve">Name = </w:t>
+      </w:r>
+      <w:r>
+        <w:rPr>
+          <w:rFonts w:ascii="Times New Roman" w:hAnsi="Times New Roman" w:cs="Times New Roman"/>
+        </w:rPr>
+        <w:t>Theodore Lasso</w:t>
+      </w:r>
+    </w:p>
+    <w:p>
+      <w:pPr>
+        <w:pStyle w:val="ListParagraph"/>
+        <w:numPr>
+          <w:ilvl w:val="1"/>
+          <w:numId w:val="12"/>
+        </w:numPr>
+        <w:spacing w:line="240" w:lineRule="auto"/>
+        <w:rPr>
+          <w:rFonts w:ascii="Times New Roman" w:hAnsi="Times New Roman" w:cs="Times New Roman"/>
+          <w:b/>
+          <w:bCs/>
+        </w:rPr>
+      </w:pPr>
+      <w:r>
+        <w:rPr>
+          <w:rFonts w:ascii="Times New Roman" w:hAnsi="Times New Roman" w:cs="Times New Roman"/>
+          <w:b/>
+          <w:bCs/>
+        </w:rPr>
+        <w:t>Mobile Tester</w:t>
+      </w:r>
+    </w:p>
+    <w:p>
+      <w:pPr>
+        <w:pStyle w:val="ListParagraph"/>
+        <w:numPr>
+          <w:ilvl w:val="2"/>
+          <w:numId w:val="12"/>
+        </w:numPr>
+        <w:spacing w:line="240" w:lineRule="auto"/>
+        <w:rPr>
+          <w:rFonts w:ascii="Times New Roman" w:hAnsi="Times New Roman" w:cs="Times New Roman"/>
+          <w:b/>
+          <w:bCs/>
+        </w:rPr>
+      </w:pPr>
+      <w:r>
+        <w:rPr>
+          <w:rFonts w:ascii="Times New Roman" w:hAnsi="Times New Roman" w:cs="Times New Roman"/>
+          <w:b/>
+          <w:bCs/>
+        </w:rPr>
+        <w:t xml:space="preserve">Name = </w:t>
+      </w:r>
+      <w:r>
+        <w:rPr>
+          <w:rFonts w:ascii="Times New Roman" w:hAnsi="Times New Roman" w:cs="Times New Roman"/>
+        </w:rPr>
+        <w:t>Jessical Levy</w:t>
+      </w:r>
+    </w:p>
+    <w:p>
+      <w:pPr>
+        <w:pStyle w:val="ListParagraph"/>
+        <w:numPr>
+          <w:ilvl w:val="2"/>
+          <w:numId w:val="12"/>
+        </w:numPr>
+        <w:spacing w:line="240" w:lineRule="auto"/>
+        <w:rPr>
+          <w:rFonts w:ascii="Times New Roman" w:hAnsi="Times New Roman" w:cs="Times New Roman"/>
+          <w:b/>
+          <w:bCs/>
+        </w:rPr>
+      </w:pPr>
+      <w:r>
+        <w:rPr>
+          <w:rFonts w:ascii="Times New Roman" w:hAnsi="Times New Roman" w:cs="Times New Roman"/>
+          <w:b/>
+          <w:bCs/>
+        </w:rPr>
+        <w:t xml:space="preserve">Name = </w:t>
+      </w:r>
+      <w:r>
+        <w:rPr>
+          <w:rFonts w:ascii="Times New Roman" w:hAnsi="Times New Roman" w:cs="Times New Roman"/>
+        </w:rPr>
+        <w:t>Mark Fischer</w:t>
+      </w:r>
+    </w:p>
+    <w:p>
+      <w:pPr>
+        <w:pStyle w:val="ListParagraph"/>
+        <w:numPr>
+          <w:ilvl w:val="1"/>
+          <w:numId w:val="12"/>
+        </w:numPr>
+        <w:spacing w:line="240" w:lineRule="auto"/>
+        <w:rPr>
+          <w:rFonts w:ascii="Times New Roman" w:hAnsi="Times New Roman" w:cs="Times New Roman"/>
+          <w:b/>
+          <w:bCs/>
+        </w:rPr>
+      </w:pPr>
+      <w:r>
+        <w:rPr>
+          <w:rFonts w:ascii="Times New Roman" w:hAnsi="Times New Roman" w:cs="Times New Roman"/>
+          <w:b/>
+          <w:bCs/>
+        </w:rPr>
+        <w:t>Database Tester</w:t>
+      </w:r>
+    </w:p>
+    <w:p>
+      <w:pPr>
+        <w:pStyle w:val="ListParagraph"/>
+        <w:numPr>
+          <w:ilvl w:val="2"/>
+          <w:numId w:val="12"/>
+        </w:numPr>
+        <w:spacing w:line="240" w:lineRule="auto"/>
+        <w:rPr>
+          <w:rFonts w:ascii="Times New Roman" w:hAnsi="Times New Roman" w:cs="Times New Roman"/>
+          <w:b/>
+          <w:bCs/>
+        </w:rPr>
+      </w:pPr>
+      <w:r>
+        <w:rPr>
+          <w:rFonts w:ascii="Times New Roman" w:hAnsi="Times New Roman" w:cs="Times New Roman"/>
+          <w:b/>
+          <w:bCs/>
+        </w:rPr>
+        <w:t xml:space="preserve">Name = </w:t>
+      </w:r>
+      <w:r>
+        <w:rPr>
+          <w:rFonts w:ascii="Times New Roman" w:hAnsi="Times New Roman" w:cs="Times New Roman"/>
+        </w:rPr>
+        <w:t>Mitchelle Hand</w:t>
+      </w:r>
+      <w:r>
+        <w:rPr>
+          <w:rFonts w:ascii="Times New Roman" w:hAnsi="Times New Roman" w:cs="Times New Roman"/>
+        </w:rPr>
+        <w:t>ler</w:t>
+      </w:r>
+    </w:p>
+    <w:p>
+      <w:pPr>
+        <w:pStyle w:val="ListParagraph"/>
+        <w:numPr>
+          <w:ilvl w:val="2"/>
+          <w:numId w:val="12"/>
+        </w:numPr>
+        <w:spacing w:line="240" w:lineRule="auto"/>
+        <w:rPr>
+          <w:rFonts w:ascii="Times New Roman" w:hAnsi="Times New Roman" w:cs="Times New Roman"/>
+          <w:b/>
+          <w:bCs/>
+        </w:rPr>
+      </w:pPr>
+      <w:r>
+        <w:rPr>
+          <w:rFonts w:ascii="Times New Roman" w:hAnsi="Times New Roman" w:cs="Times New Roman"/>
+          <w:b/>
+          <w:bCs/>
+        </w:rPr>
+        <w:t xml:space="preserve">Name = </w:t>
+      </w:r>
+      <w:r>
+        <w:rPr>
+          <w:rFonts w:ascii="Times New Roman" w:hAnsi="Times New Roman" w:cs="Times New Roman"/>
+        </w:rPr>
+        <w:t>Sian Sutton</w:t>
+      </w:r>
+    </w:p>
+    <w:p>
+      <w:pPr>
+        <w:pStyle w:val="ListParagraph"/>
+        <w:numPr>
+          <w:ilvl w:val="0"/>
+          <w:numId w:val="12"/>
+        </w:numPr>
+        <w:spacing w:line="240" w:lineRule="auto"/>
+        <w:rPr>
+          <w:rFonts w:ascii="Times New Roman" w:hAnsi="Times New Roman" w:cs="Times New Roman"/>
+          <w:b/>
+          <w:bCs/>
+        </w:rPr>
+      </w:pPr>
+      <w:r>
+        <w:rPr>
+          <w:rFonts w:ascii="Times New Roman" w:hAnsi="Times New Roman" w:cs="Times New Roman"/>
+          <w:b/>
+          <w:bCs/>
+        </w:rPr>
+        <w:t>UX Designer</w:t>
+      </w:r>
+      <w:r>
+        <w:rPr>
+          <w:rFonts w:ascii="Times New Roman" w:hAnsi="Times New Roman" w:cs="Times New Roman"/>
+          <w:b/>
+          <w:bCs/>
+        </w:rPr>
+        <w:t xml:space="preserve"> = </w:t>
+      </w:r>
+      <w:r>
+        <w:rPr>
+          <w:rFonts w:ascii="Times New Roman" w:hAnsi="Times New Roman" w:cs="Times New Roman"/>
+        </w:rPr>
+        <w:t>creates</w:t>
+      </w:r>
+      <w:r>
+        <w:rPr>
+          <w:rFonts w:ascii="Times New Roman" w:hAnsi="Times New Roman" w:cs="Times New Roman"/>
+        </w:rPr>
+        <w:t xml:space="preserve"> the user desing documents </w:t>
+      </w:r>
+      <w:r>
+        <w:rPr>
+          <w:rFonts w:ascii="Times New Roman" w:hAnsi="Times New Roman" w:cs="Times New Roman"/>
+        </w:rPr>
+        <w:t>on how users navigate the website and mobile application, and recommends improvements from testing feedback</w:t>
+      </w:r>
+    </w:p>
+    <w:p>
+      <w:pPr>
+        <w:pStyle w:val="ListParagraph"/>
+        <w:numPr>
+          <w:ilvl w:val="1"/>
+          <w:numId w:val="12"/>
+        </w:numPr>
+        <w:spacing w:line="240" w:lineRule="auto"/>
+        <w:rPr>
+          <w:rFonts w:ascii="Times New Roman" w:hAnsi="Times New Roman" w:cs="Times New Roman"/>
+          <w:b/>
+          <w:bCs/>
+        </w:rPr>
+      </w:pPr>
+      <w:r>
+        <w:rPr>
+          <w:rFonts w:ascii="Times New Roman" w:hAnsi="Times New Roman" w:cs="Times New Roman"/>
+          <w:b/>
+          <w:bCs/>
+        </w:rPr>
+        <w:t xml:space="preserve">Name = </w:t>
+      </w:r>
+      <w:r>
+        <w:rPr>
+          <w:rFonts w:ascii="Times New Roman" w:hAnsi="Times New Roman" w:cs="Times New Roman"/>
+        </w:rPr>
+        <w:t>Anastasia Homer</w:t>
+      </w:r>
+    </w:p>
+    <w:p>
+      <w:pPr>
+        <w:pStyle w:val="ListParagraph"/>
+        <w:numPr>
+          <w:ilvl w:val="0"/>
+          <w:numId w:val="12"/>
+        </w:numPr>
+        <w:spacing w:line="240" w:lineRule="auto"/>
+        <w:rPr>
+          <w:rFonts w:ascii="Times New Roman" w:hAnsi="Times New Roman" w:cs="Times New Roman"/>
+          <w:b/>
+          <w:bCs/>
+        </w:rPr>
+      </w:pPr>
+      <w:r>
+        <w:rPr>
+          <w:rFonts w:ascii="Times New Roman" w:hAnsi="Times New Roman" w:cs="Times New Roman"/>
+          <w:b/>
+          <w:bCs/>
+        </w:rPr>
+        <w:t>S</w:t>
+      </w:r>
+      <w:r>
+        <w:rPr>
+          <w:rFonts w:ascii="Times New Roman" w:hAnsi="Times New Roman" w:cs="Times New Roman"/>
+          <w:b/>
+          <w:bCs/>
+        </w:rPr>
+        <w:t>crum Master</w:t>
+      </w:r>
+      <w:r>
+        <w:rPr>
+          <w:rFonts w:ascii="Times New Roman" w:hAnsi="Times New Roman" w:cs="Times New Roman"/>
+          <w:b/>
+          <w:bCs/>
+        </w:rPr>
+        <w:t xml:space="preserve"> = </w:t>
+      </w:r>
+      <w:r>
+        <w:rPr>
+          <w:rFonts w:ascii="Times New Roman" w:hAnsi="Times New Roman" w:cs="Times New Roman"/>
+        </w:rPr>
+        <w:t>organize the sprint meetings and daily stand</w:t>
+      </w:r>
+      <w:r>
+        <w:rPr>
+          <w:rFonts w:ascii="Times New Roman" w:hAnsi="Times New Roman" w:cs="Times New Roman"/>
+        </w:rPr>
+        <w:t>-ups, tracks sprint progress, and remove the obstacles slowing down the development team</w:t>
+      </w:r>
+    </w:p>
+    <w:p>
+      <w:pPr>
+        <w:pStyle w:val="ListParagraph"/>
+        <w:numPr>
+          <w:ilvl w:val="1"/>
+          <w:numId w:val="12"/>
+        </w:numPr>
+        <w:spacing w:line="240" w:lineRule="auto"/>
+        <w:rPr>
+          <w:rFonts w:ascii="Times New Roman" w:hAnsi="Times New Roman" w:cs="Times New Roman"/>
+          <w:b/>
+          <w:bCs/>
+        </w:rPr>
+      </w:pPr>
+      <w:r>
+        <w:rPr>
+          <w:rFonts w:ascii="Times New Roman" w:hAnsi="Times New Roman" w:cs="Times New Roman"/>
+          <w:b/>
+          <w:bCs/>
+        </w:rPr>
+        <w:t xml:space="preserve">Name = </w:t>
+      </w:r>
+      <w:r>
+        <w:rPr>
+          <w:rFonts w:ascii="Times New Roman" w:hAnsi="Times New Roman" w:cs="Times New Roman"/>
+        </w:rPr>
+        <w:t>Perry Bright</w:t>
+      </w:r>
+    </w:p>
+    <w:p>
+      <w:pPr>
+        <w:pStyle w:val="ListParagraph"/>
+        <w:numPr>
+          <w:ilvl w:val="1"/>
+          <w:numId w:val="12"/>
+        </w:numPr>
+        <w:spacing w:line="240" w:lineRule="auto"/>
+        <w:rPr>
+          <w:rFonts w:ascii="Times New Roman" w:hAnsi="Times New Roman" w:cs="Times New Roman"/>
+          <w:b/>
+          <w:bCs/>
+        </w:rPr>
+      </w:pPr>
+      <w:r>
+        <w:rPr>
+          <w:rFonts w:ascii="Times New Roman" w:hAnsi="Times New Roman" w:cs="Times New Roman"/>
+          <w:b/>
+          <w:bCs/>
+        </w:rPr>
+        <w:t xml:space="preserve">Name = </w:t>
+      </w:r>
+      <w:r>
+        <w:rPr>
+          <w:rFonts w:ascii="Times New Roman" w:hAnsi="Times New Roman" w:cs="Times New Roman"/>
+        </w:rPr>
+        <w:t>Aaron Aguirre</w:t>
+      </w:r>
+    </w:p>
+    <w:p>
+      <w:pPr>
+        <w:pStyle w:val="ListParagraph"/>
+        <w:numPr>
+          <w:ilvl w:val="0"/>
+          <w:numId w:val="12"/>
+        </w:numPr>
+        <w:spacing w:line="240" w:lineRule="auto"/>
+        <w:rPr>
+          <w:rFonts w:ascii="Times New Roman" w:hAnsi="Times New Roman" w:cs="Times New Roman"/>
+          <w:b/>
+          <w:bCs/>
+        </w:rPr>
+      </w:pPr>
+      <w:r>
+        <w:rPr>
+          <w:rFonts w:ascii="Times New Roman" w:hAnsi="Times New Roman" w:cs="Times New Roman"/>
+          <w:b/>
+          <w:bCs/>
+        </w:rPr>
+        <w:t>DevOps</w:t>
+      </w:r>
+      <w:r>
+        <w:rPr>
+          <w:rFonts w:ascii="Times New Roman" w:hAnsi="Times New Roman" w:cs="Times New Roman"/>
+          <w:b/>
+          <w:bCs/>
+        </w:rPr>
+        <w:t xml:space="preserve"> = </w:t>
+      </w:r>
+      <w:r>
+        <w:rPr>
+          <w:rFonts w:ascii="Times New Roman" w:hAnsi="Times New Roman" w:cs="Times New Roman"/>
+        </w:rPr>
+        <w:t xml:space="preserve">set up and maintain the cloud hosting, deployment process, backup </w:t>
+      </w:r>
+      <w:r>
+        <w:rPr>
+          <w:rFonts w:ascii="Times New Roman" w:hAnsi="Times New Roman" w:cs="Times New Roman"/>
+        </w:rPr>
+        <w:t xml:space="preserve">the </w:t>
+      </w:r>
+      <w:r>
+        <w:rPr>
+          <w:rFonts w:ascii="Times New Roman" w:hAnsi="Times New Roman" w:cs="Times New Roman"/>
+        </w:rPr>
+        <w:t>servers</w:t>
+      </w:r>
+      <w:r>
+        <w:rPr>
+          <w:rFonts w:ascii="Times New Roman" w:hAnsi="Times New Roman" w:cs="Times New Roman"/>
+        </w:rPr>
+        <w:t>, and monitor the system to meet uptime requirements</w:t>
+      </w:r>
+    </w:p>
+    <w:p>
+      <w:pPr>
+        <w:pStyle w:val="ListParagraph"/>
+        <w:numPr>
+          <w:ilvl w:val="1"/>
+          <w:numId w:val="12"/>
+        </w:numPr>
+        <w:spacing w:line="240" w:lineRule="auto"/>
+        <w:rPr>
+          <w:rFonts w:ascii="Times New Roman" w:hAnsi="Times New Roman" w:cs="Times New Roman"/>
+          <w:b/>
+          <w:bCs/>
+        </w:rPr>
+      </w:pPr>
+      <w:r>
+        <w:rPr>
+          <w:rFonts w:ascii="Times New Roman" w:hAnsi="Times New Roman" w:cs="Times New Roman"/>
+          <w:b/>
+          <w:bCs/>
+        </w:rPr>
+        <w:t xml:space="preserve">Name = </w:t>
+      </w:r>
+      <w:r>
+        <w:rPr>
+          <w:rFonts w:ascii="Times New Roman" w:hAnsi="Times New Roman" w:cs="Times New Roman"/>
+        </w:rPr>
+        <w:t>Cooper Fisher</w:t>
+      </w:r>
+    </w:p>
+    <w:p>
+      <w:pPr>
+        <w:pStyle w:val="ListParagraph"/>
+        <w:numPr>
+          <w:ilvl w:val="0"/>
+          <w:numId w:val="12"/>
+        </w:numPr>
+        <w:spacing w:line="240" w:lineRule="auto"/>
+        <w:rPr>
+          <w:rFonts w:ascii="Times New Roman" w:hAnsi="Times New Roman" w:cs="Times New Roman"/>
+          <w:b/>
+          <w:bCs/>
+        </w:rPr>
+      </w:pPr>
+      <w:r>
+        <w:rPr>
+          <w:rFonts w:ascii="Times New Roman" w:hAnsi="Times New Roman" w:cs="Times New Roman"/>
+          <w:b/>
+          <w:bCs/>
+        </w:rPr>
+        <w:t>Subject Matter Expert</w:t>
+      </w:r>
+      <w:r>
+        <w:rPr>
+          <w:rFonts w:ascii="Times New Roman" w:hAnsi="Times New Roman" w:cs="Times New Roman"/>
+          <w:b/>
+          <w:bCs/>
+        </w:rPr>
+        <w:t xml:space="preserve"> = </w:t>
+      </w:r>
+      <w:r>
+        <w:rPr>
+          <w:rFonts w:ascii="Times New Roman" w:hAnsi="Times New Roman" w:cs="Times New Roman"/>
+        </w:rPr>
+        <w:t>Provide</w:t>
+      </w:r>
+      <w:r>
+        <w:rPr>
+          <w:rFonts w:ascii="Times New Roman" w:hAnsi="Times New Roman" w:cs="Times New Roman"/>
+        </w:rPr>
+        <w:t xml:space="preserve"> parking operations knowledge; how garages and operators work</w:t>
+      </w:r>
+      <w:r>
+        <w:rPr>
+          <w:rFonts w:ascii="Times New Roman" w:hAnsi="Times New Roman" w:cs="Times New Roman"/>
+        </w:rPr>
+        <w:t xml:space="preserve"> and help validate requirements for the operator dashboard. They also support the operator training of the application.</w:t>
+      </w:r>
+    </w:p>
+    <w:p>
+      <w:pPr>
+        <w:pStyle w:val="ListParagraph"/>
+        <w:numPr>
+          <w:ilvl w:val="1"/>
+          <w:numId w:val="12"/>
+        </w:numPr>
+        <w:spacing w:line="240" w:lineRule="auto"/>
+        <w:rPr>
+          <w:rFonts w:ascii="Times New Roman" w:hAnsi="Times New Roman" w:cs="Times New Roman"/>
+          <w:b/>
+          <w:bCs/>
+        </w:rPr>
+      </w:pPr>
+      <w:r>
+        <w:rPr>
+          <w:rFonts w:ascii="Times New Roman" w:hAnsi="Times New Roman" w:cs="Times New Roman"/>
+          <w:b/>
+          <w:bCs/>
+        </w:rPr>
+        <w:t xml:space="preserve">Name = </w:t>
+      </w:r>
+      <w:r>
+        <w:rPr>
+          <w:rFonts w:ascii="Times New Roman" w:hAnsi="Times New Roman" w:cs="Times New Roman"/>
+        </w:rPr>
+        <w:t>Kasey Lucas</w:t>
+      </w:r>
+    </w:p>
+    <w:p>
+      <w:pPr>
+        <w:pStyle w:val="ListParagraph"/>
+        <w:numPr>
+          <w:ilvl w:val="0"/>
+          <w:numId w:val="12"/>
+        </w:numPr>
+        <w:spacing w:line="240" w:lineRule="auto"/>
+        <w:rPr>
+          <w:rFonts w:ascii="Times New Roman" w:hAnsi="Times New Roman" w:cs="Times New Roman"/>
+          <w:b/>
+          <w:bCs/>
+        </w:rPr>
+      </w:pPr>
+      <w:r>
+        <w:rPr>
+          <w:rFonts w:ascii="Times New Roman" w:hAnsi="Times New Roman" w:cs="Times New Roman"/>
+          <w:b/>
+          <w:bCs/>
+        </w:rPr>
+        <w:t>Product Owner</w:t>
+      </w:r>
+      <w:r>
+        <w:rPr>
+          <w:rFonts w:ascii="Times New Roman" w:hAnsi="Times New Roman" w:cs="Times New Roman"/>
+          <w:b/>
+          <w:bCs/>
+        </w:rPr>
+        <w:t xml:space="preserve"> = </w:t>
+      </w:r>
+      <w:r>
+        <w:rPr>
+          <w:rFonts w:ascii="Times New Roman" w:hAnsi="Times New Roman" w:cs="Times New Roman"/>
+        </w:rPr>
+        <w:t xml:space="preserve">the City of Houston; own how the final product turns out, approves the </w:t>
+      </w:r>
+      <w:r>
+        <w:rPr>
+          <w:rFonts w:ascii="Times New Roman" w:hAnsi="Times New Roman" w:cs="Times New Roman"/>
+        </w:rPr>
+        <w:t>project requirements, and accepts the completed work.</w:t>
+      </w:r>
+    </w:p>
+    <w:p>
+      <w:pPr>
+        <w:pStyle w:val="ListParagraph"/>
+        <w:numPr>
+          <w:ilvl w:val="1"/>
+          <w:numId w:val="12"/>
+        </w:numPr>
+        <w:spacing w:line="240" w:lineRule="auto"/>
+        <w:rPr>
+          <w:rFonts w:ascii="Times New Roman" w:hAnsi="Times New Roman" w:cs="Times New Roman"/>
+          <w:b/>
+          <w:bCs/>
+        </w:rPr>
+      </w:pPr>
+      <w:r>
+        <w:rPr>
+          <w:rFonts w:ascii="Times New Roman" w:hAnsi="Times New Roman" w:cs="Times New Roman"/>
+          <w:b/>
+          <w:bCs/>
+        </w:rPr>
+        <w:t xml:space="preserve">Name = </w:t>
+      </w:r>
+      <w:r>
+        <w:rPr>
+          <w:rFonts w:ascii="Times New Roman" w:hAnsi="Times New Roman" w:cs="Times New Roman"/>
+        </w:rPr>
+        <w:t>City of Houston</w:t>
+      </w:r>
+    </w:p>
+    <w:p>
+      <w:pPr>
+        <w:spacing w:line="240" w:lineRule="auto"/>
+        <w:rPr>
+          <w:rFonts w:ascii="Times New Roman" w:hAnsi="Times New Roman" w:cs="Times New Roman"/>
+          <w:b/>
+          <w:bCs/>
+        </w:rPr>
+      </w:pPr>
+    </w:p>
+    <w:p>
+      <w:pPr>
+        <w:spacing w:line="240" w:lineRule="auto"/>
+        <w:rPr>
+          <w:rFonts w:ascii="Times New Roman" w:hAnsi="Times New Roman" w:cs="Times New Roman"/>
+          <w:b/>
+          <w:bCs/>
+        </w:rPr>
+      </w:pPr>
+    </w:p>
+    <w:p>
+      <w:pPr>
+        <w:spacing w:line="240" w:lineRule="auto"/>
+        <w:rPr>
+          <w:rFonts w:ascii="Times New Roman" w:hAnsi="Times New Roman" w:cs="Times New Roman"/>
+          <w:b/>
+          <w:bCs/>
+        </w:rPr>
+      </w:pPr>
+    </w:p>
+    <w:p>
+      <w:pPr>
+        <w:spacing w:line="240" w:lineRule="auto"/>
+        <w:rPr>
+          <w:rFonts w:ascii="Times New Roman" w:hAnsi="Times New Roman" w:cs="Times New Roman"/>
+          <w:b/>
+          <w:bCs/>
+        </w:rPr>
+      </w:pPr>
+    </w:p>
+    <w:p>
+      <w:pPr>
+        <w:spacing w:line="240" w:lineRule="auto"/>
+        <w:rPr>
+          <w:rFonts w:ascii="Times New Roman" w:hAnsi="Times New Roman" w:cs="Times New Roman"/>
+          <w:b/>
+          <w:bCs/>
+        </w:rPr>
+      </w:pPr>
+    </w:p>
+    <w:p>
+      <w:pPr>
+        <w:spacing w:line="240" w:lineRule="auto"/>
+        <w:rPr>
+          <w:rFonts w:ascii="Times New Roman" w:hAnsi="Times New Roman" w:cs="Times New Roman"/>
+          <w:b/>
+          <w:bCs/>
+        </w:rPr>
+      </w:pPr>
+    </w:p>
+    <w:p>
+      <w:pPr>
+        <w:spacing w:line="240" w:lineRule="auto"/>
+        <w:rPr>
+          <w:rFonts w:ascii="Times New Roman" w:hAnsi="Times New Roman" w:cs="Times New Roman"/>
+          <w:b/>
+          <w:bCs/>
+        </w:rPr>
+      </w:pPr>
+    </w:p>
+    <w:p>
+      <w:pPr>
+        <w:spacing w:line="240" w:lineRule="auto"/>
+        <w:rPr>
+          <w:rFonts w:ascii="Times New Roman" w:hAnsi="Times New Roman" w:cs="Times New Roman"/>
+          <w:b/>
+          <w:bCs/>
+        </w:rPr>
+      </w:pPr>
+    </w:p>
+    <w:p>
+      <w:pPr>
+        <w:spacing w:line="240" w:lineRule="auto"/>
+        <w:rPr>
+          <w:rFonts w:ascii="Times New Roman" w:hAnsi="Times New Roman" w:cs="Times New Roman"/>
+          <w:b/>
+          <w:bCs/>
+        </w:rPr>
+      </w:pPr>
+    </w:p>
+    <w:p>
+      <w:pPr>
+        <w:spacing w:line="240" w:lineRule="auto"/>
+        <w:rPr>
+          <w:rFonts w:ascii="Times New Roman" w:hAnsi="Times New Roman" w:cs="Times New Roman"/>
+          <w:b/>
+          <w:bCs/>
+        </w:rPr>
+      </w:pPr>
+    </w:p>
+    <w:p>
+      <w:pPr>
+        <w:spacing w:line="240" w:lineRule="auto"/>
+        <w:rPr>
+          <w:rFonts w:ascii="Times New Roman" w:hAnsi="Times New Roman" w:cs="Times New Roman"/>
+          <w:b/>
+          <w:bCs/>
+        </w:rPr>
+      </w:pPr>
+    </w:p>
+    <w:p>
+      <w:pPr>
+        <w:spacing w:line="240" w:lineRule="auto"/>
+        <w:rPr>
+          <w:rFonts w:ascii="Times New Roman" w:hAnsi="Times New Roman" w:cs="Times New Roman"/>
+          <w:b/>
+          <w:bCs/>
+          <w:sz w:val="32"/>
+          <w:szCs w:val="32"/>
+        </w:rPr>
+      </w:pPr>
+      <w:r>
+        <w:rPr>
+          <w:rFonts w:ascii="Times New Roman" w:hAnsi="Times New Roman" w:cs="Times New Roman"/>
+          <w:b/>
+          <w:bCs/>
+          <w:sz w:val="32"/>
+          <w:szCs w:val="32"/>
+        </w:rPr>
+        <w:lastRenderedPageBreak/>
+        <w:t>Cost Plan</w:t>
+      </w:r>
+    </w:p>
+    <w:p>
+      <w:pPr>
+        <w:spacing w:line="240" w:lineRule="auto"/>
+        <w:rPr>
+          <w:rFonts w:ascii="Times New Roman" w:hAnsi="Times New Roman" w:cs="Times New Roman"/>
+          <w:b/>
+          <w:bCs/>
+        </w:rPr>
+      </w:pPr>
+      <w:r>
+        <w:rPr>
+          <w:rFonts w:ascii="Times New Roman" w:hAnsi="Times New Roman" w:cs="Times New Roman"/>
+          <w:b/>
+          <w:bCs/>
+          <w:noProof/>
+        </w:rPr>
+        <w:drawing>
+          <wp:inline distT="0" distB="0" distL="0" distR="0" wp14:anchorId="29EC27AC" wp14:editId="4677713F">
+            <wp:extent cx="5943600" cy="3903980"/>
+            <wp:effectExtent l="0" t="0" r="0" b="1270"/>
+            <wp:docPr id="279333969" name="Picture 5"/>
+            <wp:cNvGraphicFramePr>
+              <a:graphicFrameLocks xmlns:a="http://schemas.openxmlformats.org/drawingml/2006/main" noChangeAspect="1"/>
+            </wp:cNvGraphicFramePr>
+            <a:graphic xmlns:a="http://schemas.openxmlformats.org/drawingml/2006/main">
+              <a:graphicData uri="http://schemas.openxmlformats.org/drawingml/2006/picture">
+                <pic:pic xmlns:pic="http://schemas.openxmlformats.org/drawingml/2006/picture">
+                  <pic:nvPicPr>
+                    <pic:cNvPr id="0" name="Picture 5"/>
+                    <pic:cNvPicPr>
+                      <a:picLocks noChangeAspect="1" noChangeArrowheads="1"/>
+                    </pic:cNvPicPr>
+                  </pic:nvPicPr>
+                  <pic:blipFill>
+                    <a:blip r:embed="rId18">
+                      <a:extLst>
+                        <a:ext uri="{28A0092B-C50C-407E-A947-70E740481C1C}">
+                          <a14:useLocalDpi xmlns:a14="http://schemas.microsoft.com/office/drawing/2010/main" val="0"/>
+                        </a:ext>
+                      </a:extLst>
+                    </a:blip>
+                    <a:srcRect/>
+                    <a:stretch>
+                      <a:fillRect/>
+                    </a:stretch>
+                  </pic:blipFill>
+                  <pic:spPr bwMode="auto">
+                    <a:xfrm>
+                      <a:off x="0" y="0"/>
+                      <a:ext cx="5943600" cy="3903980"/>
+                    </a:xfrm>
+                    <a:prstGeom prst="rect">
+                      <a:avLst/>
+                    </a:prstGeom>
+                    <a:noFill/>
+                    <a:ln>
+                      <a:noFill/>
+                    </a:ln>
+                  </pic:spPr>
+                </pic:pic>
+              </a:graphicData>
+            </a:graphic>
+          </wp:inline>
+        </w:drawing>
+      </w:r>
+    </w:p>
+    <w:p>
+      <w:pPr>
+        <w:spacing w:line="240" w:lineRule="auto"/>
+        <w:rPr>
+          <w:rFonts w:ascii="Times New Roman" w:hAnsi="Times New Roman" w:cs="Times New Roman"/>
+          <w:b/>
+          <w:bCs/>
+        </w:rPr>
+      </w:pPr>
+    </w:p>
+    <w:p>
+      <w:pPr>
+        <w:spacing w:line="240" w:lineRule="auto"/>
+        <w:rPr>
+          <w:rFonts w:ascii="Times New Roman" w:hAnsi="Times New Roman" w:cs="Times New Roman"/>
+          <w:b/>
+          <w:bCs/>
+          <w:sz w:val="32"/>
+          <w:szCs w:val="32"/>
+        </w:rPr>
+      </w:pPr>
+      <w:r>
+        <w:rPr>
+          <w:rFonts w:ascii="Times New Roman" w:hAnsi="Times New Roman" w:cs="Times New Roman"/>
+          <w:b/>
+          <w:bCs/>
+          <w:sz w:val="32"/>
+          <w:szCs w:val="32"/>
+        </w:rPr>
+        <w:t>Monthly Cashflow</w:t>
+      </w:r>
+    </w:p>
+    <w:p>
+      <w:pPr>
+        <w:spacing w:line="240" w:lineRule="auto"/>
+        <w:rPr>
+          <w:rFonts w:ascii="Times New Roman" w:hAnsi="Times New Roman" w:cs="Times New Roman"/>
+          <w:b/>
+          <w:bCs/>
+        </w:rPr>
+      </w:pPr>
+      <w:r>
+        <w:rPr>
+          <w:rFonts w:ascii="Times New Roman" w:hAnsi="Times New Roman" w:cs="Times New Roman"/>
+          <w:b/>
+          <w:bCs/>
+          <w:noProof/>
+        </w:rPr>
+        <w:drawing>
+          <wp:inline distT="0" distB="0" distL="0" distR="0" wp14:anchorId="2D25FA9A" wp14:editId="2F43F68B">
+            <wp:extent cx="5943600" cy="1221740"/>
+            <wp:effectExtent l="0" t="0" r="0" b="0"/>
+            <wp:docPr id="915645648" name="Picture 4"/>
+            <wp:cNvGraphicFramePr>
+              <a:graphicFrameLocks xmlns:a="http://schemas.openxmlformats.org/drawingml/2006/main" noChangeAspect="1"/>
+            </wp:cNvGraphicFramePr>
+            <a:graphic xmlns:a="http://schemas.openxmlformats.org/drawingml/2006/main">
+              <a:graphicData uri="http://schemas.openxmlformats.org/drawingml/2006/picture">
+                <pic:pic xmlns:pic="http://schemas.openxmlformats.org/drawingml/2006/picture">
+                  <pic:nvPicPr>
+                    <pic:cNvPr id="0" name="Picture 4"/>
+                    <pic:cNvPicPr>
+                      <a:picLocks noChangeAspect="1" noChangeArrowheads="1"/>
+                    </pic:cNvPicPr>
+                  </pic:nvPicPr>
+                  <pic:blipFill>
+                    <a:blip r:embed="rId19">
+                      <a:extLst>
+                        <a:ext uri="{28A0092B-C50C-407E-A947-70E740481C1C}">
+                          <a14:useLocalDpi xmlns:a14="http://schemas.microsoft.com/office/drawing/2010/main" val="0"/>
+                        </a:ext>
+                      </a:extLst>
+                    </a:blip>
+                    <a:srcRect/>
+                    <a:stretch>
+                      <a:fillRect/>
+                    </a:stretch>
+                  </pic:blipFill>
+                  <pic:spPr bwMode="auto">
+                    <a:xfrm>
+                      <a:off x="0" y="0"/>
+                      <a:ext cx="5943600" cy="1221740"/>
+                    </a:xfrm>
+                    <a:prstGeom prst="rect">
+                      <a:avLst/>
+                    </a:prstGeom>
+                    <a:noFill/>
+                    <a:ln>
+                      <a:noFill/>
+                    </a:ln>
+                  </pic:spPr>
+                </pic:pic>
+              </a:graphicData>
+            </a:graphic>
+          </wp:inline>
+        </w:drawing>
+      </w:r>
+    </w:p>
+    <w:p>
+      <w:pPr>
+        <w:spacing w:line="240" w:lineRule="auto"/>
+        <w:rPr>
+          <w:rFonts w:ascii="Times New Roman" w:hAnsi="Times New Roman" w:cs="Times New Roman"/>
+          <w:b/>
+          <w:bCs/>
+        </w:rPr>
+      </w:pPr>
+    </w:p>
+    <w:p>
+      <w:pPr>
+        <w:spacing w:line="240" w:lineRule="auto"/>
+        <w:rPr>
+          <w:rFonts w:ascii="Times New Roman" w:hAnsi="Times New Roman" w:cs="Times New Roman"/>
+          <w:b/>
+          <w:bCs/>
+        </w:rPr>
+      </w:pPr>
+    </w:p>
+    <w:p>
+      <w:pPr>
+        <w:spacing w:line="240" w:lineRule="auto"/>
+        <w:rPr>
+          <w:rFonts w:ascii="Times New Roman" w:hAnsi="Times New Roman" w:cs="Times New Roman"/>
+          <w:b/>
+          <w:bCs/>
+        </w:rPr>
+      </w:pPr>
+    </w:p>
+    <w:p>
+      <w:pPr>
+        <w:spacing w:line="240" w:lineRule="auto"/>
+        <w:rPr>
+          <w:rFonts w:ascii="Times New Roman" w:hAnsi="Times New Roman" w:cs="Times New Roman"/>
+          <w:b/>
+          <w:bCs/>
+        </w:rPr>
+      </w:pPr>
+    </w:p>
+    <w:p>
+      <w:pPr>
+        <w:spacing w:line="240" w:lineRule="auto"/>
+        <w:rPr>
+          <w:rFonts w:ascii="Times New Roman" w:hAnsi="Times New Roman" w:cs="Times New Roman"/>
+          <w:b/>
+          <w:bCs/>
+        </w:rPr>
+      </w:pPr>
+    </w:p>
+    <w:p>
+      <w:pPr>
+        <w:spacing w:line="240" w:lineRule="auto"/>
+        <w:rPr>
+          <w:rFonts w:ascii="Times New Roman" w:hAnsi="Times New Roman" w:cs="Times New Roman"/>
+          <w:b/>
+          <w:bCs/>
+        </w:rPr>
+      </w:pPr>
+    </w:p>
+    <w:p>
+      <w:pPr>
+        <w:spacing w:line="240" w:lineRule="auto"/>
+        <w:rPr>
+          <w:rFonts w:ascii="Times New Roman" w:hAnsi="Times New Roman" w:cs="Times New Roman"/>
+          <w:b/>
+          <w:bCs/>
+        </w:rPr>
+      </w:pPr>
+    </w:p>
+    <w:p>
+      <w:pPr>
+        <w:spacing w:line="240" w:lineRule="auto"/>
+        <w:rPr>
+          <w:rFonts w:ascii="Times New Roman" w:hAnsi="Times New Roman" w:cs="Times New Roman"/>
+          <w:b/>
+          <w:bCs/>
+          <w:sz w:val="32"/>
+          <w:szCs w:val="32"/>
+        </w:rPr>
+      </w:pPr>
+      <w:r>
+        <w:rPr>
+          <w:rFonts w:ascii="Times New Roman" w:hAnsi="Times New Roman" w:cs="Times New Roman"/>
+          <w:b/>
+          <w:bCs/>
+          <w:sz w:val="32"/>
+          <w:szCs w:val="32"/>
+        </w:rPr>
+        <w:lastRenderedPageBreak/>
+        <w:t>RACI Matrix</w:t>
+      </w:r>
+    </w:p>
+    <w:p>
+      <w:pPr>
+        <w:spacing w:line="240" w:lineRule="auto"/>
+        <w:rPr>
+          <w:rFonts w:ascii="Times New Roman" w:hAnsi="Times New Roman" w:cs="Times New Roman"/>
+          <w:b/>
+          <w:bCs/>
+        </w:rPr>
+      </w:pPr>
+      <w:r>
+        <w:rPr>
+          <w:rFonts w:ascii="Times New Roman" w:hAnsi="Times New Roman" w:cs="Times New Roman"/>
+          <w:b/>
+          <w:bCs/>
+          <w:noProof/>
+        </w:rPr>
+        <w:drawing>
+          <wp:inline distT="0" distB="0" distL="0" distR="0" wp14:anchorId="6909894F" wp14:editId="20B34629">
+            <wp:extent cx="5991534" cy="2472855"/>
+            <wp:effectExtent l="0" t="0" r="0" b="3810"/>
+            <wp:docPr id="45730512" name="Picture 2"/>
+            <wp:cNvGraphicFramePr>
+              <a:graphicFrameLocks xmlns:a="http://schemas.openxmlformats.org/drawingml/2006/main" noChangeAspect="1"/>
+            </wp:cNvGraphicFramePr>
+            <a:graphic xmlns:a="http://schemas.openxmlformats.org/drawingml/2006/main">
+              <a:graphicData uri="http://schemas.openxmlformats.org/drawingml/2006/picture">
+                <pic:pic xmlns:pic="http://schemas.openxmlformats.org/drawingml/2006/picture">
+                  <pic:nvPicPr>
+                    <pic:cNvPr id="0" name="Picture 2"/>
+                    <pic:cNvPicPr>
+                      <a:picLocks noChangeAspect="1" noChangeArrowheads="1"/>
+                    </pic:cNvPicPr>
+                  </pic:nvPicPr>
+                  <pic:blipFill>
+                    <a:blip r:embed="rId20">
+                      <a:extLst>
+                        <a:ext uri="{28A0092B-C50C-407E-A947-70E740481C1C}">
+                          <a14:useLocalDpi xmlns:a14="http://schemas.microsoft.com/office/drawing/2010/main" val="0"/>
+                        </a:ext>
+                      </a:extLst>
+                    </a:blip>
+                    <a:srcRect/>
+                    <a:stretch>
+                      <a:fillRect/>
+                    </a:stretch>
+                  </pic:blipFill>
+                  <pic:spPr bwMode="auto">
+                    <a:xfrm>
+                      <a:off x="0" y="0"/>
+                      <a:ext cx="6043788" cy="2494421"/>
+                    </a:xfrm>
+                    <a:prstGeom prst="rect">
+                      <a:avLst/>
+                    </a:prstGeom>
+                    <a:noFill/>
+                    <a:ln>
+                      <a:noFill/>
+                    </a:ln>
+                  </pic:spPr>
+                </pic:pic>
+              </a:graphicData>
+            </a:graphic>
+          </wp:inline>
+        </w:drawing>
+      </w:r>
+    </w:p>
     <w:sectPr>
-      <w:footerReference w:type="default" r:id="rId18"/>
+      <w:footerReference w:type="default" r:id="rId21"/>
       <w:pgSz w:w="12240" w:h="15840"/>
       <w:pgMar w:top="1440" w:right="1440" w:bottom="1440" w:left="1440" w:header="720" w:footer="720" w:gutter="0"/>
       <w:cols w:space="720"/>
@@ -11561,7 +13113,7 @@
   <w:abstractNum w:abstractNumId="10" w15:restartNumberingAfterBreak="0">
     <w:nsid w:val="73085909"/>
     <w:multiLevelType w:val="hybridMultilevel"/>
-    <w:tmpl w:val="A84C1CCE"/>
+    <w:tmpl w:val="124AE4AA"/>
     <w:lvl w:ilvl="0" w:tplc="087E2BC8">
       <w:start w:val="1"/>
       <w:numFmt w:val="bullet"/>
@@ -11586,11 +13138,11 @@
         <w:rFonts w:ascii="Courier New" w:hAnsi="Courier New" w:cs="Courier New" w:hint="default"/>
       </w:rPr>
     </w:lvl>
-    <w:lvl w:ilvl="2" w:tplc="0409000F">
+    <w:lvl w:ilvl="2" w:tplc="04090013">
       <w:start w:val="1"/>
-      <w:numFmt w:val="decimal"/>
+      <w:numFmt w:val="upperRoman"/>
       <w:lvlText w:val="%3."/>
-      <w:lvlJc w:val="left"/>
+      <w:lvlJc w:val="right"/>
       <w:pPr>
         <w:ind w:left="2160" w:hanging="360"/>
       </w:pPr>

</xml_diff>

<commit_message>
Updated to Version 1.5
</commit_message>
<xml_diff>
--- a/Nammathao_CIS4374_Project.docx
+++ b/Nammathao_CIS4374_Project.docx
@@ -9128,10 +9128,10 @@
           <w:szCs w:val="32"/>
         </w:rPr>
         <w:drawing>
-          <wp:inline distT="0" distB="0" distL="0" distR="0" wp14:anchorId="1A4D5A7D" wp14:editId="13ED59FC">
-            <wp:extent cx="4974590" cy="7522845"/>
-            <wp:effectExtent l="0" t="0" r="0" b="1905"/>
-            <wp:docPr id="775552133" name="Picture 12"/>
+          <wp:inline distT="0" distB="0" distL="0" distR="0" wp14:anchorId="302DF9C2" wp14:editId="3DF92F69">
+            <wp:extent cx="5847080" cy="7507605"/>
+            <wp:effectExtent l="0" t="0" r="1270" b="0"/>
+            <wp:docPr id="256403701" name="Picture 24"/>
             <wp:cNvGraphicFramePr>
               <a:graphicFrameLocks xmlns:a="http://schemas.openxmlformats.org/drawingml/2006/main" noChangeAspect="1"/>
             </wp:cNvGraphicFramePr>
@@ -9139,7 +9139,7 @@
               <a:graphicData uri="http://schemas.openxmlformats.org/drawingml/2006/picture">
                 <pic:pic xmlns:pic="http://schemas.openxmlformats.org/drawingml/2006/picture">
                   <pic:nvPicPr>
-                    <pic:cNvPr id="0" name="Picture 2"/>
+                    <pic:cNvPr id="0" name="Picture 13"/>
                     <pic:cNvPicPr>
                       <a:picLocks noChangeAspect="1" noChangeArrowheads="1"/>
                     </pic:cNvPicPr>
@@ -9160,12 +9160,15 @@
                   <pic:spPr bwMode="auto">
                     <a:xfrm>
                       <a:off x="0" y="0"/>
-                      <a:ext cx="4974590" cy="7522845"/>
+                      <a:ext cx="5847080" cy="7507605"/>
                     </a:xfrm>
                     <a:prstGeom prst="rect">
                       <a:avLst/>
                     </a:prstGeom>
                     <a:noFill/>
+                    <a:ln>
+                      <a:noFill/>
+                    </a:ln>
                   </pic:spPr>
                 </pic:pic>
               </a:graphicData>

</xml_diff>